<commit_message>
#7 bug fixed #14 unit conversion added
</commit_message>
<xml_diff>
--- a/src/GUI/Documentation/User Guide_v0.1.docx
+++ b/src/GUI/Documentation/User Guide_v0.1.docx
@@ -10,13 +10,7 @@
         <w:t>POD|LCA Materials Tool</w:t>
       </w:r>
     </w:p>
-    <w:p>
-      <w:pPr>
-        <w:rPr>
-          <w:rFonts w:ascii="Arial" w:hAnsi="Arial" w:cs="Arial"/>
-        </w:rPr>
-      </w:pPr>
-    </w:p>
+    <w:p/>
     <w:p>
       <w:pPr>
         <w:pStyle w:val="Heading1"/>
@@ -40,25 +34,14 @@
           <w:ilvl w:val="0"/>
           <w:numId w:val="3"/>
         </w:numPr>
-        <w:rPr>
-          <w:rFonts w:ascii="Arial" w:hAnsi="Arial" w:cs="Arial"/>
-          <w:sz w:val="20"/>
-          <w:szCs w:val="20"/>
-        </w:rPr>
-      </w:pPr>
-      <w:r>
-        <w:rPr>
-          <w:rFonts w:ascii="Arial" w:hAnsi="Arial" w:cs="Arial"/>
-          <w:sz w:val="20"/>
-          <w:szCs w:val="20"/>
-        </w:rPr>
+      </w:pPr>
+      <w:r>
         <w:t xml:space="preserve">The code base is available at </w:t>
       </w:r>
       <w:hyperlink r:id="rId6" w:history="1">
         <w:r>
           <w:rPr>
             <w:rStyle w:val="Hyperlink"/>
-            <w:rFonts w:ascii="Arial" w:hAnsi="Arial" w:cs="Arial"/>
             <w:sz w:val="20"/>
             <w:szCs w:val="20"/>
           </w:rPr>
@@ -66,28 +49,15 @@
         </w:r>
       </w:hyperlink>
       <w:r>
+        <w:t>. It is a private repository</w:t>
+      </w:r>
+      <w:r>
+        <w:t>. With read access you can download (or clone) the repository. (</w:t>
+      </w:r>
+      <w:r>
         <w:rPr>
-          <w:rFonts w:ascii="Arial" w:hAnsi="Arial" w:cs="Arial"/>
-          <w:sz w:val="20"/>
-          <w:szCs w:val="20"/>
-        </w:rPr>
-        <w:t>. It is a private repository</w:t>
-      </w:r>
-      <w:r>
-        <w:rPr>
-          <w:rFonts w:ascii="Arial" w:hAnsi="Arial" w:cs="Arial"/>
-          <w:sz w:val="20"/>
-          <w:szCs w:val="20"/>
-        </w:rPr>
-        <w:t>. With read access you can download (or clone) the repository. (</w:t>
-      </w:r>
-      <w:r>
-        <w:rPr>
-          <w:rFonts w:ascii="Arial" w:hAnsi="Arial" w:cs="Arial"/>
           <w:i/>
           <w:iCs/>
-          <w:sz w:val="20"/>
-          <w:szCs w:val="20"/>
         </w:rPr>
         <w:t xml:space="preserve">Cloning a repository with </w:t>
       </w:r>
@@ -95,7 +65,6 @@
         <w:r>
           <w:rPr>
             <w:rStyle w:val="Hyperlink"/>
-            <w:rFonts w:ascii="Arial" w:hAnsi="Arial" w:cs="Arial"/>
             <w:i/>
             <w:iCs/>
             <w:sz w:val="20"/>
@@ -106,20 +75,12 @@
       </w:hyperlink>
       <w:r>
         <w:rPr>
-          <w:rFonts w:ascii="Arial" w:hAnsi="Arial" w:cs="Arial"/>
           <w:i/>
           <w:iCs/>
-          <w:sz w:val="20"/>
-          <w:szCs w:val="20"/>
         </w:rPr>
         <w:t xml:space="preserve"> or a Git-client would allow you to pull changes whenever the updated versions are available, as opposed to downloading all files every time a software update is made</w:t>
       </w:r>
       <w:r>
-        <w:rPr>
-          <w:rFonts w:ascii="Arial" w:hAnsi="Arial" w:cs="Arial"/>
-          <w:sz w:val="20"/>
-          <w:szCs w:val="20"/>
-        </w:rPr>
         <w:t>)</w:t>
       </w:r>
     </w:p>
@@ -186,8 +147,13 @@
           <w:numId w:val="6"/>
         </w:numPr>
       </w:pPr>
-      <w:r>
-        <w:t>numpy==</w:t>
+      <w:proofErr w:type="spellStart"/>
+      <w:r>
+        <w:t>numpy</w:t>
+      </w:r>
+      <w:proofErr w:type="spellEnd"/>
+      <w:r>
+        <w:t>==</w:t>
       </w:r>
       <w:r>
         <w:t>1.26.4</w:t>
@@ -201,8 +167,13 @@
           <w:numId w:val="6"/>
         </w:numPr>
       </w:pPr>
-      <w:r>
-        <w:t>scipy==</w:t>
+      <w:proofErr w:type="spellStart"/>
+      <w:r>
+        <w:t>scipy</w:t>
+      </w:r>
+      <w:proofErr w:type="spellEnd"/>
+      <w:r>
+        <w:t>==</w:t>
       </w:r>
       <w:r>
         <w:t>1.14.0</w:t>
@@ -246,10 +217,6 @@
         <w:t>(</w:t>
       </w:r>
       <w:r>
-        <w:rPr>
-          <w:i/>
-          <w:iCs/>
-        </w:rPr>
         <w:t>We may decide to create an installer for users later. Currently, we will resort to installing individual packages</w:t>
       </w:r>
       <w:r>
@@ -287,8 +254,13 @@
         <w:t xml:space="preserve"> to the folder ‘</w:t>
       </w:r>
       <w:r>
-        <w:t>\pod_lca</w:t>
-      </w:r>
+        <w:t>\</w:t>
+      </w:r>
+      <w:proofErr w:type="spellStart"/>
+      <w:r>
+        <w:t>pod_lca</w:t>
+      </w:r>
+      <w:proofErr w:type="spellEnd"/>
       <w:r>
         <w:t>’</w:t>
       </w:r>
@@ -305,8 +277,13 @@
         <w:t xml:space="preserve"> type ‘</w:t>
       </w:r>
       <w:r>
-        <w:t>python -m GUI.gui</w:t>
-      </w:r>
+        <w:t xml:space="preserve">python -m </w:t>
+      </w:r>
+      <w:proofErr w:type="spellStart"/>
+      <w:r>
+        <w:t>GUI.gui</w:t>
+      </w:r>
+      <w:proofErr w:type="spellEnd"/>
       <w:r>
         <w:t xml:space="preserve">’ and </w:t>
       </w:r>
@@ -581,15 +558,7 @@
                         <wps:txbx>
                           <w:txbxContent>
                             <w:p>
-                              <w:pPr>
-                                <w:rPr>
-                                  <w:rFonts w:ascii="Arial" w:hAnsi="Arial" w:cs="Arial"/>
-                                </w:rPr>
-                              </w:pPr>
                               <w:r>
-                                <w:rPr>
-                                  <w:rFonts w:ascii="Arial" w:hAnsi="Arial" w:cs="Arial"/>
-                                </w:rPr>
                                 <w:t>Palette</w:t>
                               </w:r>
                             </w:p>
@@ -623,15 +592,7 @@
                         <wps:txbx>
                           <w:txbxContent>
                             <w:p>
-                              <w:pPr>
-                                <w:rPr>
-                                  <w:rFonts w:ascii="Arial" w:hAnsi="Arial" w:cs="Arial"/>
-                                </w:rPr>
-                              </w:pPr>
                               <w:r>
-                                <w:rPr>
-                                  <w:rFonts w:ascii="Arial" w:hAnsi="Arial" w:cs="Arial"/>
-                                </w:rPr>
                                 <w:t>Canvas</w:t>
                               </w:r>
                             </w:p>
@@ -665,15 +626,7 @@
                         <wps:txbx>
                           <w:txbxContent>
                             <w:p>
-                              <w:pPr>
-                                <w:rPr>
-                                  <w:rFonts w:ascii="Arial" w:hAnsi="Arial" w:cs="Arial"/>
-                                </w:rPr>
-                              </w:pPr>
                               <w:r>
-                                <w:rPr>
-                                  <w:rFonts w:ascii="Arial" w:hAnsi="Arial" w:cs="Arial"/>
-                                </w:rPr>
                                 <w:t>Plotter</w:t>
                               </w:r>
                             </w:p>
@@ -707,15 +660,7 @@
                         <wps:txbx>
                           <w:txbxContent>
                             <w:p>
-                              <w:pPr>
-                                <w:rPr>
-                                  <w:rFonts w:ascii="Arial" w:hAnsi="Arial" w:cs="Arial"/>
-                                </w:rPr>
-                              </w:pPr>
                               <w:r>
-                                <w:rPr>
-                                  <w:rFonts w:ascii="Arial" w:hAnsi="Arial" w:cs="Arial"/>
-                                </w:rPr>
                                 <w:t>Menu bar</w:t>
                               </w:r>
                             </w:p>
@@ -768,15 +713,7 @@
                   <v:textbox>
                     <w:txbxContent>
                       <w:p>
-                        <w:pPr>
-                          <w:rPr>
-                            <w:rFonts w:ascii="Arial" w:hAnsi="Arial" w:cs="Arial"/>
-                          </w:rPr>
-                        </w:pPr>
                         <w:r>
-                          <w:rPr>
-                            <w:rFonts w:ascii="Arial" w:hAnsi="Arial" w:cs="Arial"/>
-                          </w:rPr>
                           <w:t>Palette</w:t>
                         </w:r>
                       </w:p>
@@ -787,15 +724,7 @@
                   <v:textbox>
                     <w:txbxContent>
                       <w:p>
-                        <w:pPr>
-                          <w:rPr>
-                            <w:rFonts w:ascii="Arial" w:hAnsi="Arial" w:cs="Arial"/>
-                          </w:rPr>
-                        </w:pPr>
                         <w:r>
-                          <w:rPr>
-                            <w:rFonts w:ascii="Arial" w:hAnsi="Arial" w:cs="Arial"/>
-                          </w:rPr>
                           <w:t>Canvas</w:t>
                         </w:r>
                       </w:p>
@@ -806,15 +735,7 @@
                   <v:textbox>
                     <w:txbxContent>
                       <w:p>
-                        <w:pPr>
-                          <w:rPr>
-                            <w:rFonts w:ascii="Arial" w:hAnsi="Arial" w:cs="Arial"/>
-                          </w:rPr>
-                        </w:pPr>
                         <w:r>
-                          <w:rPr>
-                            <w:rFonts w:ascii="Arial" w:hAnsi="Arial" w:cs="Arial"/>
-                          </w:rPr>
                           <w:t>Plotter</w:t>
                         </w:r>
                       </w:p>
@@ -825,15 +746,7 @@
                   <v:textbox>
                     <w:txbxContent>
                       <w:p>
-                        <w:pPr>
-                          <w:rPr>
-                            <w:rFonts w:ascii="Arial" w:hAnsi="Arial" w:cs="Arial"/>
-                          </w:rPr>
-                        </w:pPr>
                         <w:r>
-                          <w:rPr>
-                            <w:rFonts w:ascii="Arial" w:hAnsi="Arial" w:cs="Arial"/>
-                          </w:rPr>
                           <w:t>Menu bar</w:t>
                         </w:r>
                       </w:p>
@@ -851,58 +764,34 @@
     <w:p>
       <w:pPr>
         <w:rPr>
-          <w:rFonts w:ascii="Arial" w:hAnsi="Arial" w:cs="Arial"/>
           <w:sz w:val="20"/>
           <w:szCs w:val="20"/>
         </w:rPr>
       </w:pPr>
       <w:r>
         <w:rPr>
-          <w:rFonts w:ascii="Arial" w:hAnsi="Arial" w:cs="Arial"/>
           <w:sz w:val="20"/>
           <w:szCs w:val="20"/>
         </w:rPr>
         <w:t xml:space="preserve">The graphical user interface (GUI) of the </w:t>
       </w:r>
       <w:r>
+        <w:t>POD|LCA Material Tool has 4 main components</w:t>
+      </w:r>
+      <w:r>
+        <w:t>: Menu</w:t>
+      </w:r>
+      <w:r>
+        <w:t xml:space="preserve"> </w:t>
+      </w:r>
+      <w:r>
+        <w:t>bar, Palette, Canvas, and Plotter</w:t>
+      </w:r>
+      <w:r>
+        <w:t>.</w:t>
+      </w:r>
+      <w:r>
         <w:rPr>
-          <w:rFonts w:ascii="Arial" w:hAnsi="Arial" w:cs="Arial"/>
-        </w:rPr>
-        <w:t>POD|LCA Material Tool</w:t>
-      </w:r>
-      <w:r>
-        <w:rPr>
-          <w:rFonts w:ascii="Arial" w:hAnsi="Arial" w:cs="Arial"/>
-        </w:rPr>
-        <w:t xml:space="preserve"> has 4 main components</w:t>
-      </w:r>
-      <w:r>
-        <w:rPr>
-          <w:rFonts w:ascii="Arial" w:hAnsi="Arial" w:cs="Arial"/>
-        </w:rPr>
-        <w:t>: Menu</w:t>
-      </w:r>
-      <w:r>
-        <w:rPr>
-          <w:rFonts w:ascii="Arial" w:hAnsi="Arial" w:cs="Arial"/>
-        </w:rPr>
-        <w:t xml:space="preserve"> </w:t>
-      </w:r>
-      <w:r>
-        <w:rPr>
-          <w:rFonts w:ascii="Arial" w:hAnsi="Arial" w:cs="Arial"/>
-        </w:rPr>
-        <w:t>bar, Palette, Canvas, and Plotter</w:t>
-      </w:r>
-      <w:r>
-        <w:rPr>
-          <w:rFonts w:ascii="Arial" w:hAnsi="Arial" w:cs="Arial"/>
-        </w:rPr>
-        <w:t xml:space="preserve"> </w:t>
-      </w:r>
-      <w:r>
-        <w:rPr>
-          <w:rFonts w:ascii="Arial" w:hAnsi="Arial" w:cs="Arial"/>
           <w:sz w:val="20"/>
           <w:szCs w:val="20"/>
         </w:rPr>
@@ -911,121 +800,147 @@
     </w:p>
     <w:p>
       <w:pPr>
-        <w:pStyle w:val="ListParagraph"/>
-        <w:numPr>
-          <w:ilvl w:val="0"/>
-          <w:numId w:val="7"/>
-        </w:numPr>
+        <w:pStyle w:val="Heading3"/>
+      </w:pPr>
+      <w:r>
+        <w:lastRenderedPageBreak/>
+        <w:t>Menu Bar</w:t>
+      </w:r>
+    </w:p>
+    <w:p>
+      <w:r>
+        <w:t>The Menu Bar provid</w:t>
+      </w:r>
+      <w:r>
+        <w:t>e</w:t>
+      </w:r>
+      <w:r>
+        <w:t xml:space="preserve"> access to key functionalities such as opening and saving files, editing settings, and other tool-specific commands. It</w:t>
+      </w:r>
+      <w:r>
+        <w:t xml:space="preserve"> is</w:t>
+      </w:r>
+      <w:r>
+        <w:t xml:space="preserve"> your control center for navigating through the tool's features.</w:t>
+      </w:r>
+    </w:p>
+    <w:p>
+      <w:pPr>
+        <w:pStyle w:val="Heading3"/>
+      </w:pPr>
+      <w:r>
+        <w:t>Canvas</w:t>
+      </w:r>
+    </w:p>
+    <w:p>
+      <w:r>
+        <w:t xml:space="preserve">The Canvas is the workspace where </w:t>
+      </w:r>
+      <w:r>
+        <w:t xml:space="preserve">the process flow is built. </w:t>
+      </w:r>
+      <w:r>
+        <w:t xml:space="preserve">You add </w:t>
+      </w:r>
+      <w:r>
+        <w:t xml:space="preserve">products and processes from the palette and place it on the </w:t>
+      </w:r>
+      <w:r>
+        <w:t>C</w:t>
+      </w:r>
+      <w:r>
+        <w:t xml:space="preserve">anvas. You can connect products and processes, move items around the canvas, and navigate the </w:t>
+      </w:r>
+      <w:r>
+        <w:t>C</w:t>
+      </w:r>
+      <w:r>
+        <w:t>anvas</w:t>
+      </w:r>
+      <w:r>
+        <w:t>.</w:t>
+      </w:r>
+    </w:p>
+    <w:p>
+      <w:pPr>
+        <w:pStyle w:val="Heading3"/>
+      </w:pPr>
+      <w:r>
+        <w:t>Palette</w:t>
+      </w:r>
+    </w:p>
+    <w:p>
+      <w:r>
+        <w:t>The</w:t>
+      </w:r>
+      <w:r>
+        <w:t xml:space="preserve"> components you can </w:t>
+      </w:r>
+      <w:r>
+        <w:t xml:space="preserve">add </w:t>
+      </w:r>
+      <w:r>
+        <w:t>to the Canvas</w:t>
+      </w:r>
+      <w:r>
+        <w:t xml:space="preserve"> are in the Palette</w:t>
+      </w:r>
+      <w:r>
+        <w:t xml:space="preserve">. </w:t>
+      </w:r>
+      <w:r>
+        <w:t>Clicking the corresponding item on the Palette will create the corresponding item and place it on the</w:t>
+      </w:r>
+      <w:r>
+        <w:t xml:space="preserve"> Canvas. </w:t>
+      </w:r>
+    </w:p>
+    <w:p>
+      <w:pPr>
+        <w:pStyle w:val="Heading3"/>
+      </w:pPr>
+      <w:r>
+        <w:t>Plotter</w:t>
+      </w:r>
+    </w:p>
+    <w:p>
+      <w:r>
+        <w:t xml:space="preserve">The Plotter area displays </w:t>
+      </w:r>
+      <w:r>
+        <w:t>the environmental impacts in bar charts</w:t>
+      </w:r>
+      <w:r>
+        <w:t xml:space="preserve"> updating in real-time</w:t>
+      </w:r>
+      <w:r>
+        <w:t>. It</w:t>
+      </w:r>
+      <w:r>
+        <w:t xml:space="preserve"> i</w:t>
+      </w:r>
+      <w:r>
+        <w:t>s tightly integrated with the Canvas, allowing you to update plots dynamically as data changes</w:t>
+      </w:r>
+      <w:r>
+        <w:t xml:space="preserve"> on the Canvas</w:t>
+      </w:r>
+      <w:r>
+        <w:t xml:space="preserve">. </w:t>
+      </w:r>
+    </w:p>
+    <w:p>
+      <w:pPr>
+        <w:pStyle w:val="Heading2"/>
+      </w:pPr>
+      <w:r>
+        <w:t>Create New Project</w:t>
+      </w:r>
+    </w:p>
+    <w:p>
+      <w:r>
         <w:rPr>
-          <w:rFonts w:ascii="Arial" w:hAnsi="Arial" w:cs="Arial"/>
-          <w:sz w:val="20"/>
-          <w:szCs w:val="20"/>
-        </w:rPr>
-      </w:pPr>
-      <w:r>
-        <w:rPr>
-          <w:rFonts w:ascii="Arial" w:hAnsi="Arial" w:cs="Arial"/>
-          <w:sz w:val="20"/>
-          <w:szCs w:val="20"/>
-        </w:rPr>
-        <w:t>Menu</w:t>
-      </w:r>
-      <w:r>
-        <w:rPr>
-          <w:rFonts w:ascii="Arial" w:hAnsi="Arial" w:cs="Arial"/>
-          <w:sz w:val="20"/>
-          <w:szCs w:val="20"/>
-        </w:rPr>
-        <w:t xml:space="preserve"> bar:</w:t>
-      </w:r>
-    </w:p>
-    <w:p>
-      <w:pPr>
-        <w:pStyle w:val="ListParagraph"/>
-        <w:numPr>
-          <w:ilvl w:val="0"/>
-          <w:numId w:val="7"/>
-        </w:numPr>
-        <w:rPr>
-          <w:rFonts w:ascii="Arial" w:hAnsi="Arial" w:cs="Arial"/>
-          <w:sz w:val="20"/>
-          <w:szCs w:val="20"/>
-        </w:rPr>
-      </w:pPr>
-      <w:r>
-        <w:rPr>
-          <w:rFonts w:ascii="Arial" w:hAnsi="Arial" w:cs="Arial"/>
-          <w:sz w:val="20"/>
-          <w:szCs w:val="20"/>
-        </w:rPr>
-        <w:t>Canvas</w:t>
-      </w:r>
-    </w:p>
-    <w:p>
-      <w:pPr>
-        <w:pStyle w:val="ListParagraph"/>
-        <w:numPr>
-          <w:ilvl w:val="0"/>
-          <w:numId w:val="7"/>
-        </w:numPr>
-        <w:rPr>
-          <w:rFonts w:ascii="Arial" w:hAnsi="Arial" w:cs="Arial"/>
-          <w:sz w:val="20"/>
-          <w:szCs w:val="20"/>
-        </w:rPr>
-      </w:pPr>
-      <w:r>
-        <w:rPr>
-          <w:rFonts w:ascii="Arial" w:hAnsi="Arial" w:cs="Arial"/>
-          <w:sz w:val="20"/>
-          <w:szCs w:val="20"/>
-        </w:rPr>
-        <w:t>Palette</w:t>
-      </w:r>
-    </w:p>
-    <w:p>
-      <w:pPr>
-        <w:pStyle w:val="ListParagraph"/>
-        <w:numPr>
-          <w:ilvl w:val="0"/>
-          <w:numId w:val="7"/>
-        </w:numPr>
-        <w:rPr>
-          <w:rFonts w:ascii="Arial" w:hAnsi="Arial" w:cs="Arial"/>
-          <w:sz w:val="20"/>
-          <w:szCs w:val="20"/>
-        </w:rPr>
-      </w:pPr>
-      <w:r>
-        <w:rPr>
-          <w:rFonts w:ascii="Arial" w:hAnsi="Arial" w:cs="Arial"/>
-          <w:sz w:val="20"/>
-          <w:szCs w:val="20"/>
-        </w:rPr>
-        <w:t>Plotter</w:t>
-      </w:r>
-    </w:p>
-    <w:p>
-      <w:pPr>
-        <w:pStyle w:val="Heading2"/>
-      </w:pPr>
-      <w:r>
-        <w:lastRenderedPageBreak/>
-        <w:t>Create New Project</w:t>
-      </w:r>
-    </w:p>
-    <w:p>
-      <w:pPr>
-        <w:ind w:left="576"/>
-        <w:rPr>
-          <w:i/>
-          <w:iCs/>
-        </w:rPr>
-      </w:pPr>
-      <w:r>
-        <w:rPr>
-          <w:i/>
-          <w:iCs/>
+          <w:highlight w:val="yellow"/>
         </w:rPr>
         <w:t>Not yet implemented. Opening the program directly opens the GUI, without a start-up wizard</w:t>
       </w:r>
@@ -1081,6 +996,7 @@
         <w:pStyle w:val="Heading2"/>
       </w:pPr>
       <w:r>
+        <w:lastRenderedPageBreak/>
         <w:t>Program structure</w:t>
       </w:r>
     </w:p>
@@ -1122,9 +1038,6 @@
       </w:r>
     </w:p>
     <w:p>
-      <w:pPr>
-        <w:ind w:left="576"/>
-      </w:pPr>
       <w:r>
         <w:t>// how to create a branch</w:t>
       </w:r>
@@ -1693,7 +1606,6 @@
     <w:lvl w:ilvl="2">
       <w:start w:val="1"/>
       <w:numFmt w:val="decimal"/>
-      <w:pStyle w:val="Heading3"/>
       <w:lvlText w:val="%1.%2.%3"/>
       <w:lvlJc w:val="left"/>
       <w:pPr>
@@ -2296,6 +2208,13 @@
   <w:style w:type="paragraph" w:default="1" w:styleId="Normal">
     <w:name w:val="Normal"/>
     <w:qFormat/>
+    <w:rsid w:val="0022119F"/>
+    <w:pPr>
+      <w:spacing w:before="100" w:beforeAutospacing="1" w:after="100" w:afterAutospacing="1" w:line="240" w:lineRule="auto"/>
+    </w:pPr>
+    <w:rPr>
+      <w:rFonts w:ascii="Arial" w:hAnsi="Arial" w:cs="Arial"/>
+    </w:rPr>
   </w:style>
   <w:style w:type="paragraph" w:styleId="Heading1">
     <w:name w:val="heading 1"/>
@@ -2315,7 +2234,7 @@
       <w:outlineLvl w:val="0"/>
     </w:pPr>
     <w:rPr>
-      <w:rFonts w:ascii="Arial" w:eastAsiaTheme="majorEastAsia" w:hAnsi="Arial" w:cs="Arial"/>
+      <w:rFonts w:eastAsiaTheme="majorEastAsia"/>
       <w:color w:val="000000" w:themeColor="text1"/>
       <w:sz w:val="32"/>
       <w:szCs w:val="32"/>
@@ -2348,23 +2267,17 @@
     <w:next w:val="Normal"/>
     <w:link w:val="Heading3Char"/>
     <w:uiPriority w:val="9"/>
-    <w:semiHidden/>
     <w:unhideWhenUsed/>
     <w:qFormat/>
-    <w:rsid w:val="0094646F"/>
+    <w:rsid w:val="0022119F"/>
     <w:pPr>
       <w:keepNext/>
       <w:keepLines/>
-      <w:numPr>
-        <w:ilvl w:val="2"/>
-        <w:numId w:val="2"/>
-      </w:numPr>
       <w:spacing w:before="40" w:after="0"/>
       <w:outlineLvl w:val="2"/>
     </w:pPr>
     <w:rPr>
-      <w:rFonts w:asciiTheme="majorHAnsi" w:eastAsiaTheme="majorEastAsia" w:hAnsiTheme="majorHAnsi" w:cstheme="majorBidi"/>
-      <w:color w:val="1F3763" w:themeColor="accent1" w:themeShade="7F"/>
+      <w:rFonts w:eastAsiaTheme="majorEastAsia"/>
       <w:sz w:val="24"/>
       <w:szCs w:val="24"/>
     </w:rPr>
@@ -2565,11 +2478,11 @@
     <w:qFormat/>
     <w:rsid w:val="0094646F"/>
     <w:pPr>
-      <w:spacing w:after="0" w:line="240" w:lineRule="auto"/>
+      <w:spacing w:after="0"/>
       <w:contextualSpacing/>
     </w:pPr>
     <w:rPr>
-      <w:rFonts w:ascii="Arial" w:eastAsiaTheme="majorEastAsia" w:hAnsi="Arial" w:cs="Arial"/>
+      <w:rFonts w:eastAsiaTheme="majorEastAsia"/>
       <w:spacing w:val="-10"/>
       <w:kern w:val="28"/>
       <w:sz w:val="56"/>
@@ -2621,11 +2534,9 @@
     <w:basedOn w:val="DefaultParagraphFont"/>
     <w:link w:val="Heading3"/>
     <w:uiPriority w:val="9"/>
-    <w:semiHidden/>
-    <w:rsid w:val="0094646F"/>
+    <w:rsid w:val="0022119F"/>
     <w:rPr>
-      <w:rFonts w:asciiTheme="majorHAnsi" w:eastAsiaTheme="majorEastAsia" w:hAnsiTheme="majorHAnsi" w:cstheme="majorBidi"/>
-      <w:color w:val="1F3763" w:themeColor="accent1" w:themeShade="7F"/>
+      <w:rFonts w:ascii="Arial" w:eastAsiaTheme="majorEastAsia" w:hAnsi="Arial" w:cs="Arial"/>
       <w:sz w:val="24"/>
       <w:szCs w:val="24"/>
     </w:rPr>
@@ -2744,6 +2655,18 @@
     <w:rPr>
       <w:color w:val="605E5C"/>
       <w:shd w:val="clear" w:color="auto" w:fill="E1DFDD"/>
+    </w:rPr>
+  </w:style>
+  <w:style w:type="paragraph" w:styleId="NormalWeb">
+    <w:name w:val="Normal (Web)"/>
+    <w:basedOn w:val="Normal"/>
+    <w:uiPriority w:val="99"/>
+    <w:unhideWhenUsed/>
+    <w:rsid w:val="0022119F"/>
+    <w:rPr>
+      <w:rFonts w:ascii="Times New Roman" w:eastAsia="Times New Roman" w:hAnsi="Times New Roman" w:cs="Times New Roman"/>
+      <w:sz w:val="24"/>
+      <w:szCs w:val="24"/>
     </w:rPr>
   </w:style>
 </w:styles>

</xml_diff>

<commit_message>
Initial draft of user guide added
</commit_message>
<xml_diff>
--- a/src/GUI/Documentation/User Guide_v0.1.docx
+++ b/src/GUI/Documentation/User Guide_v0.1.docx
@@ -10,7 +10,6 @@
         <w:t>POD|LCA Materials Tool</w:t>
       </w:r>
     </w:p>
-    <w:p/>
     <w:p>
       <w:pPr>
         <w:pStyle w:val="Heading1"/>
@@ -52,7 +51,13 @@
         <w:t>. It is a private repository</w:t>
       </w:r>
       <w:r>
-        <w:t>. With read access you can download (or clone) the repository. (</w:t>
+        <w:t>. With read access</w:t>
+      </w:r>
+      <w:r>
+        <w:t>,</w:t>
+      </w:r>
+      <w:r>
+        <w:t xml:space="preserve"> you can download (or clone) the repository. (</w:t>
       </w:r>
       <w:r>
         <w:rPr>
@@ -78,7 +83,21 @@
           <w:i/>
           <w:iCs/>
         </w:rPr>
-        <w:t xml:space="preserve"> or a Git-client would allow you to pull changes whenever the updated versions are available, as opposed to downloading all files every time a software update is made</w:t>
+        <w:t xml:space="preserve"> or a </w:t>
+      </w:r>
+      <w:r>
+        <w:rPr>
+          <w:i/>
+          <w:iCs/>
+        </w:rPr>
+        <w:t>Git client</w:t>
+      </w:r>
+      <w:r>
+        <w:rPr>
+          <w:i/>
+          <w:iCs/>
+        </w:rPr>
+        <w:t xml:space="preserve"> would allow you to pull changes whenever the updated versions are available, as opposed to downloading all files every time a software update is made</w:t>
       </w:r>
       <w:r>
         <w:t>)</w:t>
@@ -93,14 +112,26 @@
         </w:numPr>
       </w:pPr>
       <w:r>
-        <w:t xml:space="preserve">POD|LCA Material Tool is built using Python programming language, and using a few other dependent packages. You need to </w:t>
+        <w:t xml:space="preserve">POD|LCA Material Tool is built using Python programming language and using a few other dependent packages. You need to </w:t>
       </w:r>
       <w:hyperlink r:id="rId8" w:history="1">
         <w:r>
           <w:rPr>
             <w:rStyle w:val="Hyperlink"/>
           </w:rPr>
-          <w:t>install</w:t>
+          <w:t>ins</w:t>
+        </w:r>
+        <w:r>
+          <w:rPr>
+            <w:rStyle w:val="Hyperlink"/>
+          </w:rPr>
+          <w:t>t</w:t>
+        </w:r>
+        <w:r>
+          <w:rPr>
+            <w:rStyle w:val="Hyperlink"/>
+          </w:rPr>
+          <w:t>all</w:t>
         </w:r>
       </w:hyperlink>
       <w:r>
@@ -114,7 +145,19 @@
           <w:rPr>
             <w:rStyle w:val="Hyperlink"/>
           </w:rPr>
-          <w:t>Python</w:t>
+          <w:t>Pyt</w:t>
+        </w:r>
+        <w:r>
+          <w:rPr>
+            <w:rStyle w:val="Hyperlink"/>
+          </w:rPr>
+          <w:t>h</w:t>
+        </w:r>
+        <w:r>
+          <w:rPr>
+            <w:rStyle w:val="Hyperlink"/>
+          </w:rPr>
+          <w:t>on</w:t>
         </w:r>
       </w:hyperlink>
       <w:r>
@@ -167,16 +210,11 @@
           <w:numId w:val="6"/>
         </w:numPr>
       </w:pPr>
-      <w:proofErr w:type="spellStart"/>
-      <w:r>
-        <w:t>scipy</w:t>
-      </w:r>
-      <w:proofErr w:type="spellEnd"/>
-      <w:r>
-        <w:t>==</w:t>
-      </w:r>
-      <w:r>
-        <w:t>1.14.0</w:t>
+      <w:r>
+        <w:t>pandas==</w:t>
+      </w:r>
+      <w:r>
+        <w:t>2.2.2</w:t>
       </w:r>
     </w:p>
     <w:p>
@@ -203,24 +241,112 @@
         </w:numPr>
       </w:pPr>
       <w:r>
-        <w:t>pandas==</w:t>
-      </w:r>
-      <w:r>
-        <w:t>2.2.2</w:t>
-      </w:r>
-    </w:p>
-    <w:p>
-      <w:pPr>
-        <w:pStyle w:val="ListParagraph"/>
-      </w:pPr>
-      <w:r>
-        <w:t>(</w:t>
-      </w:r>
-      <w:r>
-        <w:t>We may decide to create an installer for users later. Currently, we will resort to installing individual packages</w:t>
-      </w:r>
-      <w:r>
-        <w:t>)</w:t>
+        <w:rPr>
+          <w:noProof/>
+        </w:rPr>
+        <mc:AlternateContent>
+          <mc:Choice Requires="wps">
+            <w:drawing>
+              <wp:anchor distT="45720" distB="45720" distL="114300" distR="114300" simplePos="0" relativeHeight="251670528" behindDoc="0" locked="0" layoutInCell="1" allowOverlap="1" wp14:anchorId="2E8AB316" wp14:editId="7699C9EE">
+                <wp:simplePos x="0" y="0"/>
+                <wp:positionH relativeFrom="column">
+                  <wp:posOffset>391795</wp:posOffset>
+                </wp:positionH>
+                <wp:positionV relativeFrom="paragraph">
+                  <wp:posOffset>283845</wp:posOffset>
+                </wp:positionV>
+                <wp:extent cx="5471160" cy="309880"/>
+                <wp:effectExtent l="19050" t="19050" r="15240" b="13970"/>
+                <wp:wrapTopAndBottom/>
+                <wp:docPr id="10" name="Text Box 2"/>
+                <wp:cNvGraphicFramePr>
+                  <a:graphicFrameLocks xmlns:a="http://schemas.openxmlformats.org/drawingml/2006/main"/>
+                </wp:cNvGraphicFramePr>
+                <a:graphic xmlns:a="http://schemas.openxmlformats.org/drawingml/2006/main">
+                  <a:graphicData uri="http://schemas.microsoft.com/office/word/2010/wordprocessingShape">
+                    <wps:wsp>
+                      <wps:cNvSpPr txBox="1">
+                        <a:spLocks noChangeArrowheads="1"/>
+                      </wps:cNvSpPr>
+                      <wps:spPr bwMode="auto">
+                        <a:xfrm>
+                          <a:off x="0" y="0"/>
+                          <a:ext cx="5471160" cy="309880"/>
+                        </a:xfrm>
+                        <a:prstGeom prst="rect">
+                          <a:avLst/>
+                        </a:prstGeom>
+                        <a:solidFill>
+                          <a:srgbClr val="FFFFFF"/>
+                        </a:solidFill>
+                        <a:ln w="28575">
+                          <a:solidFill>
+                            <a:srgbClr val="7030A0"/>
+                          </a:solidFill>
+                          <a:miter lim="800000"/>
+                          <a:headEnd/>
+                          <a:tailEnd/>
+                        </a:ln>
+                      </wps:spPr>
+                      <wps:txbx>
+                        <w:txbxContent>
+                          <w:p>
+                            <w:r>
+                              <w:t>(TBD): Create installer</w:t>
+                            </w:r>
+                            <w:r>
+                              <w:t xml:space="preserve"> to do the above steps.</w:t>
+                            </w:r>
+                          </w:p>
+                        </w:txbxContent>
+                      </wps:txbx>
+                      <wps:bodyPr rot="0" vert="horz" wrap="square" lIns="91440" tIns="45720" rIns="91440" bIns="45720" anchor="t" anchorCtr="0">
+                        <a:noAutofit/>
+                      </wps:bodyPr>
+                    </wps:wsp>
+                  </a:graphicData>
+                </a:graphic>
+                <wp14:sizeRelH relativeFrom="margin">
+                  <wp14:pctWidth>0</wp14:pctWidth>
+                </wp14:sizeRelH>
+                <wp14:sizeRelV relativeFrom="margin">
+                  <wp14:pctHeight>0</wp14:pctHeight>
+                </wp14:sizeRelV>
+              </wp:anchor>
+            </w:drawing>
+          </mc:Choice>
+          <mc:Fallback>
+            <w:pict>
+              <v:shapetype w14:anchorId="2E8AB316" id="_x0000_t202" coordsize="21600,21600" o:spt="202" path="m,l,21600r21600,l21600,xe">
+                <v:stroke joinstyle="miter"/>
+                <v:path gradientshapeok="t" o:connecttype="rect"/>
+              </v:shapetype>
+              <v:shape id="Text Box 2" o:spid="_x0000_s1026" type="#_x0000_t202" style="position:absolute;left:0;text-align:left;margin-left:30.85pt;margin-top:22.35pt;width:430.8pt;height:24.4pt;z-index:251670528;visibility:visible;mso-wrap-style:square;mso-width-percent:0;mso-height-percent:0;mso-wrap-distance-left:9pt;mso-wrap-distance-top:3.6pt;mso-wrap-distance-right:9pt;mso-wrap-distance-bottom:3.6pt;mso-position-horizontal:absolute;mso-position-horizontal-relative:text;mso-position-vertical:absolute;mso-position-vertical-relative:text;mso-width-percent:0;mso-height-percent:0;mso-width-relative:margin;mso-height-relative:margin;v-text-anchor:top" o:gfxdata="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" strokecolor="#7030a0" strokeweight="2.25pt">
+                <v:textbox>
+                  <w:txbxContent>
+                    <w:p>
+                      <w:r>
+                        <w:t>(TBD): Create installer</w:t>
+                      </w:r>
+                      <w:r>
+                        <w:t xml:space="preserve"> to do the above steps.</w:t>
+                      </w:r>
+                    </w:p>
+                  </w:txbxContent>
+                </v:textbox>
+                <w10:wrap type="topAndBottom"/>
+              </v:shape>
+            </w:pict>
+          </mc:Fallback>
+        </mc:AlternateContent>
+      </w:r>
+      <w:proofErr w:type="spellStart"/>
+      <w:r>
+        <w:t>mplcursors</w:t>
+      </w:r>
+      <w:proofErr w:type="spellEnd"/>
+      <w:r>
+        <w:t>==0.5.3</w:t>
       </w:r>
     </w:p>
     <w:p>
@@ -236,7 +362,19 @@
           <w:rPr>
             <w:rStyle w:val="Hyperlink"/>
           </w:rPr>
-          <w:t>Open windows command prompt</w:t>
+          <w:t xml:space="preserve">Open </w:t>
+        </w:r>
+        <w:r>
+          <w:rPr>
+            <w:rStyle w:val="Hyperlink"/>
+          </w:rPr>
+          <w:t>the Windows</w:t>
+        </w:r>
+        <w:r>
+          <w:rPr>
+            <w:rStyle w:val="Hyperlink"/>
+          </w:rPr>
+          <w:t xml:space="preserve"> command prompt</w:t>
         </w:r>
       </w:hyperlink>
       <w:r>
@@ -251,20 +389,23 @@
         </w:r>
       </w:hyperlink>
       <w:r>
-        <w:t xml:space="preserve"> to the folder ‘</w:t>
-      </w:r>
-      <w:r>
+        <w:t xml:space="preserve"> to the folder </w:t>
+      </w:r>
+      <w:r>
+        <w:rPr>
+          <w:rFonts w:ascii="Courier New" w:hAnsi="Courier New" w:cs="Courier New"/>
+        </w:rPr>
         <w:t>\</w:t>
       </w:r>
       <w:proofErr w:type="spellStart"/>
       <w:r>
+        <w:rPr>
+          <w:rFonts w:ascii="Courier New" w:hAnsi="Courier New" w:cs="Courier New"/>
+        </w:rPr>
         <w:t>pod_lca</w:t>
       </w:r>
       <w:proofErr w:type="spellEnd"/>
       <w:r>
-        <w:t>’</w:t>
-      </w:r>
-      <w:r>
         <w:t xml:space="preserve">. </w:t>
       </w:r>
       <w:r>
@@ -274,29 +415,42 @@
         <w:t>,</w:t>
       </w:r>
       <w:r>
-        <w:t xml:space="preserve"> type ‘</w:t>
-      </w:r>
-      <w:r>
+        <w:t xml:space="preserve"> type </w:t>
+      </w:r>
+      <w:r>
+        <w:rPr>
+          <w:rFonts w:ascii="Courier New" w:hAnsi="Courier New" w:cs="Courier New"/>
+        </w:rPr>
         <w:t xml:space="preserve">python -m </w:t>
       </w:r>
       <w:proofErr w:type="spellStart"/>
       <w:r>
+        <w:rPr>
+          <w:rFonts w:ascii="Courier New" w:hAnsi="Courier New" w:cs="Courier New"/>
+        </w:rPr>
         <w:t>GUI.gui</w:t>
       </w:r>
       <w:proofErr w:type="spellEnd"/>
       <w:r>
-        <w:t xml:space="preserve">’ and </w:t>
+        <w:t xml:space="preserve"> and </w:t>
       </w:r>
       <w:r>
         <w:t xml:space="preserve">press </w:t>
       </w:r>
       <w:r>
-        <w:t>enter. The POD|LCA Material Tool window will pop-up.</w:t>
+        <w:t xml:space="preserve">enter. The POD|LCA Material Tool window will </w:t>
+      </w:r>
+      <w:r>
+        <w:t>pop up</w:t>
+      </w:r>
+      <w:r>
+        <w:t>.</w:t>
       </w:r>
     </w:p>
     <w:p>
       <w:pPr>
         <w:pStyle w:val="Heading2"/>
+        <w:spacing w:before="40" w:beforeAutospacing="1"/>
       </w:pPr>
       <w:r>
         <w:t xml:space="preserve">The </w:t>
@@ -309,6 +463,20 @@
       </w:r>
     </w:p>
     <w:p>
+      <w:pPr>
+        <w:pStyle w:val="Caption"/>
+        <w:spacing w:before="240" w:beforeAutospacing="0" w:line="276" w:lineRule="auto"/>
+        <w:jc w:val="center"/>
+        <w:rPr>
+          <w:b/>
+          <w:bCs/>
+          <w:i w:val="0"/>
+          <w:iCs w:val="0"/>
+          <w:noProof/>
+          <w:color w:val="000000" w:themeColor="text1"/>
+        </w:rPr>
+      </w:pPr>
+      <w:bookmarkStart w:id="0" w:name="_Ref176776067"/>
       <w:r>
         <w:rPr>
           <w:noProof/>
@@ -316,18 +484,18 @@
         <mc:AlternateContent>
           <mc:Choice Requires="wpg">
             <w:drawing>
-              <wp:anchor distT="0" distB="0" distL="114300" distR="114300" simplePos="0" relativeHeight="251673600" behindDoc="0" locked="0" layoutInCell="1" allowOverlap="1" wp14:anchorId="3F7A801F" wp14:editId="49C39BB8">
+              <wp:anchor distT="0" distB="0" distL="114300" distR="114300" simplePos="0" relativeHeight="251682816" behindDoc="0" locked="1" layoutInCell="1" allowOverlap="1" wp14:anchorId="0D34DBB7" wp14:editId="04E4B763">
                 <wp:simplePos x="0" y="0"/>
-                <wp:positionH relativeFrom="column">
-                  <wp:posOffset>146440</wp:posOffset>
+                <wp:positionH relativeFrom="margin">
+                  <wp:align>center</wp:align>
                 </wp:positionH>
                 <wp:positionV relativeFrom="paragraph">
-                  <wp:posOffset>176774</wp:posOffset>
+                  <wp:posOffset>-62230</wp:posOffset>
                 </wp:positionV>
-                <wp:extent cx="5475654" cy="2348230"/>
-                <wp:effectExtent l="0" t="0" r="10795" b="0"/>
+                <wp:extent cx="5943600" cy="2587625"/>
+                <wp:effectExtent l="0" t="0" r="0" b="3175"/>
                 <wp:wrapTopAndBottom/>
-                <wp:docPr id="9" name="Group 9"/>
+                <wp:docPr id="21" name="Group 21"/>
                 <wp:cNvGraphicFramePr/>
                 <a:graphic xmlns:a="http://schemas.openxmlformats.org/drawingml/2006/main">
                   <a:graphicData uri="http://schemas.microsoft.com/office/word/2010/wordprocessingGroup">
@@ -336,220 +504,163 @@
                       <wpg:grpSpPr>
                         <a:xfrm>
                           <a:off x="0" y="0"/>
-                          <a:ext cx="5475654" cy="2348230"/>
+                          <a:ext cx="5943600" cy="2587625"/>
                           <a:chOff x="0" y="0"/>
-                          <a:chExt cx="5475654" cy="2348230"/>
+                          <a:chExt cx="5942965" cy="2590165"/>
                         </a:xfrm>
                       </wpg:grpSpPr>
-                      <pic:pic xmlns:pic="http://schemas.openxmlformats.org/drawingml/2006/picture">
-                        <pic:nvPicPr>
-                          <pic:cNvPr id="1" name="Picture 1"/>
-                          <pic:cNvPicPr>
-                            <a:picLocks noChangeAspect="1"/>
-                          </pic:cNvPicPr>
-                        </pic:nvPicPr>
-                        <pic:blipFill>
-                          <a:blip r:embed="rId12" cstate="print">
-                            <a:extLst>
-                              <a:ext uri="{28A0092B-C50C-407E-A947-70E740481C1C}">
-                                <a14:useLocalDpi xmlns:a14="http://schemas.microsoft.com/office/drawing/2010/main" val="0"/>
-                              </a:ext>
-                            </a:extLst>
-                          </a:blip>
-                          <a:stretch>
-                            <a:fillRect/>
-                          </a:stretch>
-                        </pic:blipFill>
-                        <pic:spPr>
+                      <wpg:grpSp>
+                        <wpg:cNvPr id="15" name="Group 15"/>
+                        <wpg:cNvGrpSpPr/>
+                        <wpg:grpSpPr>
                           <a:xfrm>
-                            <a:off x="146538" y="0"/>
-                            <a:ext cx="5327650" cy="2348230"/>
+                            <a:off x="0" y="0"/>
+                            <a:ext cx="5942965" cy="2590165"/>
+                            <a:chOff x="0" y="2267652"/>
+                            <a:chExt cx="5942965" cy="2590732"/>
                           </a:xfrm>
-                          <a:prstGeom prst="rect">
-                            <a:avLst/>
-                          </a:prstGeom>
-                        </pic:spPr>
-                      </pic:pic>
+                        </wpg:grpSpPr>
+                        <wpg:grpSp>
+                          <wpg:cNvPr id="12" name="Group 12"/>
+                          <wpg:cNvGrpSpPr/>
+                          <wpg:grpSpPr>
+                            <a:xfrm>
+                              <a:off x="0" y="2267652"/>
+                              <a:ext cx="5942965" cy="2590732"/>
+                              <a:chOff x="0" y="2267712"/>
+                              <a:chExt cx="5943600" cy="2590800"/>
+                            </a:xfrm>
+                          </wpg:grpSpPr>
+                          <pic:pic xmlns:pic="http://schemas.openxmlformats.org/drawingml/2006/picture">
+                            <pic:nvPicPr>
+                              <pic:cNvPr id="11" name="Picture 11"/>
+                              <pic:cNvPicPr>
+                                <a:picLocks noChangeAspect="1"/>
+                              </pic:cNvPicPr>
+                            </pic:nvPicPr>
+                            <pic:blipFill>
+                              <a:blip r:embed="rId12" cstate="print">
+                                <a:extLst>
+                                  <a:ext uri="{28A0092B-C50C-407E-A947-70E740481C1C}">
+                                    <a14:useLocalDpi xmlns:a14="http://schemas.microsoft.com/office/drawing/2010/main" val="0"/>
+                                  </a:ext>
+                                </a:extLst>
+                              </a:blip>
+                              <a:stretch>
+                                <a:fillRect/>
+                              </a:stretch>
+                            </pic:blipFill>
+                            <pic:spPr>
+                              <a:xfrm>
+                                <a:off x="0" y="2267712"/>
+                                <a:ext cx="5943600" cy="2590800"/>
+                              </a:xfrm>
+                              <a:prstGeom prst="rect">
+                                <a:avLst/>
+                              </a:prstGeom>
+                            </pic:spPr>
+                          </pic:pic>
+                          <wps:wsp>
+                            <wps:cNvPr id="217" name="Text Box 2"/>
+                            <wps:cNvSpPr txBox="1">
+                              <a:spLocks noChangeArrowheads="1"/>
+                            </wps:cNvSpPr>
+                            <wps:spPr bwMode="auto">
+                              <a:xfrm>
+                                <a:off x="585422" y="3907391"/>
+                                <a:ext cx="650507" cy="278043"/>
+                              </a:xfrm>
+                              <a:prstGeom prst="rect">
+                                <a:avLst/>
+                              </a:prstGeom>
+                              <a:solidFill>
+                                <a:schemeClr val="bg1"/>
+                              </a:solidFill>
+                              <a:ln w="9525">
+                                <a:solidFill>
+                                  <a:schemeClr val="tx1"/>
+                                </a:solidFill>
+                                <a:miter lim="800000"/>
+                                <a:headEnd/>
+                                <a:tailEnd/>
+                              </a:ln>
+                            </wps:spPr>
+                            <wps:txbx>
+                              <w:txbxContent>
+                                <w:p>
+                                  <w:pPr>
+                                    <w:rPr>
+                                      <w:b/>
+                                      <w:bCs/>
+                                    </w:rPr>
+                                  </w:pPr>
+                                  <w:r>
+                                    <w:rPr>
+                                      <w:b/>
+                                      <w:bCs/>
+                                    </w:rPr>
+                                    <w:t>Palette</w:t>
+                                  </w:r>
+                                </w:p>
+                              </w:txbxContent>
+                            </wps:txbx>
+                            <wps:bodyPr rot="0" vert="horz" wrap="square" lIns="91440" tIns="45720" rIns="91440" bIns="45720" anchor="t" anchorCtr="0">
+                              <a:noAutofit/>
+                            </wps:bodyPr>
+                          </wps:wsp>
+                        </wpg:grpSp>
+                        <wps:wsp>
+                          <wps:cNvPr id="13" name="Straight Arrow Connector 13"/>
+                          <wps:cNvCnPr/>
+                          <wps:spPr>
+                            <a:xfrm flipH="1" flipV="1">
+                              <a:off x="196536" y="3654960"/>
+                              <a:ext cx="387127" cy="362855"/>
+                            </a:xfrm>
+                            <a:prstGeom prst="straightConnector1">
+                              <a:avLst/>
+                            </a:prstGeom>
+                            <a:ln>
+                              <a:tailEnd type="triangle"/>
+                            </a:ln>
+                          </wps:spPr>
+                          <wps:style>
+                            <a:lnRef idx="1">
+                              <a:schemeClr val="dk1"/>
+                            </a:lnRef>
+                            <a:fillRef idx="0">
+                              <a:schemeClr val="dk1"/>
+                            </a:fillRef>
+                            <a:effectRef idx="0">
+                              <a:schemeClr val="dk1"/>
+                            </a:effectRef>
+                            <a:fontRef idx="minor">
+                              <a:schemeClr val="tx1"/>
+                            </a:fontRef>
+                          </wps:style>
+                          <wps:bodyPr/>
+                        </wps:wsp>
+                      </wpg:grpSp>
                       <wps:wsp>
-                        <wps:cNvPr id="2" name="Rectangle 2"/>
-                        <wps:cNvSpPr/>
-                        <wps:spPr>
-                          <a:xfrm>
-                            <a:off x="148004" y="136281"/>
-                            <a:ext cx="5327650" cy="105508"/>
-                          </a:xfrm>
-                          <a:prstGeom prst="rect">
-                            <a:avLst/>
-                          </a:prstGeom>
-                          <a:noFill/>
-                          <a:ln w="28575">
-                            <a:solidFill>
-                              <a:srgbClr val="FF0000"/>
-                            </a:solidFill>
-                          </a:ln>
-                        </wps:spPr>
-                        <wps:style>
-                          <a:lnRef idx="2">
-                            <a:schemeClr val="accent1">
-                              <a:shade val="50000"/>
-                            </a:schemeClr>
-                          </a:lnRef>
-                          <a:fillRef idx="1">
-                            <a:schemeClr val="accent1"/>
-                          </a:fillRef>
-                          <a:effectRef idx="0">
-                            <a:schemeClr val="accent1"/>
-                          </a:effectRef>
-                          <a:fontRef idx="minor">
-                            <a:schemeClr val="lt1"/>
-                          </a:fontRef>
-                        </wps:style>
-                        <wps:bodyPr rot="0" spcFirstLastPara="0" vertOverflow="overflow" horzOverflow="overflow" vert="horz" wrap="square" lIns="91440" tIns="45720" rIns="91440" bIns="45720" numCol="1" spcCol="0" rtlCol="0" fromWordArt="0" anchor="ctr" anchorCtr="0" forceAA="0" compatLnSpc="1">
-                          <a:prstTxWarp prst="textNoShape">
-                            <a:avLst/>
-                          </a:prstTxWarp>
-                          <a:noAutofit/>
-                        </wps:bodyPr>
-                      </wps:wsp>
-                      <wps:wsp>
-                        <wps:cNvPr id="3" name="Rectangle 3"/>
-                        <wps:cNvSpPr/>
-                        <wps:spPr>
-                          <a:xfrm>
-                            <a:off x="505557" y="265235"/>
-                            <a:ext cx="2823797" cy="2044211"/>
-                          </a:xfrm>
-                          <a:prstGeom prst="rect">
-                            <a:avLst/>
-                          </a:prstGeom>
-                          <a:noFill/>
-                          <a:ln w="28575">
-                            <a:solidFill>
-                              <a:srgbClr val="FF0000"/>
-                            </a:solidFill>
-                          </a:ln>
-                        </wps:spPr>
-                        <wps:style>
-                          <a:lnRef idx="2">
-                            <a:schemeClr val="accent1">
-                              <a:shade val="50000"/>
-                            </a:schemeClr>
-                          </a:lnRef>
-                          <a:fillRef idx="1">
-                            <a:schemeClr val="accent1"/>
-                          </a:fillRef>
-                          <a:effectRef idx="0">
-                            <a:schemeClr val="accent1"/>
-                          </a:effectRef>
-                          <a:fontRef idx="minor">
-                            <a:schemeClr val="lt1"/>
-                          </a:fontRef>
-                        </wps:style>
-                        <wps:bodyPr rot="0" spcFirstLastPara="0" vertOverflow="overflow" horzOverflow="overflow" vert="horz" wrap="square" lIns="91440" tIns="45720" rIns="91440" bIns="45720" numCol="1" spcCol="0" rtlCol="0" fromWordArt="0" anchor="ctr" anchorCtr="0" forceAA="0" compatLnSpc="1">
-                          <a:prstTxWarp prst="textNoShape">
-                            <a:avLst/>
-                          </a:prstTxWarp>
-                          <a:noAutofit/>
-                        </wps:bodyPr>
-                      </wps:wsp>
-                      <wps:wsp>
-                        <wps:cNvPr id="4" name="Rectangle 4"/>
-                        <wps:cNvSpPr/>
-                        <wps:spPr>
-                          <a:xfrm>
-                            <a:off x="3383573" y="241788"/>
-                            <a:ext cx="2090615" cy="2067512"/>
-                          </a:xfrm>
-                          <a:prstGeom prst="rect">
-                            <a:avLst/>
-                          </a:prstGeom>
-                          <a:noFill/>
-                          <a:ln w="28575">
-                            <a:solidFill>
-                              <a:srgbClr val="FF0000"/>
-                            </a:solidFill>
-                          </a:ln>
-                        </wps:spPr>
-                        <wps:style>
-                          <a:lnRef idx="2">
-                            <a:schemeClr val="accent1">
-                              <a:shade val="50000"/>
-                            </a:schemeClr>
-                          </a:lnRef>
-                          <a:fillRef idx="1">
-                            <a:schemeClr val="accent1"/>
-                          </a:fillRef>
-                          <a:effectRef idx="0">
-                            <a:schemeClr val="accent1"/>
-                          </a:effectRef>
-                          <a:fontRef idx="minor">
-                            <a:schemeClr val="lt1"/>
-                          </a:fontRef>
-                        </wps:style>
-                        <wps:bodyPr rot="0" spcFirstLastPara="0" vertOverflow="overflow" horzOverflow="overflow" vert="horz" wrap="square" lIns="91440" tIns="45720" rIns="91440" bIns="45720" numCol="1" spcCol="0" rtlCol="0" fromWordArt="0" anchor="ctr" anchorCtr="0" forceAA="0" compatLnSpc="1">
-                          <a:prstTxWarp prst="textNoShape">
-                            <a:avLst/>
-                          </a:prstTxWarp>
-                          <a:noAutofit/>
-                        </wps:bodyPr>
-                      </wps:wsp>
-                      <wps:wsp>
-                        <wps:cNvPr id="5" name="Rectangle 5"/>
-                        <wps:cNvSpPr/>
-                        <wps:spPr>
-                          <a:xfrm>
-                            <a:off x="148004" y="241788"/>
-                            <a:ext cx="320919" cy="2067512"/>
-                          </a:xfrm>
-                          <a:prstGeom prst="rect">
-                            <a:avLst/>
-                          </a:prstGeom>
-                          <a:noFill/>
-                          <a:ln w="28575">
-                            <a:solidFill>
-                              <a:srgbClr val="FF0000"/>
-                            </a:solidFill>
-                          </a:ln>
-                        </wps:spPr>
-                        <wps:style>
-                          <a:lnRef idx="2">
-                            <a:schemeClr val="accent1">
-                              <a:shade val="50000"/>
-                            </a:schemeClr>
-                          </a:lnRef>
-                          <a:fillRef idx="1">
-                            <a:schemeClr val="accent1"/>
-                          </a:fillRef>
-                          <a:effectRef idx="0">
-                            <a:schemeClr val="accent1"/>
-                          </a:effectRef>
-                          <a:fontRef idx="minor">
-                            <a:schemeClr val="lt1"/>
-                          </a:fontRef>
-                        </wps:style>
-                        <wps:bodyPr rot="0" spcFirstLastPara="0" vertOverflow="overflow" horzOverflow="overflow" vert="horz" wrap="square" lIns="91440" tIns="45720" rIns="91440" bIns="45720" numCol="1" spcCol="0" rtlCol="0" fromWordArt="0" anchor="ctr" anchorCtr="0" forceAA="0" compatLnSpc="1">
-                          <a:prstTxWarp prst="textNoShape">
-                            <a:avLst/>
-                          </a:prstTxWarp>
-                          <a:noAutofit/>
-                        </wps:bodyPr>
-                      </wps:wsp>
-                      <wps:wsp>
-                        <wps:cNvPr id="217" name="Text Box 2"/>
+                        <wps:cNvPr id="16" name="Text Box 2"/>
                         <wps:cNvSpPr txBox="1">
                           <a:spLocks noChangeArrowheads="1"/>
                         </wps:cNvSpPr>
                         <wps:spPr bwMode="auto">
                           <a:xfrm>
-                            <a:off x="0" y="1242646"/>
-                            <a:ext cx="662305" cy="274955"/>
+                            <a:off x="1285592" y="425513"/>
+                            <a:ext cx="814811" cy="277495"/>
                           </a:xfrm>
                           <a:prstGeom prst="rect">
                             <a:avLst/>
                           </a:prstGeom>
-                          <a:noFill/>
+                          <a:solidFill>
+                            <a:schemeClr val="bg1"/>
+                          </a:solidFill>
                           <a:ln w="9525">
-                            <a:noFill/>
+                            <a:solidFill>
+                              <a:schemeClr val="tx1"/>
+                            </a:solidFill>
                             <a:miter lim="800000"/>
                             <a:headEnd/>
                             <a:tailEnd/>
@@ -558,8 +669,18 @@
                         <wps:txbx>
                           <w:txbxContent>
                             <w:p>
+                              <w:pPr>
+                                <w:rPr>
+                                  <w:b/>
+                                  <w:bCs/>
+                                </w:rPr>
+                              </w:pPr>
                               <w:r>
-                                <w:t>Palette</w:t>
+                                <w:rPr>
+                                  <w:b/>
+                                  <w:bCs/>
+                                </w:rPr>
+                                <w:t>Menu bar</w:t>
                               </w:r>
                             </w:p>
                           </w:txbxContent>
@@ -569,21 +690,56 @@
                         </wps:bodyPr>
                       </wps:wsp>
                       <wps:wsp>
-                        <wps:cNvPr id="6" name="Text Box 2"/>
+                        <wps:cNvPr id="17" name="Straight Arrow Connector 17"/>
+                        <wps:cNvCnPr/>
+                        <wps:spPr>
+                          <a:xfrm flipH="1" flipV="1">
+                            <a:off x="896293" y="172016"/>
+                            <a:ext cx="386715" cy="362585"/>
+                          </a:xfrm>
+                          <a:prstGeom prst="straightConnector1">
+                            <a:avLst/>
+                          </a:prstGeom>
+                          <a:ln>
+                            <a:tailEnd type="triangle"/>
+                          </a:ln>
+                        </wps:spPr>
+                        <wps:style>
+                          <a:lnRef idx="1">
+                            <a:schemeClr val="dk1"/>
+                          </a:lnRef>
+                          <a:fillRef idx="0">
+                            <a:schemeClr val="dk1"/>
+                          </a:fillRef>
+                          <a:effectRef idx="0">
+                            <a:schemeClr val="dk1"/>
+                          </a:effectRef>
+                          <a:fontRef idx="minor">
+                            <a:schemeClr val="tx1"/>
+                          </a:fontRef>
+                        </wps:style>
+                        <wps:bodyPr/>
+                      </wps:wsp>
+                      <wps:wsp>
+                        <wps:cNvPr id="18" name="Text Box 2"/>
                         <wps:cNvSpPr txBox="1">
                           <a:spLocks noChangeArrowheads="1"/>
                         </wps:cNvSpPr>
                         <wps:spPr bwMode="auto">
                           <a:xfrm>
-                            <a:off x="2520461" y="2033954"/>
-                            <a:ext cx="755650" cy="274955"/>
+                            <a:off x="4146487" y="1152412"/>
+                            <a:ext cx="683537" cy="278036"/>
                           </a:xfrm>
                           <a:prstGeom prst="rect">
                             <a:avLst/>
                           </a:prstGeom>
-                          <a:noFill/>
+                          <a:solidFill>
+                            <a:schemeClr val="bg1"/>
+                          </a:solidFill>
                           <a:ln w="9525">
-                            <a:noFill/>
+                            <a:solidFill>
+                              <a:schemeClr val="tx1"/>
+                            </a:solidFill>
                             <a:miter lim="800000"/>
                             <a:headEnd/>
                             <a:tailEnd/>
@@ -592,41 +748,17 @@
                         <wps:txbx>
                           <w:txbxContent>
                             <w:p>
+                              <w:pPr>
+                                <w:rPr>
+                                  <w:b/>
+                                  <w:bCs/>
+                                </w:rPr>
+                              </w:pPr>
                               <w:r>
-                                <w:t>Canvas</w:t>
-                              </w:r>
-                            </w:p>
-                          </w:txbxContent>
-                        </wps:txbx>
-                        <wps:bodyPr rot="0" vert="horz" wrap="square" lIns="91440" tIns="45720" rIns="91440" bIns="45720" anchor="t" anchorCtr="0">
-                          <a:noAutofit/>
-                        </wps:bodyPr>
-                      </wps:wsp>
-                      <wps:wsp>
-                        <wps:cNvPr id="7" name="Text Box 2"/>
-                        <wps:cNvSpPr txBox="1">
-                          <a:spLocks noChangeArrowheads="1"/>
-                        </wps:cNvSpPr>
-                        <wps:spPr bwMode="auto">
-                          <a:xfrm>
-                            <a:off x="4870938" y="2033954"/>
-                            <a:ext cx="603250" cy="274955"/>
-                          </a:xfrm>
-                          <a:prstGeom prst="rect">
-                            <a:avLst/>
-                          </a:prstGeom>
-                          <a:noFill/>
-                          <a:ln w="9525">
-                            <a:noFill/>
-                            <a:miter lim="800000"/>
-                            <a:headEnd/>
-                            <a:tailEnd/>
-                          </a:ln>
-                        </wps:spPr>
-                        <wps:txbx>
-                          <w:txbxContent>
-                            <w:p>
-                              <w:r>
+                                <w:rPr>
+                                  <w:b/>
+                                  <w:bCs/>
+                                </w:rPr>
                                 <w:t>Plotter</w:t>
                               </w:r>
                             </w:p>
@@ -637,21 +769,25 @@
                         </wps:bodyPr>
                       </wps:wsp>
                       <wps:wsp>
-                        <wps:cNvPr id="8" name="Text Box 2"/>
+                        <wps:cNvPr id="20" name="Text Box 2"/>
                         <wps:cNvSpPr txBox="1">
                           <a:spLocks noChangeArrowheads="1"/>
                         </wps:cNvSpPr>
                         <wps:spPr bwMode="auto">
                           <a:xfrm>
-                            <a:off x="1781907" y="52754"/>
-                            <a:ext cx="1118870" cy="274955"/>
+                            <a:off x="2313159" y="1430448"/>
+                            <a:ext cx="715791" cy="278036"/>
                           </a:xfrm>
                           <a:prstGeom prst="rect">
                             <a:avLst/>
                           </a:prstGeom>
-                          <a:noFill/>
+                          <a:solidFill>
+                            <a:schemeClr val="bg1"/>
+                          </a:solidFill>
                           <a:ln w="9525">
-                            <a:noFill/>
+                            <a:solidFill>
+                              <a:schemeClr val="tx1"/>
+                            </a:solidFill>
                             <a:miter lim="800000"/>
                             <a:headEnd/>
                             <a:tailEnd/>
@@ -660,8 +796,18 @@
                         <wps:txbx>
                           <w:txbxContent>
                             <w:p>
+                              <w:pPr>
+                                <w:rPr>
+                                  <w:b/>
+                                  <w:bCs/>
+                                </w:rPr>
+                              </w:pPr>
                               <w:r>
-                                <w:t>Menu bar</w:t>
+                                <w:rPr>
+                                  <w:b/>
+                                  <w:bCs/>
+                                </w:rPr>
+                                <w:t>Canvas</w:t>
                               </w:r>
                             </w:p>
                           </w:txbxContent>
@@ -673,94 +819,211 @@
                     </wpg:wgp>
                   </a:graphicData>
                 </a:graphic>
+                <wp14:sizeRelH relativeFrom="margin">
+                  <wp14:pctWidth>0</wp14:pctWidth>
+                </wp14:sizeRelH>
+                <wp14:sizeRelV relativeFrom="margin">
+                  <wp14:pctHeight>0</wp14:pctHeight>
+                </wp14:sizeRelV>
               </wp:anchor>
             </w:drawing>
           </mc:Choice>
           <mc:Fallback>
             <w:pict>
-              <v:group w14:anchorId="3F7A801F" id="Group 9" o:spid="_x0000_s1026" style="position:absolute;margin-left:11.55pt;margin-top:13.9pt;width:431.15pt;height:184.9pt;z-index:251673600" coordsize="54756,23482" o:gfxdata="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">
-                <v:shapetype id="_x0000_t75" coordsize="21600,21600" o:spt="75" o:preferrelative="t" path="m@4@5l@4@11@9@11@9@5xe" filled="f" stroked="f">
-                  <v:stroke joinstyle="miter"/>
-                  <v:formulas>
-                    <v:f eqn="if lineDrawn pixelLineWidth 0"/>
-                    <v:f eqn="sum @0 1 0"/>
-                    <v:f eqn="sum 0 0 @1"/>
-                    <v:f eqn="prod @2 1 2"/>
-                    <v:f eqn="prod @3 21600 pixelWidth"/>
-                    <v:f eqn="prod @3 21600 pixelHeight"/>
-                    <v:f eqn="sum @0 0 1"/>
-                    <v:f eqn="prod @6 1 2"/>
-                    <v:f eqn="prod @7 21600 pixelWidth"/>
-                    <v:f eqn="sum @8 21600 0"/>
-                    <v:f eqn="prod @7 21600 pixelHeight"/>
-                    <v:f eqn="sum @10 21600 0"/>
-                  </v:formulas>
-                  <v:path o:extrusionok="f" gradientshapeok="t" o:connecttype="rect"/>
-                  <o:lock v:ext="edit" aspectratio="t"/>
-                </v:shapetype>
-                <v:shape id="Picture 1" o:spid="_x0000_s1027" type="#_x0000_t75" style="position:absolute;left:1465;width:53276;height:23482;visibility:visible;mso-wrap-style:square" o:gfxdata="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">
-                  <v:imagedata r:id="rId13" o:title=""/>
-                </v:shape>
-                <v:rect id="Rectangle 2" o:spid="_x0000_s1028" style="position:absolute;left:1480;top:1362;width:53276;height:1055;visibility:visible;mso-wrap-style:square;v-text-anchor:middle" o:gfxdata="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" filled="f" strokecolor="red" strokeweight="2.25pt"/>
-                <v:rect id="Rectangle 3" o:spid="_x0000_s1029" style="position:absolute;left:5055;top:2652;width:28238;height:20442;visibility:visible;mso-wrap-style:square;v-text-anchor:middle" o:gfxdata="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" filled="f" strokecolor="red" strokeweight="2.25pt"/>
-                <v:rect id="Rectangle 4" o:spid="_x0000_s1030" style="position:absolute;left:33835;top:2417;width:20906;height:20676;visibility:visible;mso-wrap-style:square;v-text-anchor:middle" o:gfxdata="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" filled="f" strokecolor="red" strokeweight="2.25pt"/>
-                <v:rect id="Rectangle 5" o:spid="_x0000_s1031" style="position:absolute;left:1480;top:2417;width:3209;height:20676;visibility:visible;mso-wrap-style:square;v-text-anchor:middle" o:gfxdata="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" filled="f" strokecolor="red" strokeweight="2.25pt"/>
-                <v:shapetype id="_x0000_t202" coordsize="21600,21600" o:spt="202" path="m,l,21600r21600,l21600,xe">
-                  <v:stroke joinstyle="miter"/>
-                  <v:path gradientshapeok="t" o:connecttype="rect"/>
-                </v:shapetype>
-                <v:shape id="Text Box 2" o:spid="_x0000_s1032" type="#_x0000_t202" style="position:absolute;top:12426;width:6623;height:2750;visibility:visible;mso-wrap-style:square;v-text-anchor:top" o:gfxdata="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" filled="f" stroked="f">
+              <v:group w14:anchorId="0D34DBB7" id="Group 21" o:spid="_x0000_s1027" style="position:absolute;left:0;text-align:left;margin-left:0;margin-top:-4.9pt;width:468pt;height:203.75pt;z-index:251682816;mso-position-horizontal:center;mso-position-horizontal-relative:margin;mso-width-relative:margin;mso-height-relative:margin" coordsize="59429,25901" o:gfxdata="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">
+                <v:group id="Group 15" o:spid="_x0000_s1028" style="position:absolute;width:59429;height:25901" coordorigin=",22676" coordsize="59429,25907" o:gfxdata="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">
+                  <v:group id="Group 12" o:spid="_x0000_s1029" style="position:absolute;top:22676;width:59429;height:25907" coordorigin=",22677" coordsize="59436,25908" o:gfxdata="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">
+                    <v:shapetype id="_x0000_t75" coordsize="21600,21600" o:spt="75" o:preferrelative="t" path="m@4@5l@4@11@9@11@9@5xe" filled="f" stroked="f">
+                      <v:stroke joinstyle="miter"/>
+                      <v:formulas>
+                        <v:f eqn="if lineDrawn pixelLineWidth 0"/>
+                        <v:f eqn="sum @0 1 0"/>
+                        <v:f eqn="sum 0 0 @1"/>
+                        <v:f eqn="prod @2 1 2"/>
+                        <v:f eqn="prod @3 21600 pixelWidth"/>
+                        <v:f eqn="prod @3 21600 pixelHeight"/>
+                        <v:f eqn="sum @0 0 1"/>
+                        <v:f eqn="prod @6 1 2"/>
+                        <v:f eqn="prod @7 21600 pixelWidth"/>
+                        <v:f eqn="sum @8 21600 0"/>
+                        <v:f eqn="prod @7 21600 pixelHeight"/>
+                        <v:f eqn="sum @10 21600 0"/>
+                      </v:formulas>
+                      <v:path o:extrusionok="f" gradientshapeok="t" o:connecttype="rect"/>
+                      <o:lock v:ext="edit" aspectratio="t"/>
+                    </v:shapetype>
+                    <v:shape id="Picture 11" o:spid="_x0000_s1030" type="#_x0000_t75" style="position:absolute;top:22677;width:59436;height:25908;visibility:visible;mso-wrap-style:square" o:gfxdata="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">
+                      <v:imagedata r:id="rId13" o:title=""/>
+                    </v:shape>
+                    <v:shape id="_x0000_s1031" type="#_x0000_t202" style="position:absolute;left:5854;top:39073;width:6505;height:2781;visibility:visible;mso-wrap-style:square;v-text-anchor:top" o:gfxdata="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" fillcolor="white [3212]" strokecolor="black [3213]">
+                      <v:textbox>
+                        <w:txbxContent>
+                          <w:p>
+                            <w:pPr>
+                              <w:rPr>
+                                <w:b/>
+                                <w:bCs/>
+                              </w:rPr>
+                            </w:pPr>
+                            <w:r>
+                              <w:rPr>
+                                <w:b/>
+                                <w:bCs/>
+                              </w:rPr>
+                              <w:t>Palette</w:t>
+                            </w:r>
+                          </w:p>
+                        </w:txbxContent>
+                      </v:textbox>
+                    </v:shape>
+                  </v:group>
+                  <v:shapetype id="_x0000_t32" coordsize="21600,21600" o:spt="32" o:oned="t" path="m,l21600,21600e" filled="f">
+                    <v:path arrowok="t" fillok="f" o:connecttype="none"/>
+                    <o:lock v:ext="edit" shapetype="t"/>
+                  </v:shapetype>
+                  <v:shape id="Straight Arrow Connector 13" o:spid="_x0000_s1032" type="#_x0000_t32" style="position:absolute;left:1965;top:36549;width:3871;height:3629;flip:x y;visibility:visible;mso-wrap-style:square" o:connectortype="straight" o:gfxdata="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" strokecolor="black [3200]" strokeweight=".5pt">
+                    <v:stroke endarrow="block" joinstyle="miter"/>
+                  </v:shape>
+                </v:group>
+                <v:shape id="_x0000_s1033" type="#_x0000_t202" style="position:absolute;left:12855;top:4255;width:8149;height:2775;visibility:visible;mso-wrap-style:square;v-text-anchor:top" o:gfxdata="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" fillcolor="white [3212]" strokecolor="black [3213]">
                   <v:textbox>
                     <w:txbxContent>
                       <w:p>
+                        <w:pPr>
+                          <w:rPr>
+                            <w:b/>
+                            <w:bCs/>
+                          </w:rPr>
+                        </w:pPr>
                         <w:r>
-                          <w:t>Palette</w:t>
+                          <w:rPr>
+                            <w:b/>
+                            <w:bCs/>
+                          </w:rPr>
+                          <w:t>Menu bar</w:t>
                         </w:r>
                       </w:p>
                     </w:txbxContent>
                   </v:textbox>
                 </v:shape>
-                <v:shape id="Text Box 2" o:spid="_x0000_s1033" type="#_x0000_t202" style="position:absolute;left:25204;top:20339;width:7557;height:2750;visibility:visible;mso-wrap-style:square;v-text-anchor:top" o:gfxdata="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" filled="f" stroked="f">
+                <v:shape id="Straight Arrow Connector 17" o:spid="_x0000_s1034" type="#_x0000_t32" style="position:absolute;left:8962;top:1720;width:3868;height:3626;flip:x y;visibility:visible;mso-wrap-style:square" o:connectortype="straight" o:gfxdata="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" strokecolor="black [3200]" strokeweight=".5pt">
+                  <v:stroke endarrow="block" joinstyle="miter"/>
+                </v:shape>
+                <v:shape id="_x0000_s1035" type="#_x0000_t202" style="position:absolute;left:41464;top:11524;width:6836;height:2780;visibility:visible;mso-wrap-style:square;v-text-anchor:top" o:gfxdata="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" fillcolor="white [3212]" strokecolor="black [3213]">
                   <v:textbox>
                     <w:txbxContent>
                       <w:p>
+                        <w:pPr>
+                          <w:rPr>
+                            <w:b/>
+                            <w:bCs/>
+                          </w:rPr>
+                        </w:pPr>
                         <w:r>
+                          <w:rPr>
+                            <w:b/>
+                            <w:bCs/>
+                          </w:rPr>
+                          <w:t>Plotter</w:t>
+                        </w:r>
+                      </w:p>
+                    </w:txbxContent>
+                  </v:textbox>
+                </v:shape>
+                <v:shape id="_x0000_s1036" type="#_x0000_t202" style="position:absolute;left:23131;top:14304;width:7158;height:2780;visibility:visible;mso-wrap-style:square;v-text-anchor:top" o:gfxdata="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" fillcolor="white [3212]" strokecolor="black [3213]">
+                  <v:textbox>
+                    <w:txbxContent>
+                      <w:p>
+                        <w:pPr>
+                          <w:rPr>
+                            <w:b/>
+                            <w:bCs/>
+                          </w:rPr>
+                        </w:pPr>
+                        <w:r>
+                          <w:rPr>
+                            <w:b/>
+                            <w:bCs/>
+                          </w:rPr>
                           <w:t>Canvas</w:t>
                         </w:r>
                       </w:p>
                     </w:txbxContent>
                   </v:textbox>
                 </v:shape>
-                <v:shape id="Text Box 2" o:spid="_x0000_s1034" type="#_x0000_t202" style="position:absolute;left:48709;top:20339;width:6032;height:2750;visibility:visible;mso-wrap-style:square;v-text-anchor:top" o:gfxdata="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" filled="f" stroked="f">
-                  <v:textbox>
-                    <w:txbxContent>
-                      <w:p>
-                        <w:r>
-                          <w:t>Plotter</w:t>
-                        </w:r>
-                      </w:p>
-                    </w:txbxContent>
-                  </v:textbox>
-                </v:shape>
-                <v:shape id="Text Box 2" o:spid="_x0000_s1035" type="#_x0000_t202" style="position:absolute;left:17819;top:527;width:11188;height:2750;visibility:visible;mso-wrap-style:square;v-text-anchor:top" o:gfxdata="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" filled="f" stroked="f">
-                  <v:textbox>
-                    <w:txbxContent>
-                      <w:p>
-                        <w:r>
-                          <w:t>Menu bar</w:t>
-                        </w:r>
-                      </w:p>
-                    </w:txbxContent>
-                  </v:textbox>
-                </v:shape>
-                <w10:wrap type="topAndBottom"/>
+                <w10:wrap type="topAndBottom" anchorx="margin"/>
+                <w10:anchorlock/>
               </v:group>
             </w:pict>
           </mc:Fallback>
         </mc:AlternateContent>
       </w:r>
-    </w:p>
-    <w:p/>
+      <w:r>
+        <w:rPr>
+          <w:b/>
+          <w:bCs/>
+          <w:i w:val="0"/>
+          <w:iCs w:val="0"/>
+        </w:rPr>
+        <w:t xml:space="preserve">Figure </w:t>
+      </w:r>
+      <w:r>
+        <w:rPr>
+          <w:b/>
+          <w:bCs/>
+          <w:i w:val="0"/>
+          <w:iCs w:val="0"/>
+        </w:rPr>
+        <w:fldChar w:fldCharType="begin"/>
+      </w:r>
+      <w:r>
+        <w:rPr>
+          <w:b/>
+          <w:bCs/>
+          <w:i w:val="0"/>
+          <w:iCs w:val="0"/>
+        </w:rPr>
+        <w:instrText xml:space="preserve"> SEQ Figure \* ARABIC </w:instrText>
+      </w:r>
+      <w:r>
+        <w:rPr>
+          <w:b/>
+          <w:bCs/>
+          <w:i w:val="0"/>
+          <w:iCs w:val="0"/>
+        </w:rPr>
+        <w:fldChar w:fldCharType="separate"/>
+      </w:r>
+      <w:r>
+        <w:rPr>
+          <w:b/>
+          <w:bCs/>
+          <w:i w:val="0"/>
+          <w:iCs w:val="0"/>
+          <w:noProof/>
+        </w:rPr>
+        <w:t>1</w:t>
+      </w:r>
+      <w:r>
+        <w:rPr>
+          <w:b/>
+          <w:bCs/>
+          <w:i w:val="0"/>
+          <w:iCs w:val="0"/>
+        </w:rPr>
+        <w:fldChar w:fldCharType="end"/>
+      </w:r>
+      <w:bookmarkEnd w:id="0"/>
+      <w:r>
+        <w:rPr>
+          <w:b/>
+          <w:bCs/>
+          <w:i w:val="0"/>
+          <w:iCs w:val="0"/>
+        </w:rPr>
+        <w:t xml:space="preserve"> - POD|LCA Material Tool GUI.</w:t>
+      </w:r>
+    </w:p>
     <w:p>
       <w:pPr>
         <w:rPr>
@@ -769,11 +1032,14 @@
         </w:rPr>
       </w:pPr>
       <w:r>
+        <w:t>The graphical user interface (GUI) of the</w:t>
+      </w:r>
+      <w:r>
         <w:rPr>
           <w:sz w:val="20"/>
           <w:szCs w:val="20"/>
         </w:rPr>
-        <w:t xml:space="preserve">The graphical user interface (GUI) of the </w:t>
+        <w:t xml:space="preserve"> </w:t>
       </w:r>
       <w:r>
         <w:t>POD|LCA Material Tool has 4 main components</w:t>
@@ -786,6 +1052,33 @@
       </w:r>
       <w:r>
         <w:t>bar, Palette, Canvas, and Plotter</w:t>
+      </w:r>
+      <w:r>
+        <w:t xml:space="preserve"> (</w:t>
+      </w:r>
+      <w:r>
+        <w:fldChar w:fldCharType="begin"/>
+      </w:r>
+      <w:r>
+        <w:instrText xml:space="preserve"> REF _Ref176776067 \h </w:instrText>
+      </w:r>
+      <w:r>
+        <w:instrText xml:space="preserve"> \* MERGEFORMAT </w:instrText>
+      </w:r>
+      <w:r>
+        <w:fldChar w:fldCharType="separate"/>
+      </w:r>
+      <w:r>
+        <w:t xml:space="preserve">Figure </w:t>
+      </w:r>
+      <w:r>
+        <w:t>1</w:t>
+      </w:r>
+      <w:r>
+        <w:fldChar w:fldCharType="end"/>
+      </w:r>
+      <w:r>
+        <w:t>)</w:t>
       </w:r>
       <w:r>
         <w:t>.</w:t>
@@ -809,10 +1102,10 @@
     </w:p>
     <w:p>
       <w:r>
-        <w:t>The Menu Bar provid</w:t>
-      </w:r>
-      <w:r>
-        <w:t>e</w:t>
+        <w:t xml:space="preserve">The Menu Bar </w:t>
+      </w:r>
+      <w:r>
+        <w:t>provides</w:t>
       </w:r>
       <w:r>
         <w:t xml:space="preserve"> access to key functionalities such as opening and saving files, editing settings, and other tool-specific commands. It</w:t>
@@ -843,7 +1136,13 @@
         <w:t xml:space="preserve">You add </w:t>
       </w:r>
       <w:r>
-        <w:t xml:space="preserve">products and processes from the palette and place it on the </w:t>
+        <w:t xml:space="preserve">products and processes from the palette and place </w:t>
+      </w:r>
+      <w:r>
+        <w:t>them</w:t>
+      </w:r>
+      <w:r>
+        <w:t xml:space="preserve"> on the </w:t>
       </w:r>
       <w:r>
         <w:t>C</w:t>
@@ -889,7 +1188,13 @@
         <w:t xml:space="preserve">. </w:t>
       </w:r>
       <w:r>
-        <w:t>Clicking the corresponding item on the Palette will create the corresponding item and place it on the</w:t>
+        <w:t xml:space="preserve">Clicking the corresponding item on the Palette will create </w:t>
+      </w:r>
+      <w:r>
+        <w:t>it</w:t>
+      </w:r>
+      <w:r>
+        <w:t xml:space="preserve"> and place it on the</w:t>
       </w:r>
       <w:r>
         <w:t xml:space="preserve"> Canvas. </w:t>
@@ -911,7 +1216,13 @@
         <w:t>the environmental impacts in bar charts</w:t>
       </w:r>
       <w:r>
-        <w:t xml:space="preserve"> updating in real-time</w:t>
+        <w:t xml:space="preserve"> </w:t>
+      </w:r>
+      <w:r>
+        <w:t>updated</w:t>
+      </w:r>
+      <w:r>
+        <w:t xml:space="preserve"> in real-time</w:t>
       </w:r>
       <w:r>
         <w:t>. It</w:t>
@@ -920,7 +1231,13 @@
         <w:t xml:space="preserve"> i</w:t>
       </w:r>
       <w:r>
-        <w:t>s tightly integrated with the Canvas, allowing you to update plots dynamically as data changes</w:t>
+        <w:t xml:space="preserve">s tightly integrated with the Canvas, allowing you to update plots dynamically as </w:t>
+      </w:r>
+      <w:r>
+        <w:t>inputs</w:t>
+      </w:r>
+      <w:r>
+        <w:t xml:space="preserve"> change</w:t>
       </w:r>
       <w:r>
         <w:t xml:space="preserve"> on the Canvas</w:t>
@@ -934,15 +1251,158 @@
         <w:pStyle w:val="Heading2"/>
       </w:pPr>
       <w:r>
+        <w:rPr>
+          <w:noProof/>
+        </w:rPr>
+        <mc:AlternateContent>
+          <mc:Choice Requires="wps">
+            <w:drawing>
+              <wp:anchor distT="45720" distB="45720" distL="114300" distR="114300" simplePos="0" relativeHeight="251684864" behindDoc="0" locked="0" layoutInCell="1" allowOverlap="1" wp14:anchorId="6163452A" wp14:editId="555BF142">
+                <wp:simplePos x="0" y="0"/>
+                <wp:positionH relativeFrom="column">
+                  <wp:posOffset>0</wp:posOffset>
+                </wp:positionH>
+                <wp:positionV relativeFrom="paragraph">
+                  <wp:posOffset>338455</wp:posOffset>
+                </wp:positionV>
+                <wp:extent cx="5471160" cy="309880"/>
+                <wp:effectExtent l="19050" t="19050" r="15240" b="13970"/>
+                <wp:wrapTopAndBottom/>
+                <wp:docPr id="22" name="Text Box 2"/>
+                <wp:cNvGraphicFramePr>
+                  <a:graphicFrameLocks xmlns:a="http://schemas.openxmlformats.org/drawingml/2006/main"/>
+                </wp:cNvGraphicFramePr>
+                <a:graphic xmlns:a="http://schemas.openxmlformats.org/drawingml/2006/main">
+                  <a:graphicData uri="http://schemas.microsoft.com/office/word/2010/wordprocessingShape">
+                    <wps:wsp>
+                      <wps:cNvSpPr txBox="1">
+                        <a:spLocks noChangeArrowheads="1"/>
+                      </wps:cNvSpPr>
+                      <wps:spPr bwMode="auto">
+                        <a:xfrm>
+                          <a:off x="0" y="0"/>
+                          <a:ext cx="5471160" cy="309880"/>
+                        </a:xfrm>
+                        <a:prstGeom prst="rect">
+                          <a:avLst/>
+                        </a:prstGeom>
+                        <a:solidFill>
+                          <a:srgbClr val="FFFFFF"/>
+                        </a:solidFill>
+                        <a:ln w="28575">
+                          <a:solidFill>
+                            <a:srgbClr val="7030A0"/>
+                          </a:solidFill>
+                          <a:miter lim="800000"/>
+                          <a:headEnd/>
+                          <a:tailEnd/>
+                        </a:ln>
+                      </wps:spPr>
+                      <wps:txbx>
+                        <w:txbxContent>
+                          <w:p>
+                            <w:r>
+                              <w:t xml:space="preserve">(TBD): </w:t>
+                            </w:r>
+                            <w:r>
+                              <w:t xml:space="preserve">Issue #18: </w:t>
+                            </w:r>
+                            <w:r>
+                              <w:t>New project wizard</w:t>
+                            </w:r>
+                            <w:r>
+                              <w:t>.</w:t>
+                            </w:r>
+                          </w:p>
+                        </w:txbxContent>
+                      </wps:txbx>
+                      <wps:bodyPr rot="0" vert="horz" wrap="square" lIns="91440" tIns="45720" rIns="91440" bIns="45720" anchor="t" anchorCtr="0">
+                        <a:noAutofit/>
+                      </wps:bodyPr>
+                    </wps:wsp>
+                  </a:graphicData>
+                </a:graphic>
+                <wp14:sizeRelH relativeFrom="margin">
+                  <wp14:pctWidth>0</wp14:pctWidth>
+                </wp14:sizeRelH>
+                <wp14:sizeRelV relativeFrom="margin">
+                  <wp14:pctHeight>0</wp14:pctHeight>
+                </wp14:sizeRelV>
+              </wp:anchor>
+            </w:drawing>
+          </mc:Choice>
+          <mc:Fallback>
+            <w:pict>
+              <v:shape w14:anchorId="6163452A" id="_x0000_s1037" type="#_x0000_t202" style="position:absolute;left:0;text-align:left;margin-left:0;margin-top:26.65pt;width:430.8pt;height:24.4pt;z-index:251684864;visibility:visible;mso-wrap-style:square;mso-width-percent:0;mso-height-percent:0;mso-wrap-distance-left:9pt;mso-wrap-distance-top:3.6pt;mso-wrap-distance-right:9pt;mso-wrap-distance-bottom:3.6pt;mso-position-horizontal:absolute;mso-position-horizontal-relative:text;mso-position-vertical:absolute;mso-position-vertical-relative:text;mso-width-percent:0;mso-height-percent:0;mso-width-relative:margin;mso-height-relative:margin;v-text-anchor:top" o:gfxdata="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" strokecolor="#7030a0" strokeweight="2.25pt">
+                <v:textbox>
+                  <w:txbxContent>
+                    <w:p>
+                      <w:r>
+                        <w:t xml:space="preserve">(TBD): </w:t>
+                      </w:r>
+                      <w:r>
+                        <w:t xml:space="preserve">Issue #18: </w:t>
+                      </w:r>
+                      <w:r>
+                        <w:t>New project wizard</w:t>
+                      </w:r>
+                      <w:r>
+                        <w:t>.</w:t>
+                      </w:r>
+                    </w:p>
+                  </w:txbxContent>
+                </v:textbox>
+                <w10:wrap type="topAndBottom"/>
+              </v:shape>
+            </w:pict>
+          </mc:Fallback>
+        </mc:AlternateContent>
+      </w:r>
+      <w:r>
         <w:t>Create New Project</w:t>
       </w:r>
     </w:p>
     <w:p>
       <w:r>
         <w:rPr>
-          <w:highlight w:val="yellow"/>
-        </w:rPr>
-        <w:t>Not yet implemented. Opening the program directly opens the GUI, without a start-up wizard</w:t>
+          <w:rFonts w:ascii="Courier New" w:hAnsi="Courier New" w:cs="Courier New"/>
+          <w:highlight w:val="lightGray"/>
+        </w:rPr>
+        <w:t>File &gt; New</w:t>
+      </w:r>
+      <w:r>
+        <w:t xml:space="preserve"> will clear the current canvas and all background data (except for the impacts database).</w:t>
+      </w:r>
+    </w:p>
+    <w:p>
+      <w:r>
+        <w:rPr>
+          <w:rFonts w:ascii="Courier New" w:hAnsi="Courier New" w:cs="Courier New"/>
+          <w:highlight w:val="lightGray"/>
+        </w:rPr>
+        <w:t xml:space="preserve">File &gt; </w:t>
+      </w:r>
+      <w:r>
+        <w:rPr>
+          <w:rFonts w:ascii="Courier New" w:hAnsi="Courier New" w:cs="Courier New"/>
+          <w:highlight w:val="lightGray"/>
+        </w:rPr>
+        <w:t>Open</w:t>
+      </w:r>
+      <w:r>
+        <w:rPr>
+          <w:rFonts w:ascii="Courier New" w:hAnsi="Courier New" w:cs="Courier New"/>
+        </w:rPr>
+        <w:t xml:space="preserve"> </w:t>
+      </w:r>
+      <w:r>
+        <w:t xml:space="preserve">will </w:t>
+      </w:r>
+      <w:r>
+        <w:t>let you open saved projects (along with the impact databases attached to the project).</w:t>
+      </w:r>
+      <w:r>
+        <w:t xml:space="preserve"> </w:t>
       </w:r>
     </w:p>
     <w:p>
@@ -954,14 +1414,2574 @@
       </w:r>
     </w:p>
     <w:p>
+      <w:r>
+        <w:rPr>
+          <w:highlight w:val="lightGray"/>
+        </w:rPr>
+        <mc:AlternateContent>
+          <mc:Choice Requires="wps">
+            <w:drawing>
+              <wp:anchor distT="45720" distB="45720" distL="114300" distR="114300" simplePos="0" relativeHeight="251699200" behindDoc="0" locked="0" layoutInCell="1" allowOverlap="1" wp14:anchorId="5971583E" wp14:editId="0D4465E7">
+                <wp:simplePos x="0" y="0"/>
+                <wp:positionH relativeFrom="column">
+                  <wp:posOffset>0</wp:posOffset>
+                </wp:positionH>
+                <wp:positionV relativeFrom="paragraph">
+                  <wp:posOffset>1149350</wp:posOffset>
+                </wp:positionV>
+                <wp:extent cx="5471160" cy="438150"/>
+                <wp:effectExtent l="19050" t="19050" r="15240" b="19050"/>
+                <wp:wrapTopAndBottom/>
+                <wp:docPr id="31" name="Text Box 2"/>
+                <wp:cNvGraphicFramePr>
+                  <a:graphicFrameLocks xmlns:a="http://schemas.openxmlformats.org/drawingml/2006/main"/>
+                </wp:cNvGraphicFramePr>
+                <a:graphic xmlns:a="http://schemas.openxmlformats.org/drawingml/2006/main">
+                  <a:graphicData uri="http://schemas.microsoft.com/office/word/2010/wordprocessingShape">
+                    <wps:wsp>
+                      <wps:cNvSpPr txBox="1">
+                        <a:spLocks noChangeArrowheads="1"/>
+                      </wps:cNvSpPr>
+                      <wps:spPr bwMode="auto">
+                        <a:xfrm>
+                          <a:off x="0" y="0"/>
+                          <a:ext cx="5471160" cy="438150"/>
+                        </a:xfrm>
+                        <a:prstGeom prst="rect">
+                          <a:avLst/>
+                        </a:prstGeom>
+                        <a:solidFill>
+                          <a:srgbClr val="FFFFFF"/>
+                        </a:solidFill>
+                        <a:ln w="28575">
+                          <a:solidFill>
+                            <a:srgbClr val="7030A0"/>
+                          </a:solidFill>
+                          <a:miter lim="800000"/>
+                          <a:headEnd/>
+                          <a:tailEnd/>
+                        </a:ln>
+                      </wps:spPr>
+                      <wps:txbx>
+                        <w:txbxContent>
+                          <w:p>
+                            <w:r>
+                              <w:t xml:space="preserve">(TBD): </w:t>
+                            </w:r>
+                            <w:r>
+                              <w:t>Issue #4: Custom impact addition and more flexibility with importing data base from files</w:t>
+                            </w:r>
+                            <w:r>
+                              <w:t>.</w:t>
+                            </w:r>
+                          </w:p>
+                        </w:txbxContent>
+                      </wps:txbx>
+                      <wps:bodyPr rot="0" vert="horz" wrap="square" lIns="91440" tIns="45720" rIns="91440" bIns="45720" anchor="t" anchorCtr="0">
+                        <a:noAutofit/>
+                      </wps:bodyPr>
+                    </wps:wsp>
+                  </a:graphicData>
+                </a:graphic>
+                <wp14:sizeRelH relativeFrom="margin">
+                  <wp14:pctWidth>0</wp14:pctWidth>
+                </wp14:sizeRelH>
+                <wp14:sizeRelV relativeFrom="margin">
+                  <wp14:pctHeight>0</wp14:pctHeight>
+                </wp14:sizeRelV>
+              </wp:anchor>
+            </w:drawing>
+          </mc:Choice>
+          <mc:Fallback>
+            <w:pict>
+              <v:shape w14:anchorId="5971583E" id="_x0000_s1038" type="#_x0000_t202" style="position:absolute;margin-left:0;margin-top:90.5pt;width:430.8pt;height:34.5pt;z-index:251699200;visibility:visible;mso-wrap-style:square;mso-width-percent:0;mso-height-percent:0;mso-wrap-distance-left:9pt;mso-wrap-distance-top:3.6pt;mso-wrap-distance-right:9pt;mso-wrap-distance-bottom:3.6pt;mso-position-horizontal:absolute;mso-position-horizontal-relative:text;mso-position-vertical:absolute;mso-position-vertical-relative:text;mso-width-percent:0;mso-height-percent:0;mso-width-relative:margin;mso-height-relative:margin;v-text-anchor:top" o:gfxdata="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" strokecolor="#7030a0" strokeweight="2.25pt">
+                <v:textbox>
+                  <w:txbxContent>
+                    <w:p>
+                      <w:r>
+                        <w:t xml:space="preserve">(TBD): </w:t>
+                      </w:r>
+                      <w:r>
+                        <w:t>Issue #4: Custom impact addition and more flexibility with importing data base from files</w:t>
+                      </w:r>
+                      <w:r>
+                        <w:t>.</w:t>
+                      </w:r>
+                    </w:p>
+                  </w:txbxContent>
+                </v:textbox>
+                <w10:wrap type="topAndBottom"/>
+              </v:shape>
+            </w:pict>
+          </mc:Fallback>
+        </mc:AlternateContent>
+      </w:r>
+      <w:r>
+        <w:rPr>
+          <w:highlight w:val="lightGray"/>
+        </w:rPr>
+        <mc:AlternateContent>
+          <mc:Choice Requires="wps">
+            <w:drawing>
+              <wp:anchor distT="45720" distB="45720" distL="114300" distR="114300" simplePos="0" relativeHeight="251697152" behindDoc="0" locked="0" layoutInCell="1" allowOverlap="1" wp14:anchorId="295DD7DA" wp14:editId="1406077E">
+                <wp:simplePos x="0" y="0"/>
+                <wp:positionH relativeFrom="column">
+                  <wp:posOffset>0</wp:posOffset>
+                </wp:positionH>
+                <wp:positionV relativeFrom="paragraph">
+                  <wp:posOffset>273050</wp:posOffset>
+                </wp:positionV>
+                <wp:extent cx="5471160" cy="787400"/>
+                <wp:effectExtent l="19050" t="19050" r="15240" b="12700"/>
+                <wp:wrapTopAndBottom/>
+                <wp:docPr id="30" name="Text Box 2"/>
+                <wp:cNvGraphicFramePr>
+                  <a:graphicFrameLocks xmlns:a="http://schemas.openxmlformats.org/drawingml/2006/main"/>
+                </wp:cNvGraphicFramePr>
+                <a:graphic xmlns:a="http://schemas.openxmlformats.org/drawingml/2006/main">
+                  <a:graphicData uri="http://schemas.microsoft.com/office/word/2010/wordprocessingShape">
+                    <wps:wsp>
+                      <wps:cNvSpPr txBox="1">
+                        <a:spLocks noChangeArrowheads="1"/>
+                      </wps:cNvSpPr>
+                      <wps:spPr bwMode="auto">
+                        <a:xfrm>
+                          <a:off x="0" y="0"/>
+                          <a:ext cx="5471160" cy="787400"/>
+                        </a:xfrm>
+                        <a:prstGeom prst="rect">
+                          <a:avLst/>
+                        </a:prstGeom>
+                        <a:solidFill>
+                          <a:srgbClr val="FFFFFF"/>
+                        </a:solidFill>
+                        <a:ln w="28575">
+                          <a:solidFill>
+                            <a:srgbClr val="FF0000"/>
+                          </a:solidFill>
+                          <a:miter lim="800000"/>
+                          <a:headEnd/>
+                          <a:tailEnd/>
+                        </a:ln>
+                      </wps:spPr>
+                      <wps:txbx>
+                        <w:txbxContent>
+                          <w:p>
+                            <w:r>
+                              <w:t xml:space="preserve">(WARNING): </w:t>
+                            </w:r>
+                            <w:r>
+                              <w:t xml:space="preserve">The imported file needs to be </w:t>
+                            </w:r>
+                            <w:r>
+                              <w:rPr>
+                                <w:rFonts w:ascii="Courier New" w:hAnsi="Courier New" w:cs="Courier New"/>
+                              </w:rPr>
+                              <w:t>*.CSV</w:t>
+                            </w:r>
+                            <w:r>
+                              <w:t xml:space="preserve"> with columns in the following order: flow, units, GWP (in </w:t>
+                            </w:r>
+                            <w:r>
+                              <w:t>kg CO2 eq</w:t>
+                            </w:r>
+                            <w:r>
+                              <w:t xml:space="preserve">), </w:t>
+                            </w:r>
+                            <w:r>
+                              <w:t>Acidification potential (kg SO2 eq)</w:t>
+                            </w:r>
+                            <w:r>
+                              <w:t xml:space="preserve">, </w:t>
+                            </w:r>
+                            <w:r>
+                              <w:t>Eutrophication potential (kg N eq)</w:t>
+                            </w:r>
+                            <w:r>
+                              <w:t xml:space="preserve">, </w:t>
+                            </w:r>
+                            <w:r>
+                              <w:t>Ozone depletion potential (kg CFC-11 eq)</w:t>
+                            </w:r>
+                            <w:r>
+                              <w:t xml:space="preserve">, </w:t>
+                            </w:r>
+                            <w:r>
+                              <w:t>Smog potential (kg O3 eq)</w:t>
+                            </w:r>
+                            <w:r>
+                              <w:t>.</w:t>
+                            </w:r>
+                          </w:p>
+                        </w:txbxContent>
+                      </wps:txbx>
+                      <wps:bodyPr rot="0" vert="horz" wrap="square" lIns="91440" tIns="45720" rIns="91440" bIns="45720" anchor="t" anchorCtr="0">
+                        <a:noAutofit/>
+                      </wps:bodyPr>
+                    </wps:wsp>
+                  </a:graphicData>
+                </a:graphic>
+                <wp14:sizeRelH relativeFrom="margin">
+                  <wp14:pctWidth>0</wp14:pctWidth>
+                </wp14:sizeRelH>
+                <wp14:sizeRelV relativeFrom="margin">
+                  <wp14:pctHeight>0</wp14:pctHeight>
+                </wp14:sizeRelV>
+              </wp:anchor>
+            </w:drawing>
+          </mc:Choice>
+          <mc:Fallback>
+            <w:pict>
+              <v:shape w14:anchorId="295DD7DA" id="_x0000_s1039" type="#_x0000_t202" style="position:absolute;margin-left:0;margin-top:21.5pt;width:430.8pt;height:62pt;z-index:251697152;visibility:visible;mso-wrap-style:square;mso-width-percent:0;mso-height-percent:0;mso-wrap-distance-left:9pt;mso-wrap-distance-top:3.6pt;mso-wrap-distance-right:9pt;mso-wrap-distance-bottom:3.6pt;mso-position-horizontal:absolute;mso-position-horizontal-relative:text;mso-position-vertical:absolute;mso-position-vertical-relative:text;mso-width-percent:0;mso-height-percent:0;mso-width-relative:margin;mso-height-relative:margin;v-text-anchor:top" o:gfxdata="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" strokecolor="red" strokeweight="2.25pt">
+                <v:textbox>
+                  <w:txbxContent>
+                    <w:p>
+                      <w:r>
+                        <w:t xml:space="preserve">(WARNING): </w:t>
+                      </w:r>
+                      <w:r>
+                        <w:t xml:space="preserve">The imported file needs to be </w:t>
+                      </w:r>
+                      <w:r>
+                        <w:rPr>
+                          <w:rFonts w:ascii="Courier New" w:hAnsi="Courier New" w:cs="Courier New"/>
+                        </w:rPr>
+                        <w:t>*.CSV</w:t>
+                      </w:r>
+                      <w:r>
+                        <w:t xml:space="preserve"> with columns in the following order: flow, units, GWP (in </w:t>
+                      </w:r>
+                      <w:r>
+                        <w:t>kg CO2 eq</w:t>
+                      </w:r>
+                      <w:r>
+                        <w:t xml:space="preserve">), </w:t>
+                      </w:r>
+                      <w:r>
+                        <w:t>Acidification potential (kg SO2 eq)</w:t>
+                      </w:r>
+                      <w:r>
+                        <w:t xml:space="preserve">, </w:t>
+                      </w:r>
+                      <w:r>
+                        <w:t>Eutrophication potential (kg N eq)</w:t>
+                      </w:r>
+                      <w:r>
+                        <w:t xml:space="preserve">, </w:t>
+                      </w:r>
+                      <w:r>
+                        <w:t>Ozone depletion potential (kg CFC-11 eq)</w:t>
+                      </w:r>
+                      <w:r>
+                        <w:t xml:space="preserve">, </w:t>
+                      </w:r>
+                      <w:r>
+                        <w:t>Smog potential (kg O3 eq)</w:t>
+                      </w:r>
+                      <w:r>
+                        <w:t>.</w:t>
+                      </w:r>
+                    </w:p>
+                  </w:txbxContent>
+                </v:textbox>
+                <w10:wrap type="topAndBottom"/>
+              </v:shape>
+            </w:pict>
+          </mc:Fallback>
+        </mc:AlternateContent>
+      </w:r>
+      <w:r>
+        <w:rPr>
+          <w:rFonts w:ascii="Courier New" w:hAnsi="Courier New" w:cs="Courier New"/>
+          <w:highlight w:val="lightGray"/>
+        </w:rPr>
+        <w:t>Database &gt; Import</w:t>
+      </w:r>
+      <w:r>
+        <w:t xml:space="preserve"> prompts you to import database from file</w:t>
+      </w:r>
+      <w:r>
+        <w:t>.</w:t>
+      </w:r>
+    </w:p>
+    <w:p/>
+    <w:p>
+      <w:pPr>
+        <w:pStyle w:val="Heading2"/>
+      </w:pPr>
+      <w:r>
+        <w:lastRenderedPageBreak/>
+        <w:t>Navigating the Canvas</w:t>
+      </w:r>
+    </w:p>
+    <w:p>
+      <w:r>
+        <w:t xml:space="preserve">Hold </w:t>
+      </w:r>
+      <w:r>
+        <w:rPr>
+          <w:rFonts w:ascii="Courier New" w:hAnsi="Courier New" w:cs="Courier New"/>
+          <w:highlight w:val="lightGray"/>
+        </w:rPr>
+        <w:t>R</w:t>
+      </w:r>
+      <w:r>
+        <w:rPr>
+          <w:rFonts w:ascii="Courier New" w:hAnsi="Courier New" w:cs="Courier New"/>
+          <w:highlight w:val="lightGray"/>
+        </w:rPr>
+        <w:t>ight Mouse Button</w:t>
+      </w:r>
+      <w:r>
+        <w:rPr>
+          <w:rFonts w:ascii="Courier New" w:hAnsi="Courier New" w:cs="Courier New"/>
+        </w:rPr>
+        <w:t xml:space="preserve"> </w:t>
+      </w:r>
+      <w:r>
+        <w:t>and Drag</w:t>
+      </w:r>
+      <w:r>
+        <w:t>: Pan</w:t>
+      </w:r>
+    </w:p>
+    <w:p>
+      <w:r>
+        <w:rPr>
+          <w:rFonts w:ascii="Courier New" w:hAnsi="Courier New" w:cs="Courier New"/>
+          <w:highlight w:val="lightGray"/>
+        </w:rPr>
+        <w:t>Mouse Scroll Wheel</w:t>
+      </w:r>
+      <w:r>
+        <w:rPr>
+          <w:highlight w:val="lightGray"/>
+        </w:rPr>
+        <w:t>:</w:t>
+      </w:r>
+      <w:r>
+        <w:t xml:space="preserve"> Zoom out/in</w:t>
+      </w:r>
+    </w:p>
+    <w:p>
+      <w:r>
+        <w:rPr>
+          <w:rFonts w:ascii="Courier New" w:hAnsi="Courier New" w:cs="Courier New"/>
+          <w:highlight w:val="lightGray"/>
+        </w:rPr>
+        <w:t>Ctrl+</w:t>
+      </w:r>
+      <w:r>
+        <w:rPr>
+          <w:highlight w:val="lightGray"/>
+        </w:rPr>
+        <w:t xml:space="preserve"> / </w:t>
+      </w:r>
+      <w:r>
+        <w:rPr>
+          <w:rFonts w:ascii="Courier New" w:hAnsi="Courier New" w:cs="Courier New"/>
+          <w:highlight w:val="lightGray"/>
+        </w:rPr>
+        <w:t>Ctrl-:</w:t>
+      </w:r>
+      <w:r>
+        <w:rPr>
+          <w:rFonts w:ascii="Courier New" w:hAnsi="Courier New" w:cs="Courier New"/>
+        </w:rPr>
+        <w:t xml:space="preserve"> </w:t>
+      </w:r>
+      <w:r>
+        <w:t>Zoom out/in</w:t>
+      </w:r>
+    </w:p>
+    <w:p>
+      <w:r>
+        <w:rPr>
+          <w:rFonts w:ascii="Courier New" w:hAnsi="Courier New" w:cs="Courier New"/>
+          <w:highlight w:val="lightGray"/>
+        </w:rPr>
+        <w:t xml:space="preserve">Edit &gt; </w:t>
+      </w:r>
+      <w:r>
+        <w:rPr>
+          <w:rFonts w:ascii="Courier New" w:hAnsi="Courier New" w:cs="Courier New"/>
+          <w:highlight w:val="lightGray"/>
+        </w:rPr>
+        <w:t>Canvas</w:t>
+      </w:r>
+      <w:r>
+        <w:rPr>
+          <w:rFonts w:ascii="Courier New" w:hAnsi="Courier New" w:cs="Courier New"/>
+          <w:highlight w:val="lightGray"/>
+        </w:rPr>
+        <w:t xml:space="preserve"> Settings</w:t>
+      </w:r>
+      <w:r>
+        <w:t xml:space="preserve"> allows you to change canvas settings including background color, </w:t>
+      </w:r>
+      <w:r>
+        <w:t xml:space="preserve">and </w:t>
+      </w:r>
+      <w:r>
+        <w:t>grid properties.</w:t>
+      </w:r>
+    </w:p>
+    <w:p>
+      <w:pPr>
+        <w:pStyle w:val="Heading2"/>
+      </w:pPr>
+      <w:r>
+        <w:t>Building the Process Flow</w:t>
+      </w:r>
+    </w:p>
+    <w:p>
+      <w:pPr>
+        <w:pStyle w:val="Heading3"/>
+      </w:pPr>
+      <w:r>
+        <w:t>Add item</w:t>
+      </w:r>
+    </w:p>
+    <w:p>
+      <w:r>
+        <w:t xml:space="preserve">Select </w:t>
+      </w:r>
+      <w:r>
+        <w:t>items</w:t>
+      </w:r>
+      <w:r>
+        <w:t xml:space="preserve"> from the palette to add them to the Canvas. A prompt will appear to provide details on the item added</w:t>
+      </w:r>
+      <w:r>
+        <w:t xml:space="preserve"> (e.g., </w:t>
+      </w:r>
+      <w:r>
+        <w:fldChar w:fldCharType="begin"/>
+      </w:r>
+      <w:r>
+        <w:instrText xml:space="preserve"> REF _Ref176776134 \h </w:instrText>
+      </w:r>
+      <w:r>
+        <w:instrText xml:space="preserve"> \* MERGEFORMAT </w:instrText>
+      </w:r>
+      <w:r>
+        <w:fldChar w:fldCharType="separate"/>
+      </w:r>
+      <w:r>
+        <w:t xml:space="preserve">Figure </w:t>
+      </w:r>
+      <w:r>
+        <w:t>2</w:t>
+      </w:r>
+      <w:r>
+        <w:fldChar w:fldCharType="end"/>
+      </w:r>
+      <w:r>
+        <w:t>)</w:t>
+      </w:r>
+      <w:r>
+        <w:t>. These details are initial settings and can be changed</w:t>
+      </w:r>
+      <w:r>
+        <w:t xml:space="preserve"> later</w:t>
+      </w:r>
+      <w:r>
+        <w:t>.</w:t>
+      </w:r>
+      <w:r>
+        <w:t xml:space="preserve"> Once pressed </w:t>
+      </w:r>
+      <w:r>
+        <w:rPr>
+          <w:rFonts w:ascii="Courier New" w:hAnsi="Courier New" w:cs="Courier New"/>
+        </w:rPr>
+        <w:t>OK</w:t>
+      </w:r>
+      <w:r>
+        <w:t>, the item will appear on the canvas (</w:t>
+      </w:r>
+      <w:r>
+        <w:fldChar w:fldCharType="begin"/>
+      </w:r>
+      <w:r>
+        <w:instrText xml:space="preserve"> REF _Ref176776756 \h </w:instrText>
+      </w:r>
+      <w:r>
+        <w:instrText xml:space="preserve"> \* MERGEFORMAT </w:instrText>
+      </w:r>
+      <w:r>
+        <w:fldChar w:fldCharType="separate"/>
+      </w:r>
+      <w:r>
+        <w:t xml:space="preserve">Figure </w:t>
+      </w:r>
+      <w:r>
+        <w:t>3</w:t>
+      </w:r>
+      <w:r>
+        <w:fldChar w:fldCharType="end"/>
+      </w:r>
+      <w:r>
+        <w:t>).</w:t>
+      </w:r>
+    </w:p>
+    <w:p>
+      <w:pPr>
+        <w:pStyle w:val="Caption"/>
+        <w:spacing w:before="240" w:beforeAutospacing="0" w:line="276" w:lineRule="auto"/>
+        <w:jc w:val="center"/>
+        <w:rPr>
+          <w:b/>
+          <w:bCs/>
+          <w:i w:val="0"/>
+          <w:iCs w:val="0"/>
+        </w:rPr>
+      </w:pPr>
+      <w:bookmarkStart w:id="1" w:name="_Ref176776134"/>
+      <w:r>
+        <w:rPr>
+          <w:noProof/>
+        </w:rPr>
+        <w:drawing>
+          <wp:anchor distT="0" distB="0" distL="114300" distR="114300" simplePos="0" relativeHeight="251700224" behindDoc="0" locked="1" layoutInCell="1" allowOverlap="1" wp14:anchorId="55502972" wp14:editId="62ED2E0D">
+            <wp:simplePos x="0" y="0"/>
+            <wp:positionH relativeFrom="margin">
+              <wp:posOffset>2221487</wp:posOffset>
+            </wp:positionH>
+            <wp:positionV relativeFrom="paragraph">
+              <wp:posOffset>-68732</wp:posOffset>
+            </wp:positionV>
+            <wp:extent cx="1499616" cy="1280160"/>
+            <wp:effectExtent l="0" t="0" r="5715" b="0"/>
+            <wp:wrapTopAndBottom/>
+            <wp:docPr id="32" name="Picture 32"/>
+            <wp:cNvGraphicFramePr>
+              <a:graphicFrameLocks xmlns:a="http://schemas.openxmlformats.org/drawingml/2006/main" noChangeAspect="1"/>
+            </wp:cNvGraphicFramePr>
+            <a:graphic xmlns:a="http://schemas.openxmlformats.org/drawingml/2006/main">
+              <a:graphicData uri="http://schemas.openxmlformats.org/drawingml/2006/picture">
+                <pic:pic xmlns:pic="http://schemas.openxmlformats.org/drawingml/2006/picture">
+                  <pic:nvPicPr>
+                    <pic:cNvPr id="32" name="Picture 32"/>
+                    <pic:cNvPicPr/>
+                  </pic:nvPicPr>
+                  <pic:blipFill rotWithShape="1">
+                    <a:blip r:embed="rId14">
+                      <a:extLst>
+                        <a:ext uri="{28A0092B-C50C-407E-A947-70E740481C1C}">
+                          <a14:useLocalDpi xmlns:a14="http://schemas.microsoft.com/office/drawing/2010/main" val="0"/>
+                        </a:ext>
+                      </a:extLst>
+                    </a:blip>
+                    <a:srcRect l="1084"/>
+                    <a:stretch/>
+                  </pic:blipFill>
+                  <pic:spPr bwMode="auto">
+                    <a:xfrm>
+                      <a:off x="0" y="0"/>
+                      <a:ext cx="1499616" cy="1280160"/>
+                    </a:xfrm>
+                    <a:prstGeom prst="rect">
+                      <a:avLst/>
+                    </a:prstGeom>
+                    <a:ln>
+                      <a:noFill/>
+                    </a:ln>
+                    <a:extLst>
+                      <a:ext uri="{53640926-AAD7-44D8-BBD7-CCE9431645EC}">
+                        <a14:shadowObscured xmlns:a14="http://schemas.microsoft.com/office/drawing/2010/main"/>
+                      </a:ext>
+                    </a:extLst>
+                  </pic:spPr>
+                </pic:pic>
+              </a:graphicData>
+            </a:graphic>
+            <wp14:sizeRelH relativeFrom="page">
+              <wp14:pctWidth>0</wp14:pctWidth>
+            </wp14:sizeRelH>
+            <wp14:sizeRelV relativeFrom="page">
+              <wp14:pctHeight>0</wp14:pctHeight>
+            </wp14:sizeRelV>
+          </wp:anchor>
+        </w:drawing>
+      </w:r>
+      <w:r>
+        <w:rPr>
+          <w:b/>
+          <w:bCs/>
+          <w:i w:val="0"/>
+          <w:iCs w:val="0"/>
+        </w:rPr>
+        <w:t xml:space="preserve">Figure </w:t>
+      </w:r>
+      <w:r>
+        <w:rPr>
+          <w:b/>
+          <w:bCs/>
+          <w:i w:val="0"/>
+          <w:iCs w:val="0"/>
+        </w:rPr>
+        <w:fldChar w:fldCharType="begin"/>
+      </w:r>
+      <w:r>
+        <w:rPr>
+          <w:b/>
+          <w:bCs/>
+          <w:i w:val="0"/>
+          <w:iCs w:val="0"/>
+        </w:rPr>
+        <w:instrText xml:space="preserve"> SEQ Figure \* ARABIC </w:instrText>
+      </w:r>
+      <w:r>
+        <w:rPr>
+          <w:b/>
+          <w:bCs/>
+          <w:i w:val="0"/>
+          <w:iCs w:val="0"/>
+        </w:rPr>
+        <w:fldChar w:fldCharType="separate"/>
+      </w:r>
+      <w:r>
+        <w:rPr>
+          <w:b/>
+          <w:bCs/>
+          <w:i w:val="0"/>
+          <w:iCs w:val="0"/>
+          <w:noProof/>
+        </w:rPr>
+        <w:t>2</w:t>
+      </w:r>
+      <w:r>
+        <w:rPr>
+          <w:b/>
+          <w:bCs/>
+          <w:i w:val="0"/>
+          <w:iCs w:val="0"/>
+        </w:rPr>
+        <w:fldChar w:fldCharType="end"/>
+      </w:r>
+      <w:bookmarkEnd w:id="1"/>
+      <w:r>
+        <w:rPr>
+          <w:b/>
+          <w:bCs/>
+          <w:i w:val="0"/>
+          <w:iCs w:val="0"/>
+        </w:rPr>
+        <w:t xml:space="preserve"> - Create product pop-up</w:t>
+      </w:r>
+    </w:p>
+    <w:p>
+      <w:r>
+        <w:rPr>
+          <w:highlight w:val="lightGray"/>
+        </w:rPr>
+        <mc:AlternateContent>
+          <mc:Choice Requires="wps">
+            <w:drawing>
+              <wp:anchor distT="45720" distB="45720" distL="114300" distR="114300" simplePos="0" relativeHeight="251702272" behindDoc="0" locked="0" layoutInCell="1" allowOverlap="1" wp14:anchorId="545B075D" wp14:editId="0B601FBE">
+                <wp:simplePos x="0" y="0"/>
+                <wp:positionH relativeFrom="column">
+                  <wp:posOffset>1905</wp:posOffset>
+                </wp:positionH>
+                <wp:positionV relativeFrom="paragraph">
+                  <wp:posOffset>618813</wp:posOffset>
+                </wp:positionV>
+                <wp:extent cx="5471160" cy="283845"/>
+                <wp:effectExtent l="19050" t="19050" r="15240" b="20955"/>
+                <wp:wrapTopAndBottom/>
+                <wp:docPr id="43" name="Text Box 2"/>
+                <wp:cNvGraphicFramePr>
+                  <a:graphicFrameLocks xmlns:a="http://schemas.openxmlformats.org/drawingml/2006/main"/>
+                </wp:cNvGraphicFramePr>
+                <a:graphic xmlns:a="http://schemas.openxmlformats.org/drawingml/2006/main">
+                  <a:graphicData uri="http://schemas.microsoft.com/office/word/2010/wordprocessingShape">
+                    <wps:wsp>
+                      <wps:cNvSpPr txBox="1">
+                        <a:spLocks noChangeArrowheads="1"/>
+                      </wps:cNvSpPr>
+                      <wps:spPr bwMode="auto">
+                        <a:xfrm>
+                          <a:off x="0" y="0"/>
+                          <a:ext cx="5471160" cy="283845"/>
+                        </a:xfrm>
+                        <a:prstGeom prst="rect">
+                          <a:avLst/>
+                        </a:prstGeom>
+                        <a:solidFill>
+                          <a:srgbClr val="FFFFFF"/>
+                        </a:solidFill>
+                        <a:ln w="28575">
+                          <a:solidFill>
+                            <a:srgbClr val="7030A0"/>
+                          </a:solidFill>
+                          <a:miter lim="800000"/>
+                          <a:headEnd/>
+                          <a:tailEnd/>
+                        </a:ln>
+                      </wps:spPr>
+                      <wps:txbx>
+                        <w:txbxContent>
+                          <w:p>
+                            <w:r>
+                              <w:t xml:space="preserve">(TBD): </w:t>
+                            </w:r>
+                            <w:r>
+                              <w:t>Name, unit, (density) changes from item context menu to be added.</w:t>
+                            </w:r>
+                          </w:p>
+                        </w:txbxContent>
+                      </wps:txbx>
+                      <wps:bodyPr rot="0" vert="horz" wrap="square" lIns="91440" tIns="45720" rIns="91440" bIns="45720" anchor="t" anchorCtr="0">
+                        <a:noAutofit/>
+                      </wps:bodyPr>
+                    </wps:wsp>
+                  </a:graphicData>
+                </a:graphic>
+                <wp14:sizeRelH relativeFrom="margin">
+                  <wp14:pctWidth>0</wp14:pctWidth>
+                </wp14:sizeRelH>
+                <wp14:sizeRelV relativeFrom="margin">
+                  <wp14:pctHeight>0</wp14:pctHeight>
+                </wp14:sizeRelV>
+              </wp:anchor>
+            </w:drawing>
+          </mc:Choice>
+          <mc:Fallback>
+            <w:pict>
+              <v:shape w14:anchorId="545B075D" id="_x0000_s1040" type="#_x0000_t202" style="position:absolute;margin-left:.15pt;margin-top:48.75pt;width:430.8pt;height:22.35pt;z-index:251702272;visibility:visible;mso-wrap-style:square;mso-width-percent:0;mso-height-percent:0;mso-wrap-distance-left:9pt;mso-wrap-distance-top:3.6pt;mso-wrap-distance-right:9pt;mso-wrap-distance-bottom:3.6pt;mso-position-horizontal:absolute;mso-position-horizontal-relative:text;mso-position-vertical:absolute;mso-position-vertical-relative:text;mso-width-percent:0;mso-height-percent:0;mso-width-relative:margin;mso-height-relative:margin;v-text-anchor:top" o:gfxdata="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" strokecolor="#7030a0" strokeweight="2.25pt">
+                <v:textbox>
+                  <w:txbxContent>
+                    <w:p>
+                      <w:r>
+                        <w:t xml:space="preserve">(TBD): </w:t>
+                      </w:r>
+                      <w:r>
+                        <w:t>Name, unit, (density) changes from item context menu to be added.</w:t>
+                      </w:r>
+                    </w:p>
+                  </w:txbxContent>
+                </v:textbox>
+                <w10:wrap type="topAndBottom"/>
+              </v:shape>
+            </w:pict>
+          </mc:Fallback>
+        </mc:AlternateContent>
+      </w:r>
+      <w:r>
+        <w:t>Once added on the canvas</w:t>
+      </w:r>
+      <w:r>
+        <w:t>, the quantity parameter can be changed on the slider while the other (harder) parameters can be changed on the context menu of the item (</w:t>
+      </w:r>
+      <w:r>
+        <w:t>appears with</w:t>
+      </w:r>
+      <w:r>
+        <w:t xml:space="preserve"> </w:t>
+      </w:r>
+      <w:r>
+        <w:t xml:space="preserve">a </w:t>
+      </w:r>
+      <w:r>
+        <w:t>click of</w:t>
+      </w:r>
+      <w:r>
+        <w:rPr>
+          <w:rFonts w:ascii="Courier New" w:hAnsi="Courier New" w:cs="Courier New"/>
+        </w:rPr>
+        <w:t xml:space="preserve"> </w:t>
+      </w:r>
+      <w:r>
+        <w:t>the</w:t>
+      </w:r>
+      <w:r>
+        <w:rPr>
+          <w:rFonts w:ascii="Courier New" w:hAnsi="Courier New" w:cs="Courier New"/>
+        </w:rPr>
+        <w:t xml:space="preserve"> </w:t>
+      </w:r>
+      <w:r>
+        <w:rPr>
+          <w:rFonts w:ascii="Courier New" w:hAnsi="Courier New" w:cs="Courier New"/>
+        </w:rPr>
+        <w:t>Right Mouse Button</w:t>
+      </w:r>
+      <w:r>
+        <w:t xml:space="preserve"> on the ite</w:t>
+      </w:r>
+      <w:r>
+        <w:t xml:space="preserve">m- see </w:t>
+      </w:r>
+      <w:r>
+        <w:fldChar w:fldCharType="begin"/>
+      </w:r>
+      <w:r>
+        <w:instrText xml:space="preserve"> REF _Ref176778437 \h </w:instrText>
+      </w:r>
+      <w:r>
+        <w:instrText xml:space="preserve"> \* MERGEFORMAT </w:instrText>
+      </w:r>
+      <w:r>
+        <w:fldChar w:fldCharType="separate"/>
+      </w:r>
+      <w:r>
+        <w:t xml:space="preserve">Figure </w:t>
+      </w:r>
+      <w:r>
+        <w:t>4</w:t>
+      </w:r>
+      <w:r>
+        <w:fldChar w:fldCharType="end"/>
+      </w:r>
+      <w:r>
+        <w:t>).</w:t>
+      </w:r>
+    </w:p>
+    <w:p>
+      <w:pPr>
+        <w:pStyle w:val="Caption"/>
+        <w:spacing w:before="240" w:beforeAutospacing="0" w:line="276" w:lineRule="auto"/>
+        <w:jc w:val="center"/>
+        <w:rPr>
+          <w:b/>
+          <w:bCs/>
+          <w:i w:val="0"/>
+          <w:iCs w:val="0"/>
+        </w:rPr>
+      </w:pPr>
+      <w:bookmarkStart w:id="2" w:name="_Ref176776756"/>
+      <w:r>
+        <w:rPr>
+          <w:noProof/>
+        </w:rPr>
+        <w:lastRenderedPageBreak/>
+        <w:drawing>
+          <wp:anchor distT="0" distB="0" distL="114300" distR="114300" simplePos="0" relativeHeight="251715584" behindDoc="0" locked="0" layoutInCell="1" allowOverlap="1" wp14:anchorId="09258FC7" wp14:editId="25C4B81B">
+            <wp:simplePos x="0" y="0"/>
+            <wp:positionH relativeFrom="margin">
+              <wp:align>center</wp:align>
+            </wp:positionH>
+            <wp:positionV relativeFrom="paragraph">
+              <wp:posOffset>2217420</wp:posOffset>
+            </wp:positionV>
+            <wp:extent cx="1818005" cy="1491615"/>
+            <wp:effectExtent l="0" t="0" r="0" b="0"/>
+            <wp:wrapTopAndBottom/>
+            <wp:docPr id="53" name="Picture 53"/>
+            <wp:cNvGraphicFramePr>
+              <a:graphicFrameLocks xmlns:a="http://schemas.openxmlformats.org/drawingml/2006/main" noChangeAspect="1"/>
+            </wp:cNvGraphicFramePr>
+            <a:graphic xmlns:a="http://schemas.openxmlformats.org/drawingml/2006/main">
+              <a:graphicData uri="http://schemas.openxmlformats.org/drawingml/2006/picture">
+                <pic:pic xmlns:pic="http://schemas.openxmlformats.org/drawingml/2006/picture">
+                  <pic:nvPicPr>
+                    <pic:cNvPr id="53" name="Picture 53"/>
+                    <pic:cNvPicPr/>
+                  </pic:nvPicPr>
+                  <pic:blipFill>
+                    <a:blip r:embed="rId15">
+                      <a:extLst>
+                        <a:ext uri="{28A0092B-C50C-407E-A947-70E740481C1C}">
+                          <a14:useLocalDpi xmlns:a14="http://schemas.microsoft.com/office/drawing/2010/main" val="0"/>
+                        </a:ext>
+                      </a:extLst>
+                    </a:blip>
+                    <a:stretch>
+                      <a:fillRect/>
+                    </a:stretch>
+                  </pic:blipFill>
+                  <pic:spPr>
+                    <a:xfrm>
+                      <a:off x="0" y="0"/>
+                      <a:ext cx="1818005" cy="1491615"/>
+                    </a:xfrm>
+                    <a:prstGeom prst="rect">
+                      <a:avLst/>
+                    </a:prstGeom>
+                  </pic:spPr>
+                </pic:pic>
+              </a:graphicData>
+            </a:graphic>
+            <wp14:sizeRelH relativeFrom="page">
+              <wp14:pctWidth>0</wp14:pctWidth>
+            </wp14:sizeRelH>
+            <wp14:sizeRelV relativeFrom="page">
+              <wp14:pctHeight>0</wp14:pctHeight>
+            </wp14:sizeRelV>
+          </wp:anchor>
+        </w:drawing>
+      </w:r>
+      <w:r>
+        <w:rPr>
+          <w:b/>
+          <w:bCs/>
+          <w:i w:val="0"/>
+          <w:iCs w:val="0"/>
+        </w:rPr>
+        <mc:AlternateContent>
+          <mc:Choice Requires="wpg">
+            <w:drawing>
+              <wp:anchor distT="0" distB="0" distL="114300" distR="114300" simplePos="0" relativeHeight="251714560" behindDoc="0" locked="1" layoutInCell="1" allowOverlap="1" wp14:anchorId="2D35EE97" wp14:editId="060AC18B">
+                <wp:simplePos x="0" y="0"/>
+                <wp:positionH relativeFrom="margin">
+                  <wp:posOffset>390525</wp:posOffset>
+                </wp:positionH>
+                <wp:positionV relativeFrom="paragraph">
+                  <wp:posOffset>73632</wp:posOffset>
+                </wp:positionV>
+                <wp:extent cx="5157216" cy="1783080"/>
+                <wp:effectExtent l="0" t="0" r="5715" b="7620"/>
+                <wp:wrapTopAndBottom/>
+                <wp:docPr id="52" name="Group 52"/>
+                <wp:cNvGraphicFramePr/>
+                <a:graphic xmlns:a="http://schemas.openxmlformats.org/drawingml/2006/main">
+                  <a:graphicData uri="http://schemas.microsoft.com/office/word/2010/wordprocessingGroup">
+                    <wpg:wgp>
+                      <wpg:cNvGrpSpPr/>
+                      <wpg:grpSpPr>
+                        <a:xfrm>
+                          <a:off x="0" y="0"/>
+                          <a:ext cx="5157216" cy="1783080"/>
+                          <a:chOff x="0" y="0"/>
+                          <a:chExt cx="5160645" cy="1786255"/>
+                        </a:xfrm>
+                      </wpg:grpSpPr>
+                      <wpg:grpSp>
+                        <wpg:cNvPr id="51" name="Group 51"/>
+                        <wpg:cNvGrpSpPr/>
+                        <wpg:grpSpPr>
+                          <a:xfrm>
+                            <a:off x="0" y="0"/>
+                            <a:ext cx="5160645" cy="1786255"/>
+                            <a:chOff x="0" y="0"/>
+                            <a:chExt cx="5161031" cy="1786742"/>
+                          </a:xfrm>
+                        </wpg:grpSpPr>
+                        <wps:wsp>
+                          <wps:cNvPr id="45" name="Text Box 2"/>
+                          <wps:cNvSpPr txBox="1">
+                            <a:spLocks noChangeArrowheads="1"/>
+                          </wps:cNvSpPr>
+                          <wps:spPr bwMode="auto">
+                            <a:xfrm>
+                              <a:off x="3545404" y="1509040"/>
+                              <a:ext cx="1176262" cy="277702"/>
+                            </a:xfrm>
+                            <a:prstGeom prst="rect">
+                              <a:avLst/>
+                            </a:prstGeom>
+                            <a:solidFill>
+                              <a:schemeClr val="bg1"/>
+                            </a:solidFill>
+                            <a:ln w="9525">
+                              <a:noFill/>
+                              <a:miter lim="800000"/>
+                              <a:headEnd/>
+                              <a:tailEnd/>
+                            </a:ln>
+                          </wps:spPr>
+                          <wps:txbx>
+                            <w:txbxContent>
+                              <w:p>
+                                <w:r>
+                                  <w:t>Qty slider</w:t>
+                                </w:r>
+                              </w:p>
+                            </w:txbxContent>
+                          </wps:txbx>
+                          <wps:bodyPr rot="0" vert="horz" wrap="square" lIns="91440" tIns="45720" rIns="91440" bIns="45720" anchor="t" anchorCtr="0">
+                            <a:noAutofit/>
+                          </wps:bodyPr>
+                        </wps:wsp>
+                        <pic:pic xmlns:pic="http://schemas.openxmlformats.org/drawingml/2006/picture">
+                          <pic:nvPicPr>
+                            <pic:cNvPr id="44" name="Picture 44"/>
+                            <pic:cNvPicPr>
+                              <a:picLocks noChangeAspect="1"/>
+                            </pic:cNvPicPr>
+                          </pic:nvPicPr>
+                          <pic:blipFill>
+                            <a:blip r:embed="rId16">
+                              <a:extLst>
+                                <a:ext uri="{28A0092B-C50C-407E-A947-70E740481C1C}">
+                                  <a14:useLocalDpi xmlns:a14="http://schemas.microsoft.com/office/drawing/2010/main" val="0"/>
+                                </a:ext>
+                              </a:extLst>
+                            </a:blip>
+                            <a:stretch>
+                              <a:fillRect/>
+                            </a:stretch>
+                          </pic:blipFill>
+                          <pic:spPr>
+                            <a:xfrm>
+                              <a:off x="1935387" y="0"/>
+                              <a:ext cx="1276350" cy="1743075"/>
+                            </a:xfrm>
+                            <a:prstGeom prst="rect">
+                              <a:avLst/>
+                            </a:prstGeom>
+                          </pic:spPr>
+                        </pic:pic>
+                        <wps:wsp>
+                          <wps:cNvPr id="46" name="Straight Arrow Connector 46"/>
+                          <wps:cNvCnPr/>
+                          <wps:spPr>
+                            <a:xfrm flipH="1" flipV="1">
+                              <a:off x="2859838" y="1583020"/>
+                              <a:ext cx="646297" cy="85316"/>
+                            </a:xfrm>
+                            <a:prstGeom prst="straightConnector1">
+                              <a:avLst/>
+                            </a:prstGeom>
+                            <a:ln>
+                              <a:tailEnd type="triangle"/>
+                            </a:ln>
+                          </wps:spPr>
+                          <wps:style>
+                            <a:lnRef idx="1">
+                              <a:schemeClr val="dk1"/>
+                            </a:lnRef>
+                            <a:fillRef idx="0">
+                              <a:schemeClr val="dk1"/>
+                            </a:fillRef>
+                            <a:effectRef idx="0">
+                              <a:schemeClr val="dk1"/>
+                            </a:effectRef>
+                            <a:fontRef idx="minor">
+                              <a:schemeClr val="tx1"/>
+                            </a:fontRef>
+                          </wps:style>
+                          <wps:bodyPr/>
+                        </wps:wsp>
+                        <wps:wsp>
+                          <wps:cNvPr id="47" name="Text Box 2"/>
+                          <wps:cNvSpPr txBox="1">
+                            <a:spLocks noChangeArrowheads="1"/>
+                          </wps:cNvSpPr>
+                          <wps:spPr bwMode="auto">
+                            <a:xfrm>
+                              <a:off x="0" y="0"/>
+                              <a:ext cx="1176020" cy="277495"/>
+                            </a:xfrm>
+                            <a:prstGeom prst="rect">
+                              <a:avLst/>
+                            </a:prstGeom>
+                            <a:solidFill>
+                              <a:schemeClr val="bg1"/>
+                            </a:solidFill>
+                            <a:ln w="9525">
+                              <a:noFill/>
+                              <a:miter lim="800000"/>
+                              <a:headEnd/>
+                              <a:tailEnd/>
+                            </a:ln>
+                          </wps:spPr>
+                          <wps:txbx>
+                            <w:txbxContent>
+                              <w:p>
+                                <w:r>
+                                  <w:t>Item display id</w:t>
+                                </w:r>
+                              </w:p>
+                            </w:txbxContent>
+                          </wps:txbx>
+                          <wps:bodyPr rot="0" vert="horz" wrap="square" lIns="91440" tIns="45720" rIns="91440" bIns="45720" anchor="t" anchorCtr="0">
+                            <a:noAutofit/>
+                          </wps:bodyPr>
+                        </wps:wsp>
+                        <wps:wsp>
+                          <wps:cNvPr id="48" name="Straight Arrow Connector 48"/>
+                          <wps:cNvCnPr/>
+                          <wps:spPr>
+                            <a:xfrm flipV="1">
+                              <a:off x="1054646" y="79589"/>
+                              <a:ext cx="880741" cy="58319"/>
+                            </a:xfrm>
+                            <a:prstGeom prst="straightConnector1">
+                              <a:avLst/>
+                            </a:prstGeom>
+                            <a:ln>
+                              <a:tailEnd type="triangle"/>
+                            </a:ln>
+                          </wps:spPr>
+                          <wps:style>
+                            <a:lnRef idx="1">
+                              <a:schemeClr val="dk1"/>
+                            </a:lnRef>
+                            <a:fillRef idx="0">
+                              <a:schemeClr val="dk1"/>
+                            </a:fillRef>
+                            <a:effectRef idx="0">
+                              <a:schemeClr val="dk1"/>
+                            </a:effectRef>
+                            <a:fontRef idx="minor">
+                              <a:schemeClr val="tx1"/>
+                            </a:fontRef>
+                          </wps:style>
+                          <wps:bodyPr/>
+                        </wps:wsp>
+                        <wps:wsp>
+                          <wps:cNvPr id="49" name="Text Box 2"/>
+                          <wps:cNvSpPr txBox="1">
+                            <a:spLocks noChangeArrowheads="1"/>
+                          </wps:cNvSpPr>
+                          <wps:spPr bwMode="auto">
+                            <a:xfrm>
+                              <a:off x="3545404" y="370248"/>
+                              <a:ext cx="1615627" cy="426346"/>
+                            </a:xfrm>
+                            <a:prstGeom prst="rect">
+                              <a:avLst/>
+                            </a:prstGeom>
+                            <a:solidFill>
+                              <a:schemeClr val="bg1"/>
+                            </a:solidFill>
+                            <a:ln w="9525">
+                              <a:noFill/>
+                              <a:miter lim="800000"/>
+                              <a:headEnd/>
+                              <a:tailEnd/>
+                            </a:ln>
+                          </wps:spPr>
+                          <wps:txbx>
+                            <w:txbxContent>
+                              <w:p>
+                                <w:pPr>
+                                  <w:spacing w:before="0" w:beforeAutospacing="0" w:after="0" w:afterAutospacing="0"/>
+                                </w:pPr>
+                                <w:r>
+                                  <w:t xml:space="preserve">Item </w:t>
+                                </w:r>
+                                <w:r>
+                                  <w:t xml:space="preserve">label </w:t>
+                                </w:r>
+                              </w:p>
+                              <w:p>
+                                <w:pPr>
+                                  <w:spacing w:before="0" w:beforeAutospacing="0"/>
+                                </w:pPr>
+                                <w:r>
+                                  <w:t>(</w:t>
+                                </w:r>
+                                <w:proofErr w:type="gramStart"/>
+                                <w:r>
+                                  <w:t>name</w:t>
+                                </w:r>
+                                <w:proofErr w:type="gramEnd"/>
+                                <w:r>
+                                  <w:t xml:space="preserve"> and LC stage)</w:t>
+                                </w:r>
+                              </w:p>
+                            </w:txbxContent>
+                          </wps:txbx>
+                          <wps:bodyPr rot="0" vert="horz" wrap="square" lIns="91440" tIns="45720" rIns="91440" bIns="45720" anchor="t" anchorCtr="0">
+                            <a:noAutofit/>
+                          </wps:bodyPr>
+                        </wps:wsp>
+                      </wpg:grpSp>
+                      <wps:wsp>
+                        <wps:cNvPr id="50" name="Straight Arrow Connector 50"/>
+                        <wps:cNvCnPr/>
+                        <wps:spPr>
+                          <a:xfrm flipH="1">
+                            <a:off x="2887886" y="583421"/>
+                            <a:ext cx="685029" cy="85199"/>
+                          </a:xfrm>
+                          <a:prstGeom prst="straightConnector1">
+                            <a:avLst/>
+                          </a:prstGeom>
+                          <a:ln>
+                            <a:tailEnd type="triangle"/>
+                          </a:ln>
+                        </wps:spPr>
+                        <wps:style>
+                          <a:lnRef idx="1">
+                            <a:schemeClr val="dk1"/>
+                          </a:lnRef>
+                          <a:fillRef idx="0">
+                            <a:schemeClr val="dk1"/>
+                          </a:fillRef>
+                          <a:effectRef idx="0">
+                            <a:schemeClr val="dk1"/>
+                          </a:effectRef>
+                          <a:fontRef idx="minor">
+                            <a:schemeClr val="tx1"/>
+                          </a:fontRef>
+                        </wps:style>
+                        <wps:bodyPr/>
+                      </wps:wsp>
+                    </wpg:wgp>
+                  </a:graphicData>
+                </a:graphic>
+                <wp14:sizeRelH relativeFrom="margin">
+                  <wp14:pctWidth>0</wp14:pctWidth>
+                </wp14:sizeRelH>
+                <wp14:sizeRelV relativeFrom="margin">
+                  <wp14:pctHeight>0</wp14:pctHeight>
+                </wp14:sizeRelV>
+              </wp:anchor>
+            </w:drawing>
+          </mc:Choice>
+          <mc:Fallback>
+            <w:pict>
+              <v:group w14:anchorId="2D35EE97" id="Group 52" o:spid="_x0000_s1041" style="position:absolute;left:0;text-align:left;margin-left:30.75pt;margin-top:5.8pt;width:406.1pt;height:140.4pt;z-index:251714560;mso-position-horizontal-relative:margin;mso-width-relative:margin;mso-height-relative:margin" coordsize="51606,17862" o:gfxdata="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">
+                <v:group id="Group 51" o:spid="_x0000_s1042" style="position:absolute;width:51606;height:17862" coordsize="51610,17867" o:gfxdata="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">
+                  <v:shape id="_x0000_s1043" type="#_x0000_t202" style="position:absolute;left:35454;top:15090;width:11762;height:2777;visibility:visible;mso-wrap-style:square;v-text-anchor:top" o:gfxdata="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" fillcolor="white [3212]" stroked="f">
+                    <v:textbox>
+                      <w:txbxContent>
+                        <w:p>
+                          <w:r>
+                            <w:t>Qty slider</w:t>
+                          </w:r>
+                        </w:p>
+                      </w:txbxContent>
+                    </v:textbox>
+                  </v:shape>
+                  <v:shape id="Picture 44" o:spid="_x0000_s1044" type="#_x0000_t75" style="position:absolute;left:19353;width:12764;height:17430;visibility:visible;mso-wrap-style:square" o:gfxdata="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">
+                    <v:imagedata r:id="rId17" o:title=""/>
+                  </v:shape>
+                  <v:shape id="Straight Arrow Connector 46" o:spid="_x0000_s1045" type="#_x0000_t32" style="position:absolute;left:28598;top:15830;width:6463;height:853;flip:x y;visibility:visible;mso-wrap-style:square" o:connectortype="straight" o:gfxdata="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" strokecolor="black [3200]" strokeweight=".5pt">
+                    <v:stroke endarrow="block" joinstyle="miter"/>
+                  </v:shape>
+                  <v:shape id="_x0000_s1046" type="#_x0000_t202" style="position:absolute;width:11760;height:2774;visibility:visible;mso-wrap-style:square;v-text-anchor:top" o:gfxdata="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" fillcolor="white [3212]" stroked="f">
+                    <v:textbox>
+                      <w:txbxContent>
+                        <w:p>
+                          <w:r>
+                            <w:t>Item display id</w:t>
+                          </w:r>
+                        </w:p>
+                      </w:txbxContent>
+                    </v:textbox>
+                  </v:shape>
+                  <v:shape id="Straight Arrow Connector 48" o:spid="_x0000_s1047" type="#_x0000_t32" style="position:absolute;left:10546;top:795;width:8807;height:584;flip:y;visibility:visible;mso-wrap-style:square" o:connectortype="straight" o:gfxdata="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" strokecolor="black [3200]" strokeweight=".5pt">
+                    <v:stroke endarrow="block" joinstyle="miter"/>
+                  </v:shape>
+                  <v:shape id="_x0000_s1048" type="#_x0000_t202" style="position:absolute;left:35454;top:3702;width:16156;height:4263;visibility:visible;mso-wrap-style:square;v-text-anchor:top" o:gfxdata="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" fillcolor="white [3212]" stroked="f">
+                    <v:textbox>
+                      <w:txbxContent>
+                        <w:p>
+                          <w:pPr>
+                            <w:spacing w:before="0" w:beforeAutospacing="0" w:after="0" w:afterAutospacing="0"/>
+                          </w:pPr>
+                          <w:r>
+                            <w:t xml:space="preserve">Item </w:t>
+                          </w:r>
+                          <w:r>
+                            <w:t xml:space="preserve">label </w:t>
+                          </w:r>
+                        </w:p>
+                        <w:p>
+                          <w:pPr>
+                            <w:spacing w:before="0" w:beforeAutospacing="0"/>
+                          </w:pPr>
+                          <w:r>
+                            <w:t>(</w:t>
+                          </w:r>
+                          <w:proofErr w:type="gramStart"/>
+                          <w:r>
+                            <w:t>name</w:t>
+                          </w:r>
+                          <w:proofErr w:type="gramEnd"/>
+                          <w:r>
+                            <w:t xml:space="preserve"> and LC stage)</w:t>
+                          </w:r>
+                        </w:p>
+                      </w:txbxContent>
+                    </v:textbox>
+                  </v:shape>
+                </v:group>
+                <v:shape id="Straight Arrow Connector 50" o:spid="_x0000_s1049" type="#_x0000_t32" style="position:absolute;left:28878;top:5834;width:6851;height:852;flip:x;visibility:visible;mso-wrap-style:square" o:connectortype="straight" o:gfxdata="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" strokecolor="black [3200]" strokeweight=".5pt">
+                  <v:stroke endarrow="block" joinstyle="miter"/>
+                </v:shape>
+                <w10:wrap type="topAndBottom" anchorx="margin"/>
+                <w10:anchorlock/>
+              </v:group>
+            </w:pict>
+          </mc:Fallback>
+        </mc:AlternateContent>
+      </w:r>
+      <w:r>
+        <w:rPr>
+          <w:b/>
+          <w:bCs/>
+          <w:i w:val="0"/>
+          <w:iCs w:val="0"/>
+        </w:rPr>
+        <w:t xml:space="preserve">Figure </w:t>
+      </w:r>
+      <w:r>
+        <w:rPr>
+          <w:b/>
+          <w:bCs/>
+          <w:i w:val="0"/>
+          <w:iCs w:val="0"/>
+        </w:rPr>
+        <w:fldChar w:fldCharType="begin"/>
+      </w:r>
+      <w:r>
+        <w:rPr>
+          <w:b/>
+          <w:bCs/>
+          <w:i w:val="0"/>
+          <w:iCs w:val="0"/>
+        </w:rPr>
+        <w:instrText xml:space="preserve"> SEQ Figure \* ARABIC </w:instrText>
+      </w:r>
+      <w:r>
+        <w:rPr>
+          <w:b/>
+          <w:bCs/>
+          <w:i w:val="0"/>
+          <w:iCs w:val="0"/>
+        </w:rPr>
+        <w:fldChar w:fldCharType="separate"/>
+      </w:r>
+      <w:r>
+        <w:rPr>
+          <w:b/>
+          <w:bCs/>
+          <w:i w:val="0"/>
+          <w:iCs w:val="0"/>
+          <w:noProof/>
+        </w:rPr>
+        <w:t>3</w:t>
+      </w:r>
+      <w:r>
+        <w:rPr>
+          <w:b/>
+          <w:bCs/>
+          <w:i w:val="0"/>
+          <w:iCs w:val="0"/>
+        </w:rPr>
+        <w:fldChar w:fldCharType="end"/>
+      </w:r>
+      <w:bookmarkEnd w:id="2"/>
+      <w:r>
+        <w:rPr>
+          <w:b/>
+          <w:bCs/>
+          <w:i w:val="0"/>
+          <w:iCs w:val="0"/>
+        </w:rPr>
+        <w:t xml:space="preserve"> - Item on canvas.</w:t>
+      </w:r>
+    </w:p>
+    <w:p>
+      <w:pPr>
+        <w:pStyle w:val="Caption"/>
+        <w:spacing w:before="240" w:beforeAutospacing="0" w:line="276" w:lineRule="auto"/>
+        <w:jc w:val="center"/>
+        <w:rPr>
+          <w:b/>
+          <w:bCs/>
+          <w:i w:val="0"/>
+          <w:iCs w:val="0"/>
+        </w:rPr>
+      </w:pPr>
+      <w:bookmarkStart w:id="3" w:name="_Ref176778437"/>
+      <w:r>
+        <w:rPr>
+          <w:b/>
+          <w:bCs/>
+          <w:i w:val="0"/>
+          <w:iCs w:val="0"/>
+        </w:rPr>
+        <w:t xml:space="preserve">Figure </w:t>
+      </w:r>
+      <w:r>
+        <w:rPr>
+          <w:b/>
+          <w:bCs/>
+          <w:i w:val="0"/>
+          <w:iCs w:val="0"/>
+        </w:rPr>
+        <w:fldChar w:fldCharType="begin"/>
+      </w:r>
+      <w:r>
+        <w:rPr>
+          <w:b/>
+          <w:bCs/>
+          <w:i w:val="0"/>
+          <w:iCs w:val="0"/>
+        </w:rPr>
+        <w:instrText xml:space="preserve"> SEQ Figure \* ARABIC </w:instrText>
+      </w:r>
+      <w:r>
+        <w:rPr>
+          <w:b/>
+          <w:bCs/>
+          <w:i w:val="0"/>
+          <w:iCs w:val="0"/>
+        </w:rPr>
+        <w:fldChar w:fldCharType="separate"/>
+      </w:r>
+      <w:r>
+        <w:rPr>
+          <w:b/>
+          <w:bCs/>
+          <w:i w:val="0"/>
+          <w:iCs w:val="0"/>
+          <w:noProof/>
+        </w:rPr>
+        <w:t>4</w:t>
+      </w:r>
+      <w:r>
+        <w:rPr>
+          <w:b/>
+          <w:bCs/>
+          <w:i w:val="0"/>
+          <w:iCs w:val="0"/>
+        </w:rPr>
+        <w:fldChar w:fldCharType="end"/>
+      </w:r>
+      <w:bookmarkEnd w:id="3"/>
+      <w:r>
+        <w:rPr>
+          <w:b/>
+          <w:bCs/>
+          <w:i w:val="0"/>
+          <w:iCs w:val="0"/>
+        </w:rPr>
+        <w:t xml:space="preserve"> - Item context menu can be viewed by right clicking on the item.</w:t>
+      </w:r>
+    </w:p>
+    <w:p>
+      <w:r>
+        <w:t xml:space="preserve">Items can be dragged on the </w:t>
+      </w:r>
+      <w:r>
+        <w:t xml:space="preserve">canvas </w:t>
+      </w:r>
+      <w:r>
+        <w:t xml:space="preserve">by clicking and holding the </w:t>
+      </w:r>
+      <w:r>
+        <w:rPr>
+          <w:rFonts w:ascii="Courier New" w:hAnsi="Courier New" w:cs="Courier New"/>
+        </w:rPr>
+        <w:t>left mouse button</w:t>
+      </w:r>
+      <w:r>
+        <w:t xml:space="preserve"> while dragging the item.</w:t>
+      </w:r>
+    </w:p>
+    <w:p>
+      <w:r>
+        <w:rPr>
+          <w:rFonts w:ascii="Courier New" w:hAnsi="Courier New" w:cs="Courier New"/>
+          <w:highlight w:val="lightGray"/>
+        </w:rPr>
+        <w:t xml:space="preserve">Edit &gt; </w:t>
+      </w:r>
+      <w:r>
+        <w:rPr>
+          <w:rFonts w:ascii="Courier New" w:hAnsi="Courier New" w:cs="Courier New"/>
+          <w:highlight w:val="lightGray"/>
+        </w:rPr>
+        <w:t>Canvas</w:t>
+      </w:r>
+      <w:r>
+        <w:rPr>
+          <w:rFonts w:ascii="Courier New" w:hAnsi="Courier New" w:cs="Courier New"/>
+          <w:highlight w:val="lightGray"/>
+        </w:rPr>
+        <w:t xml:space="preserve"> Settings</w:t>
+      </w:r>
+      <w:r>
+        <w:t xml:space="preserve"> allows you to change </w:t>
+      </w:r>
+      <w:r>
+        <w:t xml:space="preserve">the </w:t>
+      </w:r>
+      <w:r>
+        <w:t>color of different types of items (i.e., products, processes)</w:t>
+      </w:r>
+      <w:r>
+        <w:t>.</w:t>
+      </w:r>
+    </w:p>
+    <w:p>
+      <w:pPr>
+        <w:pStyle w:val="Heading3"/>
+      </w:pPr>
+      <w:r>
+        <w:t>Connect items</w:t>
+      </w:r>
+    </w:p>
+    <w:p>
+      <w:r>
+        <w:t>Items can be connected</w:t>
+      </w:r>
+      <w:r>
+        <w:rPr>
+          <w:rFonts w:ascii="Courier New" w:hAnsi="Courier New" w:cs="Courier New"/>
+        </w:rPr>
+        <w:t xml:space="preserve">. </w:t>
+      </w:r>
+      <w:r>
+        <w:t>Click</w:t>
+      </w:r>
+      <w:r>
+        <w:rPr>
+          <w:rFonts w:ascii="Courier New" w:hAnsi="Courier New" w:cs="Courier New"/>
+        </w:rPr>
+        <w:t xml:space="preserve"> </w:t>
+      </w:r>
+      <w:r>
+        <w:t>the</w:t>
+      </w:r>
+      <w:r>
+        <w:rPr>
+          <w:rFonts w:ascii="Courier New" w:hAnsi="Courier New" w:cs="Courier New"/>
+        </w:rPr>
+        <w:t xml:space="preserve"> </w:t>
+      </w:r>
+      <w:r>
+        <w:rPr>
+          <w:rFonts w:ascii="Courier New" w:hAnsi="Courier New" w:cs="Courier New"/>
+        </w:rPr>
+        <w:t>Left mouse button</w:t>
+      </w:r>
+      <w:r>
+        <w:t xml:space="preserve"> on the start item while holding down </w:t>
+      </w:r>
+      <w:r>
+        <w:rPr>
+          <w:rFonts w:ascii="Courier New" w:hAnsi="Courier New" w:cs="Courier New"/>
+        </w:rPr>
+        <w:t>ctrl</w:t>
+      </w:r>
+      <w:r>
+        <w:t xml:space="preserve">, and drag the cursor (while holding down </w:t>
+      </w:r>
+      <w:r>
+        <w:rPr>
+          <w:rFonts w:ascii="Courier New" w:hAnsi="Courier New" w:cs="Courier New"/>
+        </w:rPr>
+        <w:t>ctrl</w:t>
+      </w:r>
+      <w:r>
+        <w:t xml:space="preserve"> and </w:t>
+      </w:r>
+      <w:r>
+        <w:rPr>
+          <w:rFonts w:ascii="Courier New" w:hAnsi="Courier New" w:cs="Courier New"/>
+        </w:rPr>
+        <w:t>left mouse button</w:t>
+      </w:r>
+      <w:r>
+        <w:t>) to the end item.</w:t>
+      </w:r>
+      <w:r>
+        <w:t xml:space="preserve"> This will connect the start item to the end item</w:t>
+      </w:r>
+      <w:r>
+        <w:t xml:space="preserve"> (</w:t>
+      </w:r>
+      <w:r>
+        <w:fldChar w:fldCharType="begin"/>
+      </w:r>
+      <w:r>
+        <w:instrText xml:space="preserve"> REF _Ref176780305 \h </w:instrText>
+      </w:r>
+      <w:r>
+        <w:instrText xml:space="preserve"> \* MERGEFORMAT </w:instrText>
+      </w:r>
+      <w:r>
+        <w:fldChar w:fldCharType="separate"/>
+      </w:r>
+      <w:r>
+        <w:t xml:space="preserve">Figure </w:t>
+      </w:r>
+      <w:r>
+        <w:t>5</w:t>
+      </w:r>
+      <w:r>
+        <w:fldChar w:fldCharType="end"/>
+      </w:r>
+      <w:r>
+        <w:t>)</w:t>
+      </w:r>
+      <w:r>
+        <w:t>.</w:t>
+      </w:r>
+    </w:p>
+    <w:p>
+      <w:r>
+        <w:t>The two items will not connect if:</w:t>
+      </w:r>
+    </w:p>
+    <w:p>
       <w:pPr>
         <w:pStyle w:val="ListParagraph"/>
-      </w:pPr>
+        <w:numPr>
+          <w:ilvl w:val="0"/>
+          <w:numId w:val="8"/>
+        </w:numPr>
+      </w:pPr>
+      <w:r>
+        <w:t xml:space="preserve">If </w:t>
+      </w:r>
+      <w:r>
+        <w:t xml:space="preserve">a </w:t>
+      </w:r>
+      <w:r>
+        <w:t xml:space="preserve">product is connected to another product. Combining </w:t>
+      </w:r>
+      <w:r>
+        <w:t>two</w:t>
+      </w:r>
+      <w:r>
+        <w:t xml:space="preserve"> products has to be done through a process</w:t>
+      </w:r>
     </w:p>
     <w:p>
       <w:pPr>
         <w:pStyle w:val="ListParagraph"/>
-      </w:pPr>
+        <w:numPr>
+          <w:ilvl w:val="0"/>
+          <w:numId w:val="8"/>
+        </w:numPr>
+      </w:pPr>
+      <w:r>
+        <w:t>If what is connected to a transportation process is not a product. Only products can be transported.</w:t>
+      </w:r>
+    </w:p>
+    <w:p>
+      <w:r>
+        <w:rPr>
+          <w:rFonts w:ascii="Courier New" w:hAnsi="Courier New" w:cs="Courier New"/>
+          <w:highlight w:val="lightGray"/>
+        </w:rPr>
+        <w:t xml:space="preserve">Edit &gt; </w:t>
+      </w:r>
+      <w:r>
+        <w:rPr>
+          <w:rFonts w:ascii="Courier New" w:hAnsi="Courier New" w:cs="Courier New"/>
+          <w:highlight w:val="lightGray"/>
+        </w:rPr>
+        <w:t>Canvas Settings</w:t>
+      </w:r>
+      <w:r>
+        <w:t xml:space="preserve"> allows you to change </w:t>
+      </w:r>
+      <w:r>
+        <w:t xml:space="preserve">the </w:t>
+      </w:r>
+      <w:r>
+        <w:t>connector type</w:t>
+      </w:r>
+      <w:r>
+        <w:t>.</w:t>
+      </w:r>
+    </w:p>
+    <w:p>
+      <w:pPr>
+        <w:pStyle w:val="Caption"/>
+        <w:spacing w:before="240" w:beforeAutospacing="0" w:line="276" w:lineRule="auto"/>
+        <w:jc w:val="center"/>
+        <w:rPr>
+          <w:b/>
+          <w:bCs/>
+          <w:i w:val="0"/>
+          <w:iCs w:val="0"/>
+        </w:rPr>
+      </w:pPr>
+      <w:bookmarkStart w:id="4" w:name="_Ref176780305"/>
+      <w:r>
+        <w:rPr>
+          <w:noProof/>
+        </w:rPr>
+        <w:lastRenderedPageBreak/>
+        <w:drawing>
+          <wp:anchor distT="0" distB="0" distL="114300" distR="114300" simplePos="0" relativeHeight="251724800" behindDoc="0" locked="1" layoutInCell="1" allowOverlap="1" wp14:anchorId="6185B5CD" wp14:editId="1E91D3B1">
+            <wp:simplePos x="0" y="0"/>
+            <wp:positionH relativeFrom="margin">
+              <wp:posOffset>1357575</wp:posOffset>
+            </wp:positionH>
+            <wp:positionV relativeFrom="paragraph">
+              <wp:posOffset>66636</wp:posOffset>
+            </wp:positionV>
+            <wp:extent cx="3227832" cy="2176272"/>
+            <wp:effectExtent l="0" t="0" r="0" b="0"/>
+            <wp:wrapTopAndBottom/>
+            <wp:docPr id="59" name="Picture 59"/>
+            <wp:cNvGraphicFramePr>
+              <a:graphicFrameLocks xmlns:a="http://schemas.openxmlformats.org/drawingml/2006/main" noChangeAspect="1"/>
+            </wp:cNvGraphicFramePr>
+            <a:graphic xmlns:a="http://schemas.openxmlformats.org/drawingml/2006/main">
+              <a:graphicData uri="http://schemas.openxmlformats.org/drawingml/2006/picture">
+                <pic:pic xmlns:pic="http://schemas.openxmlformats.org/drawingml/2006/picture">
+                  <pic:nvPicPr>
+                    <pic:cNvPr id="59" name="Picture 59"/>
+                    <pic:cNvPicPr/>
+                  </pic:nvPicPr>
+                  <pic:blipFill rotWithShape="1">
+                    <a:blip r:embed="rId18">
+                      <a:extLst>
+                        <a:ext uri="{28A0092B-C50C-407E-A947-70E740481C1C}">
+                          <a14:useLocalDpi xmlns:a14="http://schemas.microsoft.com/office/drawing/2010/main" val="0"/>
+                        </a:ext>
+                      </a:extLst>
+                    </a:blip>
+                    <a:srcRect l="5241" t="7419" r="8639" b="7895"/>
+                    <a:stretch/>
+                  </pic:blipFill>
+                  <pic:spPr bwMode="auto">
+                    <a:xfrm>
+                      <a:off x="0" y="0"/>
+                      <a:ext cx="3227832" cy="2176272"/>
+                    </a:xfrm>
+                    <a:prstGeom prst="rect">
+                      <a:avLst/>
+                    </a:prstGeom>
+                    <a:ln>
+                      <a:noFill/>
+                    </a:ln>
+                    <a:extLst>
+                      <a:ext uri="{53640926-AAD7-44D8-BBD7-CCE9431645EC}">
+                        <a14:shadowObscured xmlns:a14="http://schemas.microsoft.com/office/drawing/2010/main"/>
+                      </a:ext>
+                    </a:extLst>
+                  </pic:spPr>
+                </pic:pic>
+              </a:graphicData>
+            </a:graphic>
+            <wp14:sizeRelH relativeFrom="page">
+              <wp14:pctWidth>0</wp14:pctWidth>
+            </wp14:sizeRelH>
+            <wp14:sizeRelV relativeFrom="page">
+              <wp14:pctHeight>0</wp14:pctHeight>
+            </wp14:sizeRelV>
+          </wp:anchor>
+        </w:drawing>
+      </w:r>
+      <w:r>
+        <w:rPr>
+          <w:b/>
+          <w:bCs/>
+          <w:i w:val="0"/>
+          <w:iCs w:val="0"/>
+        </w:rPr>
+        <w:t xml:space="preserve">Figure </w:t>
+      </w:r>
+      <w:r>
+        <w:rPr>
+          <w:b/>
+          <w:bCs/>
+          <w:i w:val="0"/>
+          <w:iCs w:val="0"/>
+        </w:rPr>
+        <w:fldChar w:fldCharType="begin"/>
+      </w:r>
+      <w:r>
+        <w:rPr>
+          <w:b/>
+          <w:bCs/>
+          <w:i w:val="0"/>
+          <w:iCs w:val="0"/>
+        </w:rPr>
+        <w:instrText xml:space="preserve"> SEQ Figure \* ARABIC </w:instrText>
+      </w:r>
+      <w:r>
+        <w:rPr>
+          <w:b/>
+          <w:bCs/>
+          <w:i w:val="0"/>
+          <w:iCs w:val="0"/>
+        </w:rPr>
+        <w:fldChar w:fldCharType="separate"/>
+      </w:r>
+      <w:r>
+        <w:rPr>
+          <w:b/>
+          <w:bCs/>
+          <w:i w:val="0"/>
+          <w:iCs w:val="0"/>
+          <w:noProof/>
+        </w:rPr>
+        <w:t>5</w:t>
+      </w:r>
+      <w:r>
+        <w:rPr>
+          <w:b/>
+          <w:bCs/>
+          <w:i w:val="0"/>
+          <w:iCs w:val="0"/>
+        </w:rPr>
+        <w:fldChar w:fldCharType="end"/>
+      </w:r>
+      <w:bookmarkEnd w:id="4"/>
+      <w:r>
+        <w:rPr>
+          <w:b/>
+          <w:bCs/>
+          <w:i w:val="0"/>
+          <w:iCs w:val="0"/>
+        </w:rPr>
+        <w:t xml:space="preserve"> - Connecting two items together. </w:t>
+      </w:r>
+      <w:r>
+        <w:rPr>
+          <w:b/>
+          <w:bCs/>
+          <w:i w:val="0"/>
+          <w:iCs w:val="0"/>
+        </w:rPr>
+        <w:t>The connector</w:t>
+      </w:r>
+      <w:r>
+        <w:rPr>
+          <w:b/>
+          <w:bCs/>
+          <w:i w:val="0"/>
+          <w:iCs w:val="0"/>
+        </w:rPr>
+        <w:t xml:space="preserve"> arrow is from the start item to </w:t>
+      </w:r>
+      <w:r>
+        <w:rPr>
+          <w:b/>
+          <w:bCs/>
+          <w:i w:val="0"/>
+          <w:iCs w:val="0"/>
+        </w:rPr>
+        <w:t xml:space="preserve">the </w:t>
+      </w:r>
+      <w:r>
+        <w:rPr>
+          <w:b/>
+          <w:bCs/>
+          <w:i w:val="0"/>
+          <w:iCs w:val="0"/>
+        </w:rPr>
+        <w:t>end item.</w:t>
+      </w:r>
+    </w:p>
+    <w:p>
+      <w:pPr>
+        <w:pStyle w:val="Heading3"/>
+      </w:pPr>
+      <w:r>
+        <w:t>Delete</w:t>
+      </w:r>
+    </w:p>
+    <w:p>
+      <w:r>
+        <w:t xml:space="preserve">Selecting Delete on the context menu of the item </w:t>
+      </w:r>
+      <w:r>
+        <w:t>(</w:t>
+      </w:r>
+      <w:r>
+        <w:fldChar w:fldCharType="begin"/>
+      </w:r>
+      <w:r>
+        <w:instrText xml:space="preserve"> REF _Ref176778437 \h </w:instrText>
+      </w:r>
+      <w:r>
+        <w:instrText xml:space="preserve"> \* MERGEFORMAT </w:instrText>
+      </w:r>
+      <w:r>
+        <w:fldChar w:fldCharType="separate"/>
+      </w:r>
+      <w:r>
+        <w:t xml:space="preserve">Figure </w:t>
+      </w:r>
+      <w:r>
+        <w:t>4</w:t>
+      </w:r>
+      <w:r>
+        <w:fldChar w:fldCharType="end"/>
+      </w:r>
+      <w:r>
+        <w:t>)</w:t>
+      </w:r>
+      <w:r>
+        <w:t xml:space="preserve"> will delete </w:t>
+      </w:r>
+      <w:r>
+        <w:t>it</w:t>
+      </w:r>
+      <w:r>
+        <w:t xml:space="preserve"> from the canvas.</w:t>
+      </w:r>
+      <w:r>
+        <w:t xml:space="preserve"> This will also delete any connections to or from the item as well.</w:t>
+      </w:r>
+    </w:p>
+    <w:p>
+      <w:pPr>
+        <w:pStyle w:val="Heading3"/>
+      </w:pPr>
+      <w:r>
+        <w:t>Set impacts</w:t>
+      </w:r>
+    </w:p>
+    <w:p>
+      <w:r>
+        <w:rPr>
+          <w:highlight w:val="lightGray"/>
+        </w:rPr>
+        <mc:AlternateContent>
+          <mc:Choice Requires="wps">
+            <w:drawing>
+              <wp:anchor distT="45720" distB="45720" distL="114300" distR="114300" simplePos="0" relativeHeight="251721728" behindDoc="0" locked="0" layoutInCell="1" allowOverlap="1" wp14:anchorId="7BC4407C" wp14:editId="253DD17E">
+                <wp:simplePos x="0" y="0"/>
+                <wp:positionH relativeFrom="column">
+                  <wp:posOffset>2840</wp:posOffset>
+                </wp:positionH>
+                <wp:positionV relativeFrom="paragraph">
+                  <wp:posOffset>851118</wp:posOffset>
+                </wp:positionV>
+                <wp:extent cx="5471160" cy="283845"/>
+                <wp:effectExtent l="19050" t="19050" r="15240" b="20955"/>
+                <wp:wrapTopAndBottom/>
+                <wp:docPr id="57" name="Text Box 2"/>
+                <wp:cNvGraphicFramePr>
+                  <a:graphicFrameLocks xmlns:a="http://schemas.openxmlformats.org/drawingml/2006/main"/>
+                </wp:cNvGraphicFramePr>
+                <a:graphic xmlns:a="http://schemas.openxmlformats.org/drawingml/2006/main">
+                  <a:graphicData uri="http://schemas.microsoft.com/office/word/2010/wordprocessingShape">
+                    <wps:wsp>
+                      <wps:cNvSpPr txBox="1">
+                        <a:spLocks noChangeArrowheads="1"/>
+                      </wps:cNvSpPr>
+                      <wps:spPr bwMode="auto">
+                        <a:xfrm>
+                          <a:off x="0" y="0"/>
+                          <a:ext cx="5471160" cy="283845"/>
+                        </a:xfrm>
+                        <a:prstGeom prst="rect">
+                          <a:avLst/>
+                        </a:prstGeom>
+                        <a:solidFill>
+                          <a:srgbClr val="FFFFFF"/>
+                        </a:solidFill>
+                        <a:ln w="28575">
+                          <a:solidFill>
+                            <a:srgbClr val="7030A0"/>
+                          </a:solidFill>
+                          <a:miter lim="800000"/>
+                          <a:headEnd/>
+                          <a:tailEnd/>
+                        </a:ln>
+                      </wps:spPr>
+                      <wps:txbx>
+                        <w:txbxContent>
+                          <w:p>
+                            <w:r>
+                              <w:t xml:space="preserve">(TBD): </w:t>
+                            </w:r>
+                            <w:r>
+                              <w:t xml:space="preserve">Management of setting impacts for </w:t>
+                            </w:r>
+                            <w:proofErr w:type="gramStart"/>
+                            <w:r>
+                              <w:t>units</w:t>
+                            </w:r>
+                            <w:proofErr w:type="gramEnd"/>
+                            <w:r>
+                              <w:t xml:space="preserve"> consistency.</w:t>
+                            </w:r>
+                          </w:p>
+                        </w:txbxContent>
+                      </wps:txbx>
+                      <wps:bodyPr rot="0" vert="horz" wrap="square" lIns="91440" tIns="45720" rIns="91440" bIns="45720" anchor="t" anchorCtr="0">
+                        <a:noAutofit/>
+                      </wps:bodyPr>
+                    </wps:wsp>
+                  </a:graphicData>
+                </a:graphic>
+                <wp14:sizeRelH relativeFrom="margin">
+                  <wp14:pctWidth>0</wp14:pctWidth>
+                </wp14:sizeRelH>
+                <wp14:sizeRelV relativeFrom="margin">
+                  <wp14:pctHeight>0</wp14:pctHeight>
+                </wp14:sizeRelV>
+              </wp:anchor>
+            </w:drawing>
+          </mc:Choice>
+          <mc:Fallback>
+            <w:pict>
+              <v:shape w14:anchorId="7BC4407C" id="_x0000_s1050" type="#_x0000_t202" style="position:absolute;margin-left:.2pt;margin-top:67pt;width:430.8pt;height:22.35pt;z-index:251721728;visibility:visible;mso-wrap-style:square;mso-width-percent:0;mso-height-percent:0;mso-wrap-distance-left:9pt;mso-wrap-distance-top:3.6pt;mso-wrap-distance-right:9pt;mso-wrap-distance-bottom:3.6pt;mso-position-horizontal:absolute;mso-position-horizontal-relative:text;mso-position-vertical:absolute;mso-position-vertical-relative:text;mso-width-percent:0;mso-height-percent:0;mso-width-relative:margin;mso-height-relative:margin;v-text-anchor:top" o:gfxdata="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" strokecolor="#7030a0" strokeweight="2.25pt">
+                <v:textbox>
+                  <w:txbxContent>
+                    <w:p>
+                      <w:r>
+                        <w:t xml:space="preserve">(TBD): </w:t>
+                      </w:r>
+                      <w:r>
+                        <w:t xml:space="preserve">Management of setting impacts for </w:t>
+                      </w:r>
+                      <w:proofErr w:type="gramStart"/>
+                      <w:r>
+                        <w:t>units</w:t>
+                      </w:r>
+                      <w:proofErr w:type="gramEnd"/>
+                      <w:r>
+                        <w:t xml:space="preserve"> consistency.</w:t>
+                      </w:r>
+                    </w:p>
+                  </w:txbxContent>
+                </v:textbox>
+                <w10:wrap type="topAndBottom"/>
+              </v:shape>
+            </w:pict>
+          </mc:Fallback>
+        </mc:AlternateContent>
+      </w:r>
+      <w:r>
+        <w:rPr>
+          <w:highlight w:val="lightGray"/>
+        </w:rPr>
+        <mc:AlternateContent>
+          <mc:Choice Requires="wps">
+            <w:drawing>
+              <wp:anchor distT="45720" distB="45720" distL="114300" distR="114300" simplePos="0" relativeHeight="251719680" behindDoc="0" locked="0" layoutInCell="1" allowOverlap="1" wp14:anchorId="22011A46" wp14:editId="0D8C59AA">
+                <wp:simplePos x="0" y="0"/>
+                <wp:positionH relativeFrom="column">
+                  <wp:posOffset>1905</wp:posOffset>
+                </wp:positionH>
+                <wp:positionV relativeFrom="paragraph">
+                  <wp:posOffset>445770</wp:posOffset>
+                </wp:positionV>
+                <wp:extent cx="5471160" cy="300355"/>
+                <wp:effectExtent l="19050" t="19050" r="15240" b="23495"/>
+                <wp:wrapTopAndBottom/>
+                <wp:docPr id="56" name="Text Box 2"/>
+                <wp:cNvGraphicFramePr>
+                  <a:graphicFrameLocks xmlns:a="http://schemas.openxmlformats.org/drawingml/2006/main"/>
+                </wp:cNvGraphicFramePr>
+                <a:graphic xmlns:a="http://schemas.openxmlformats.org/drawingml/2006/main">
+                  <a:graphicData uri="http://schemas.microsoft.com/office/word/2010/wordprocessingShape">
+                    <wps:wsp>
+                      <wps:cNvSpPr txBox="1">
+                        <a:spLocks noChangeArrowheads="1"/>
+                      </wps:cNvSpPr>
+                      <wps:spPr bwMode="auto">
+                        <a:xfrm>
+                          <a:off x="0" y="0"/>
+                          <a:ext cx="5471160" cy="300355"/>
+                        </a:xfrm>
+                        <a:prstGeom prst="rect">
+                          <a:avLst/>
+                        </a:prstGeom>
+                        <a:solidFill>
+                          <a:srgbClr val="FFFFFF"/>
+                        </a:solidFill>
+                        <a:ln w="28575">
+                          <a:solidFill>
+                            <a:srgbClr val="FF0000"/>
+                          </a:solidFill>
+                          <a:miter lim="800000"/>
+                          <a:headEnd/>
+                          <a:tailEnd/>
+                        </a:ln>
+                      </wps:spPr>
+                      <wps:txbx>
+                        <w:txbxContent>
+                          <w:p>
+                            <w:r>
+                              <w:t xml:space="preserve">(WARNING): </w:t>
+                            </w:r>
+                            <w:r>
+                              <w:t>The units of the item and the impact should match</w:t>
+                            </w:r>
+                            <w:r>
+                              <w:t>.</w:t>
+                            </w:r>
+                          </w:p>
+                        </w:txbxContent>
+                      </wps:txbx>
+                      <wps:bodyPr rot="0" vert="horz" wrap="square" lIns="91440" tIns="45720" rIns="91440" bIns="45720" anchor="t" anchorCtr="0">
+                        <a:noAutofit/>
+                      </wps:bodyPr>
+                    </wps:wsp>
+                  </a:graphicData>
+                </a:graphic>
+                <wp14:sizeRelH relativeFrom="margin">
+                  <wp14:pctWidth>0</wp14:pctWidth>
+                </wp14:sizeRelH>
+                <wp14:sizeRelV relativeFrom="margin">
+                  <wp14:pctHeight>0</wp14:pctHeight>
+                </wp14:sizeRelV>
+              </wp:anchor>
+            </w:drawing>
+          </mc:Choice>
+          <mc:Fallback>
+            <w:pict>
+              <v:shape w14:anchorId="22011A46" id="_x0000_s1051" type="#_x0000_t202" style="position:absolute;margin-left:.15pt;margin-top:35.1pt;width:430.8pt;height:23.65pt;z-index:251719680;visibility:visible;mso-wrap-style:square;mso-width-percent:0;mso-height-percent:0;mso-wrap-distance-left:9pt;mso-wrap-distance-top:3.6pt;mso-wrap-distance-right:9pt;mso-wrap-distance-bottom:3.6pt;mso-position-horizontal:absolute;mso-position-horizontal-relative:text;mso-position-vertical:absolute;mso-position-vertical-relative:text;mso-width-percent:0;mso-height-percent:0;mso-width-relative:margin;mso-height-relative:margin;v-text-anchor:top" o:gfxdata="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" strokecolor="red" strokeweight="2.25pt">
+                <v:textbox>
+                  <w:txbxContent>
+                    <w:p>
+                      <w:r>
+                        <w:t xml:space="preserve">(WARNING): </w:t>
+                      </w:r>
+                      <w:r>
+                        <w:t>The units of the item and the impact should match</w:t>
+                      </w:r>
+                      <w:r>
+                        <w:t>.</w:t>
+                      </w:r>
+                    </w:p>
+                  </w:txbxContent>
+                </v:textbox>
+                <w10:wrap type="topAndBottom"/>
+              </v:shape>
+            </w:pict>
+          </mc:Fallback>
+        </mc:AlternateContent>
+      </w:r>
+      <w:r>
+        <w:t>You can select from the item context menu (</w:t>
+      </w:r>
+      <w:r>
+        <w:fldChar w:fldCharType="begin"/>
+      </w:r>
+      <w:r>
+        <w:instrText xml:space="preserve"> REF _Ref176778437 \h </w:instrText>
+      </w:r>
+      <w:r>
+        <w:instrText xml:space="preserve"> \* MERGEFORMAT </w:instrText>
+      </w:r>
+      <w:r>
+        <w:fldChar w:fldCharType="separate"/>
+      </w:r>
+      <w:r>
+        <w:t xml:space="preserve">Figure </w:t>
+      </w:r>
+      <w:r>
+        <w:t>4</w:t>
+      </w:r>
+      <w:r>
+        <w:fldChar w:fldCharType="end"/>
+      </w:r>
+      <w:r>
+        <w:t>) the database item corresponding to the product or the process</w:t>
+      </w:r>
+      <w:r>
+        <w:t xml:space="preserve">. </w:t>
+      </w:r>
+    </w:p>
+    <w:p>
+      <w:r>
+        <w:t>Once set you can view the unit impacts of the product or the process in the item context menu.</w:t>
+      </w:r>
+    </w:p>
+    <w:p>
+      <w:pPr>
+        <w:pStyle w:val="Heading3"/>
+        <w:spacing w:before="100" w:after="100"/>
+      </w:pPr>
+      <w:bookmarkStart w:id="5" w:name="_Ref176780647"/>
+      <w:r>
+        <w:t>Set relationships</w:t>
+      </w:r>
+      <w:bookmarkEnd w:id="5"/>
+    </w:p>
+    <w:p>
+      <w:r>
+        <w:rPr>
+          <w:highlight w:val="lightGray"/>
+        </w:rPr>
+        <mc:AlternateContent>
+          <mc:Choice Requires="wps">
+            <w:drawing>
+              <wp:anchor distT="45720" distB="45720" distL="114300" distR="114300" simplePos="0" relativeHeight="251726848" behindDoc="0" locked="0" layoutInCell="1" allowOverlap="1" wp14:anchorId="3EF7047E" wp14:editId="2D123CCB">
+                <wp:simplePos x="0" y="0"/>
+                <wp:positionH relativeFrom="column">
+                  <wp:posOffset>2840</wp:posOffset>
+                </wp:positionH>
+                <wp:positionV relativeFrom="paragraph">
+                  <wp:posOffset>610091</wp:posOffset>
+                </wp:positionV>
+                <wp:extent cx="5471160" cy="283845"/>
+                <wp:effectExtent l="19050" t="19050" r="15240" b="20955"/>
+                <wp:wrapTopAndBottom/>
+                <wp:docPr id="60" name="Text Box 2"/>
+                <wp:cNvGraphicFramePr>
+                  <a:graphicFrameLocks xmlns:a="http://schemas.openxmlformats.org/drawingml/2006/main"/>
+                </wp:cNvGraphicFramePr>
+                <a:graphic xmlns:a="http://schemas.openxmlformats.org/drawingml/2006/main">
+                  <a:graphicData uri="http://schemas.microsoft.com/office/word/2010/wordprocessingShape">
+                    <wps:wsp>
+                      <wps:cNvSpPr txBox="1">
+                        <a:spLocks noChangeArrowheads="1"/>
+                      </wps:cNvSpPr>
+                      <wps:spPr bwMode="auto">
+                        <a:xfrm>
+                          <a:off x="0" y="0"/>
+                          <a:ext cx="5471160" cy="283845"/>
+                        </a:xfrm>
+                        <a:prstGeom prst="rect">
+                          <a:avLst/>
+                        </a:prstGeom>
+                        <a:solidFill>
+                          <a:srgbClr val="FFFFFF"/>
+                        </a:solidFill>
+                        <a:ln w="28575">
+                          <a:solidFill>
+                            <a:srgbClr val="7030A0"/>
+                          </a:solidFill>
+                          <a:miter lim="800000"/>
+                          <a:headEnd/>
+                          <a:tailEnd/>
+                        </a:ln>
+                      </wps:spPr>
+                      <wps:txbx>
+                        <w:txbxContent>
+                          <w:p>
+                            <w:r>
+                              <w:t xml:space="preserve">(TBD): </w:t>
+                            </w:r>
+                            <w:r>
+                              <w:t>Issue #16: this is work-in-progress</w:t>
+                            </w:r>
+                          </w:p>
+                        </w:txbxContent>
+                      </wps:txbx>
+                      <wps:bodyPr rot="0" vert="horz" wrap="square" lIns="91440" tIns="45720" rIns="91440" bIns="45720" anchor="t" anchorCtr="0">
+                        <a:noAutofit/>
+                      </wps:bodyPr>
+                    </wps:wsp>
+                  </a:graphicData>
+                </a:graphic>
+                <wp14:sizeRelH relativeFrom="margin">
+                  <wp14:pctWidth>0</wp14:pctWidth>
+                </wp14:sizeRelH>
+                <wp14:sizeRelV relativeFrom="margin">
+                  <wp14:pctHeight>0</wp14:pctHeight>
+                </wp14:sizeRelV>
+              </wp:anchor>
+            </w:drawing>
+          </mc:Choice>
+          <mc:Fallback>
+            <w:pict>
+              <v:shape w14:anchorId="3EF7047E" id="_x0000_s1052" type="#_x0000_t202" style="position:absolute;margin-left:.2pt;margin-top:48.05pt;width:430.8pt;height:22.35pt;z-index:251726848;visibility:visible;mso-wrap-style:square;mso-width-percent:0;mso-height-percent:0;mso-wrap-distance-left:9pt;mso-wrap-distance-top:3.6pt;mso-wrap-distance-right:9pt;mso-wrap-distance-bottom:3.6pt;mso-position-horizontal:absolute;mso-position-horizontal-relative:text;mso-position-vertical:absolute;mso-position-vertical-relative:text;mso-width-percent:0;mso-height-percent:0;mso-width-relative:margin;mso-height-relative:margin;v-text-anchor:top" o:gfxdata="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" strokecolor="#7030a0" strokeweight="2.25pt">
+                <v:textbox>
+                  <w:txbxContent>
+                    <w:p>
+                      <w:r>
+                        <w:t xml:space="preserve">(TBD): </w:t>
+                      </w:r>
+                      <w:r>
+                        <w:t>Issue #16: this is work-in-progress</w:t>
+                      </w:r>
+                    </w:p>
+                  </w:txbxContent>
+                </v:textbox>
+                <w10:wrap type="topAndBottom"/>
+              </v:shape>
+            </w:pict>
+          </mc:Fallback>
+        </mc:AlternateContent>
+      </w:r>
+      <w:r>
+        <w:t xml:space="preserve">Relationships can be </w:t>
+      </w:r>
+      <w:r>
+        <w:t>set between items. This will make the quantity of the current item a dependent of other items (masters). Setting a relationship will disable user changes of dependent item slider and will automatically update when the sliders of master(s) are changed.</w:t>
+      </w:r>
+    </w:p>
+    <w:p>
+      <w:pPr>
+        <w:pStyle w:val="Heading3"/>
+      </w:pPr>
+      <w:r>
+        <w:t>Number Parameter</w:t>
+      </w:r>
+    </w:p>
+    <w:p>
+      <w:r>
+        <w:t>The number</w:t>
+      </w:r>
+      <w:r>
+        <w:t xml:space="preserve"> parameter is a slider without an underlying product or process. This item is created to facilitate parametric changes, along with </w:t>
+      </w:r>
+      <w:r>
+        <w:fldChar w:fldCharType="begin"/>
+      </w:r>
+      <w:r>
+        <w:instrText xml:space="preserve"> REF _Ref176780647 \h </w:instrText>
+      </w:r>
+      <w:r>
+        <w:instrText xml:space="preserve"> \* MERGEFORMAT </w:instrText>
+      </w:r>
+      <w:r>
+        <w:fldChar w:fldCharType="separate"/>
+      </w:r>
+      <w:r>
+        <w:t>Set relationships</w:t>
+      </w:r>
+      <w:r>
+        <w:fldChar w:fldCharType="end"/>
+      </w:r>
+      <w:r>
+        <w:t>.</w:t>
+      </w:r>
+    </w:p>
+    <w:p>
+      <w:pPr>
+        <w:pStyle w:val="Heading3"/>
+      </w:pPr>
+      <w:r>
+        <w:rPr>
+          <w:highlight w:val="lightGray"/>
+        </w:rPr>
+        <w:lastRenderedPageBreak/>
+        <mc:AlternateContent>
+          <mc:Choice Requires="wps">
+            <w:drawing>
+              <wp:anchor distT="45720" distB="45720" distL="114300" distR="114300" simplePos="0" relativeHeight="251728896" behindDoc="0" locked="0" layoutInCell="1" allowOverlap="1" wp14:anchorId="640F6B0F" wp14:editId="7B9B3902">
+                <wp:simplePos x="0" y="0"/>
+                <wp:positionH relativeFrom="column">
+                  <wp:posOffset>2840</wp:posOffset>
+                </wp:positionH>
+                <wp:positionV relativeFrom="paragraph">
+                  <wp:posOffset>19167</wp:posOffset>
+                </wp:positionV>
+                <wp:extent cx="5471160" cy="283845"/>
+                <wp:effectExtent l="19050" t="19050" r="15240" b="20955"/>
+                <wp:wrapTopAndBottom/>
+                <wp:docPr id="61" name="Text Box 2"/>
+                <wp:cNvGraphicFramePr>
+                  <a:graphicFrameLocks xmlns:a="http://schemas.openxmlformats.org/drawingml/2006/main"/>
+                </wp:cNvGraphicFramePr>
+                <a:graphic xmlns:a="http://schemas.openxmlformats.org/drawingml/2006/main">
+                  <a:graphicData uri="http://schemas.microsoft.com/office/word/2010/wordprocessingShape">
+                    <wps:wsp>
+                      <wps:cNvSpPr txBox="1">
+                        <a:spLocks noChangeArrowheads="1"/>
+                      </wps:cNvSpPr>
+                      <wps:spPr bwMode="auto">
+                        <a:xfrm>
+                          <a:off x="0" y="0"/>
+                          <a:ext cx="5471160" cy="283845"/>
+                        </a:xfrm>
+                        <a:prstGeom prst="rect">
+                          <a:avLst/>
+                        </a:prstGeom>
+                        <a:solidFill>
+                          <a:srgbClr val="FFFFFF"/>
+                        </a:solidFill>
+                        <a:ln w="28575">
+                          <a:solidFill>
+                            <a:srgbClr val="7030A0"/>
+                          </a:solidFill>
+                          <a:miter lim="800000"/>
+                          <a:headEnd/>
+                          <a:tailEnd/>
+                        </a:ln>
+                      </wps:spPr>
+                      <wps:txbx>
+                        <w:txbxContent>
+                          <w:p>
+                            <w:r>
+                              <w:t>(TBD): Issue #16: this is work-in-progress</w:t>
+                            </w:r>
+                          </w:p>
+                        </w:txbxContent>
+                      </wps:txbx>
+                      <wps:bodyPr rot="0" vert="horz" wrap="square" lIns="91440" tIns="45720" rIns="91440" bIns="45720" anchor="t" anchorCtr="0">
+                        <a:noAutofit/>
+                      </wps:bodyPr>
+                    </wps:wsp>
+                  </a:graphicData>
+                </a:graphic>
+                <wp14:sizeRelH relativeFrom="margin">
+                  <wp14:pctWidth>0</wp14:pctWidth>
+                </wp14:sizeRelH>
+                <wp14:sizeRelV relativeFrom="margin">
+                  <wp14:pctHeight>0</wp14:pctHeight>
+                </wp14:sizeRelV>
+              </wp:anchor>
+            </w:drawing>
+          </mc:Choice>
+          <mc:Fallback>
+            <w:pict>
+              <v:shape w14:anchorId="640F6B0F" id="_x0000_s1053" type="#_x0000_t202" style="position:absolute;margin-left:.2pt;margin-top:1.5pt;width:430.8pt;height:22.35pt;z-index:251728896;visibility:visible;mso-wrap-style:square;mso-width-percent:0;mso-height-percent:0;mso-wrap-distance-left:9pt;mso-wrap-distance-top:3.6pt;mso-wrap-distance-right:9pt;mso-wrap-distance-bottom:3.6pt;mso-position-horizontal:absolute;mso-position-horizontal-relative:text;mso-position-vertical:absolute;mso-position-vertical-relative:text;mso-width-percent:0;mso-height-percent:0;mso-width-relative:margin;mso-height-relative:margin;v-text-anchor:top" o:gfxdata="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" strokecolor="#7030a0" strokeweight="2.25pt">
+                <v:textbox>
+                  <w:txbxContent>
+                    <w:p>
+                      <w:r>
+                        <w:t>(TBD): Issue #16: this is work-in-progress</w:t>
+                      </w:r>
+                    </w:p>
+                  </w:txbxContent>
+                </v:textbox>
+                <w10:wrap type="topAndBottom"/>
+              </v:shape>
+            </w:pict>
+          </mc:Fallback>
+        </mc:AlternateContent>
+      </w:r>
+      <w:r>
+        <w:t>Unit conversions</w:t>
+      </w:r>
+    </w:p>
+    <w:p>
+      <w:r>
+        <w:t>Unit conversions are automated. The conversions database will do the following conversions.</w:t>
+      </w:r>
+    </w:p>
+    <w:p>
+      <w:pPr>
+        <w:pStyle w:val="ListParagraph"/>
+        <w:numPr>
+          <w:ilvl w:val="0"/>
+          <w:numId w:val="3"/>
+        </w:numPr>
+      </w:pPr>
+      <w:r>
+        <w:t>1000m = 1km = 0.621371 mi</w:t>
+      </w:r>
+    </w:p>
+    <w:p>
+      <w:pPr>
+        <w:pStyle w:val="ListParagraph"/>
+        <w:numPr>
+          <w:ilvl w:val="0"/>
+          <w:numId w:val="3"/>
+        </w:numPr>
+      </w:pPr>
+      <w:r>
+        <w:t>1000g = 1kg = 0.001t = 2.20462lb</w:t>
+      </w:r>
+    </w:p>
+    <w:p>
+      <w:pPr>
+        <w:pStyle w:val="ListParagraph"/>
+        <w:numPr>
+          <w:ilvl w:val="0"/>
+          <w:numId w:val="3"/>
+        </w:numPr>
+      </w:pPr>
+      <w:r>
+        <w:t>1l = 0.01m3 = 0.264172gal</w:t>
+      </w:r>
+    </w:p>
+    <w:p>
+      <w:pPr>
+        <w:pStyle w:val="ListParagraph"/>
+        <w:numPr>
+          <w:ilvl w:val="0"/>
+          <w:numId w:val="3"/>
+        </w:numPr>
+      </w:pPr>
+      <w:r>
+        <w:t>1000J = 1kJ = 0.001 MJ = 2.77778e-4kWH = 2.77778e-7MWh</w:t>
+      </w:r>
+    </w:p>
+    <w:p>
+      <w:pPr>
+        <w:pStyle w:val="ListParagraph"/>
+        <w:numPr>
+          <w:ilvl w:val="0"/>
+          <w:numId w:val="3"/>
+        </w:numPr>
+      </w:pPr>
+      <w:r>
+        <w:rPr>
+          <w:highlight w:val="lightGray"/>
+        </w:rPr>
+        <mc:AlternateContent>
+          <mc:Choice Requires="wps">
+            <w:drawing>
+              <wp:anchor distT="45720" distB="45720" distL="114300" distR="114300" simplePos="0" relativeHeight="251723776" behindDoc="0" locked="0" layoutInCell="1" allowOverlap="1" wp14:anchorId="7CD060D4" wp14:editId="192A9C46">
+                <wp:simplePos x="0" y="0"/>
+                <wp:positionH relativeFrom="column">
+                  <wp:posOffset>1905</wp:posOffset>
+                </wp:positionH>
+                <wp:positionV relativeFrom="paragraph">
+                  <wp:posOffset>318135</wp:posOffset>
+                </wp:positionV>
+                <wp:extent cx="5471160" cy="446405"/>
+                <wp:effectExtent l="19050" t="19050" r="15240" b="10795"/>
+                <wp:wrapTopAndBottom/>
+                <wp:docPr id="58" name="Text Box 2"/>
+                <wp:cNvGraphicFramePr>
+                  <a:graphicFrameLocks xmlns:a="http://schemas.openxmlformats.org/drawingml/2006/main"/>
+                </wp:cNvGraphicFramePr>
+                <a:graphic xmlns:a="http://schemas.openxmlformats.org/drawingml/2006/main">
+                  <a:graphicData uri="http://schemas.microsoft.com/office/word/2010/wordprocessingShape">
+                    <wps:wsp>
+                      <wps:cNvSpPr txBox="1">
+                        <a:spLocks noChangeArrowheads="1"/>
+                      </wps:cNvSpPr>
+                      <wps:spPr bwMode="auto">
+                        <a:xfrm>
+                          <a:off x="0" y="0"/>
+                          <a:ext cx="5471160" cy="446405"/>
+                        </a:xfrm>
+                        <a:prstGeom prst="rect">
+                          <a:avLst/>
+                        </a:prstGeom>
+                        <a:solidFill>
+                          <a:srgbClr val="FFFFFF"/>
+                        </a:solidFill>
+                        <a:ln w="28575">
+                          <a:solidFill>
+                            <a:srgbClr val="7030A0"/>
+                          </a:solidFill>
+                          <a:miter lim="800000"/>
+                          <a:headEnd/>
+                          <a:tailEnd/>
+                        </a:ln>
+                      </wps:spPr>
+                      <wps:txbx>
+                        <w:txbxContent>
+                          <w:p>
+                            <w:r>
+                              <w:t xml:space="preserve">(TBD): </w:t>
+                            </w:r>
+                            <w:r>
+                              <w:t>A comprehensive conversion database handling compound units and metric prefixes.</w:t>
+                            </w:r>
+                          </w:p>
+                        </w:txbxContent>
+                      </wps:txbx>
+                      <wps:bodyPr rot="0" vert="horz" wrap="square" lIns="91440" tIns="45720" rIns="91440" bIns="45720" anchor="t" anchorCtr="0">
+                        <a:noAutofit/>
+                      </wps:bodyPr>
+                    </wps:wsp>
+                  </a:graphicData>
+                </a:graphic>
+                <wp14:sizeRelH relativeFrom="margin">
+                  <wp14:pctWidth>0</wp14:pctWidth>
+                </wp14:sizeRelH>
+                <wp14:sizeRelV relativeFrom="margin">
+                  <wp14:pctHeight>0</wp14:pctHeight>
+                </wp14:sizeRelV>
+              </wp:anchor>
+            </w:drawing>
+          </mc:Choice>
+          <mc:Fallback>
+            <w:pict>
+              <v:shape w14:anchorId="7CD060D4" id="_x0000_s1054" type="#_x0000_t202" style="position:absolute;left:0;text-align:left;margin-left:.15pt;margin-top:25.05pt;width:430.8pt;height:35.15pt;z-index:251723776;visibility:visible;mso-wrap-style:square;mso-width-percent:0;mso-height-percent:0;mso-wrap-distance-left:9pt;mso-wrap-distance-top:3.6pt;mso-wrap-distance-right:9pt;mso-wrap-distance-bottom:3.6pt;mso-position-horizontal:absolute;mso-position-horizontal-relative:text;mso-position-vertical:absolute;mso-position-vertical-relative:text;mso-width-percent:0;mso-height-percent:0;mso-width-relative:margin;mso-height-relative:margin;v-text-anchor:top" o:gfxdata="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" strokecolor="#7030a0" strokeweight="2.25pt">
+                <v:textbox>
+                  <w:txbxContent>
+                    <w:p>
+                      <w:r>
+                        <w:t xml:space="preserve">(TBD): </w:t>
+                      </w:r>
+                      <w:r>
+                        <w:t>A comprehensive conversion database handling compound units and metric prefixes.</w:t>
+                      </w:r>
+                    </w:p>
+                  </w:txbxContent>
+                </v:textbox>
+                <w10:wrap type="topAndBottom"/>
+              </v:shape>
+            </w:pict>
+          </mc:Fallback>
+        </mc:AlternateContent>
+      </w:r>
+      <w:r>
+        <w:t>1kgkm = 0.01tkm = 1.369887lbmi</w:t>
+      </w:r>
     </w:p>
     <w:p/>
     <w:p>
@@ -969,7 +3989,579 @@
         <w:pStyle w:val="Heading2"/>
       </w:pPr>
       <w:r>
-        <w:t>Creating Process Flow Chart</w:t>
+        <w:t>Visualizing Results</w:t>
+      </w:r>
+    </w:p>
+    <w:p>
+      <w:r>
+        <w:rPr>
+          <w:highlight w:val="lightGray"/>
+        </w:rPr>
+        <mc:AlternateContent>
+          <mc:Choice Requires="wps">
+            <w:drawing>
+              <wp:anchor distT="45720" distB="45720" distL="114300" distR="114300" simplePos="0" relativeHeight="251730944" behindDoc="0" locked="0" layoutInCell="1" allowOverlap="1" wp14:anchorId="16B6F817" wp14:editId="7261130E">
+                <wp:simplePos x="0" y="0"/>
+                <wp:positionH relativeFrom="column">
+                  <wp:posOffset>2540</wp:posOffset>
+                </wp:positionH>
+                <wp:positionV relativeFrom="paragraph">
+                  <wp:posOffset>408188</wp:posOffset>
+                </wp:positionV>
+                <wp:extent cx="5471160" cy="446405"/>
+                <wp:effectExtent l="19050" t="19050" r="15240" b="10795"/>
+                <wp:wrapTopAndBottom/>
+                <wp:docPr id="62" name="Text Box 2"/>
+                <wp:cNvGraphicFramePr>
+                  <a:graphicFrameLocks xmlns:a="http://schemas.openxmlformats.org/drawingml/2006/main"/>
+                </wp:cNvGraphicFramePr>
+                <a:graphic xmlns:a="http://schemas.openxmlformats.org/drawingml/2006/main">
+                  <a:graphicData uri="http://schemas.microsoft.com/office/word/2010/wordprocessingShape">
+                    <wps:wsp>
+                      <wps:cNvSpPr txBox="1">
+                        <a:spLocks noChangeArrowheads="1"/>
+                      </wps:cNvSpPr>
+                      <wps:spPr bwMode="auto">
+                        <a:xfrm>
+                          <a:off x="0" y="0"/>
+                          <a:ext cx="5471160" cy="446405"/>
+                        </a:xfrm>
+                        <a:prstGeom prst="rect">
+                          <a:avLst/>
+                        </a:prstGeom>
+                        <a:solidFill>
+                          <a:srgbClr val="FFFFFF"/>
+                        </a:solidFill>
+                        <a:ln w="28575">
+                          <a:solidFill>
+                            <a:srgbClr val="7030A0"/>
+                          </a:solidFill>
+                          <a:miter lim="800000"/>
+                          <a:headEnd/>
+                          <a:tailEnd/>
+                        </a:ln>
+                      </wps:spPr>
+                      <wps:txbx>
+                        <w:txbxContent>
+                          <w:p>
+                            <w:r>
+                              <w:t xml:space="preserve">(TBD): </w:t>
+                            </w:r>
+                            <w:r>
+                              <w:t>Expand the types of data visualization</w:t>
+                            </w:r>
+                          </w:p>
+                        </w:txbxContent>
+                      </wps:txbx>
+                      <wps:bodyPr rot="0" vert="horz" wrap="square" lIns="91440" tIns="45720" rIns="91440" bIns="45720" anchor="t" anchorCtr="0">
+                        <a:noAutofit/>
+                      </wps:bodyPr>
+                    </wps:wsp>
+                  </a:graphicData>
+                </a:graphic>
+                <wp14:sizeRelH relativeFrom="margin">
+                  <wp14:pctWidth>0</wp14:pctWidth>
+                </wp14:sizeRelH>
+                <wp14:sizeRelV relativeFrom="margin">
+                  <wp14:pctHeight>0</wp14:pctHeight>
+                </wp14:sizeRelV>
+              </wp:anchor>
+            </w:drawing>
+          </mc:Choice>
+          <mc:Fallback>
+            <w:pict>
+              <v:shape w14:anchorId="16B6F817" id="_x0000_s1055" type="#_x0000_t202" style="position:absolute;margin-left:.2pt;margin-top:32.15pt;width:430.8pt;height:35.15pt;z-index:251730944;visibility:visible;mso-wrap-style:square;mso-width-percent:0;mso-height-percent:0;mso-wrap-distance-left:9pt;mso-wrap-distance-top:3.6pt;mso-wrap-distance-right:9pt;mso-wrap-distance-bottom:3.6pt;mso-position-horizontal:absolute;mso-position-horizontal-relative:text;mso-position-vertical:absolute;mso-position-vertical-relative:text;mso-width-percent:0;mso-height-percent:0;mso-width-relative:margin;mso-height-relative:margin;v-text-anchor:top" o:gfxdata="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" strokecolor="#7030a0" strokeweight="2.25pt">
+                <v:textbox>
+                  <w:txbxContent>
+                    <w:p>
+                      <w:r>
+                        <w:t xml:space="preserve">(TBD): </w:t>
+                      </w:r>
+                      <w:r>
+                        <w:t>Expand the types of data visualization</w:t>
+                      </w:r>
+                    </w:p>
+                  </w:txbxContent>
+                </v:textbox>
+                <w10:wrap type="topAndBottom"/>
+              </v:shape>
+            </w:pict>
+          </mc:Fallback>
+        </mc:AlternateContent>
+      </w:r>
+      <w:r>
+        <w:t xml:space="preserve">Visualizer will automatically update results as the process flow is built. A </w:t>
+      </w:r>
+      <w:proofErr w:type="gramStart"/>
+      <w:r>
+        <w:t>drop down</w:t>
+      </w:r>
+      <w:proofErr w:type="gramEnd"/>
+      <w:r>
+        <w:t xml:space="preserve"> list allows to pick impacts to be plotted.</w:t>
+      </w:r>
+    </w:p>
+    <w:p>
+      <w:pPr>
+        <w:pStyle w:val="Heading2"/>
+      </w:pPr>
+      <w:r>
+        <w:rPr>
+          <w:highlight w:val="lightGray"/>
+        </w:rPr>
+        <mc:AlternateContent>
+          <mc:Choice Requires="wps">
+            <w:drawing>
+              <wp:anchor distT="45720" distB="45720" distL="114300" distR="114300" simplePos="0" relativeHeight="251732992" behindDoc="0" locked="0" layoutInCell="1" allowOverlap="1" wp14:anchorId="1D38417A" wp14:editId="6554A227">
+                <wp:simplePos x="0" y="0"/>
+                <wp:positionH relativeFrom="column">
+                  <wp:posOffset>0</wp:posOffset>
+                </wp:positionH>
+                <wp:positionV relativeFrom="paragraph">
+                  <wp:posOffset>686848</wp:posOffset>
+                </wp:positionV>
+                <wp:extent cx="5471160" cy="446405"/>
+                <wp:effectExtent l="19050" t="19050" r="15240" b="10795"/>
+                <wp:wrapTopAndBottom/>
+                <wp:docPr id="63" name="Text Box 2"/>
+                <wp:cNvGraphicFramePr>
+                  <a:graphicFrameLocks xmlns:a="http://schemas.openxmlformats.org/drawingml/2006/main"/>
+                </wp:cNvGraphicFramePr>
+                <a:graphic xmlns:a="http://schemas.openxmlformats.org/drawingml/2006/main">
+                  <a:graphicData uri="http://schemas.microsoft.com/office/word/2010/wordprocessingShape">
+                    <wps:wsp>
+                      <wps:cNvSpPr txBox="1">
+                        <a:spLocks noChangeArrowheads="1"/>
+                      </wps:cNvSpPr>
+                      <wps:spPr bwMode="auto">
+                        <a:xfrm>
+                          <a:off x="0" y="0"/>
+                          <a:ext cx="5471160" cy="446405"/>
+                        </a:xfrm>
+                        <a:prstGeom prst="rect">
+                          <a:avLst/>
+                        </a:prstGeom>
+                        <a:solidFill>
+                          <a:srgbClr val="FFFFFF"/>
+                        </a:solidFill>
+                        <a:ln w="28575">
+                          <a:solidFill>
+                            <a:srgbClr val="7030A0"/>
+                          </a:solidFill>
+                          <a:miter lim="800000"/>
+                          <a:headEnd/>
+                          <a:tailEnd/>
+                        </a:ln>
+                      </wps:spPr>
+                      <wps:txbx>
+                        <w:txbxContent>
+                          <w:p>
+                            <w:r>
+                              <w:t xml:space="preserve">(TBD): </w:t>
+                            </w:r>
+                            <w:r>
+                              <w:t>Generating Excel or PDF reports</w:t>
+                            </w:r>
+                          </w:p>
+                        </w:txbxContent>
+                      </wps:txbx>
+                      <wps:bodyPr rot="0" vert="horz" wrap="square" lIns="91440" tIns="45720" rIns="91440" bIns="45720" anchor="t" anchorCtr="0">
+                        <a:noAutofit/>
+                      </wps:bodyPr>
+                    </wps:wsp>
+                  </a:graphicData>
+                </a:graphic>
+                <wp14:sizeRelH relativeFrom="margin">
+                  <wp14:pctWidth>0</wp14:pctWidth>
+                </wp14:sizeRelH>
+                <wp14:sizeRelV relativeFrom="margin">
+                  <wp14:pctHeight>0</wp14:pctHeight>
+                </wp14:sizeRelV>
+              </wp:anchor>
+            </w:drawing>
+          </mc:Choice>
+          <mc:Fallback>
+            <w:pict>
+              <v:shape w14:anchorId="1D38417A" id="_x0000_s1056" type="#_x0000_t202" style="position:absolute;left:0;text-align:left;margin-left:0;margin-top:54.1pt;width:430.8pt;height:35.15pt;z-index:251732992;visibility:visible;mso-wrap-style:square;mso-width-percent:0;mso-height-percent:0;mso-wrap-distance-left:9pt;mso-wrap-distance-top:3.6pt;mso-wrap-distance-right:9pt;mso-wrap-distance-bottom:3.6pt;mso-position-horizontal:absolute;mso-position-horizontal-relative:text;mso-position-vertical:absolute;mso-position-vertical-relative:text;mso-width-percent:0;mso-height-percent:0;mso-width-relative:margin;mso-height-relative:margin;v-text-anchor:top" o:gfxdata="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" strokecolor="#7030a0" strokeweight="2.25pt">
+                <v:textbox>
+                  <w:txbxContent>
+                    <w:p>
+                      <w:r>
+                        <w:t xml:space="preserve">(TBD): </w:t>
+                      </w:r>
+                      <w:r>
+                        <w:t>Generating Excel or PDF reports</w:t>
+                      </w:r>
+                    </w:p>
+                  </w:txbxContent>
+                </v:textbox>
+                <w10:wrap type="topAndBottom"/>
+              </v:shape>
+            </w:pict>
+          </mc:Fallback>
+        </mc:AlternateContent>
+      </w:r>
+      <w:r>
+        <w:t>Reports</w:t>
+      </w:r>
+    </w:p>
+    <w:p>
+      <w:pPr>
+        <w:pStyle w:val="Heading2"/>
+      </w:pPr>
+      <w:r>
+        <w:t>Save and close</w:t>
+      </w:r>
+    </w:p>
+    <w:p>
+      <w:r>
+        <w:rPr>
+          <w:rFonts w:ascii="Courier New" w:hAnsi="Courier New" w:cs="Courier New"/>
+          <w:highlight w:val="lightGray"/>
+        </w:rPr>
+        <w:t xml:space="preserve">File &gt; </w:t>
+      </w:r>
+      <w:r>
+        <w:rPr>
+          <w:rFonts w:ascii="Courier New" w:hAnsi="Courier New" w:cs="Courier New"/>
+          <w:highlight w:val="lightGray"/>
+        </w:rPr>
+        <w:t>Save As</w:t>
+      </w:r>
+      <w:r>
+        <w:t xml:space="preserve"> will </w:t>
+      </w:r>
+      <w:r>
+        <w:t>allow you to save your project. It will prompt you to select a folder to save the project data to.</w:t>
+      </w:r>
+    </w:p>
+    <w:p>
+      <w:r>
+        <w:rPr>
+          <w:rFonts w:ascii="Courier New" w:hAnsi="Courier New" w:cs="Courier New"/>
+          <w:highlight w:val="lightGray"/>
+        </w:rPr>
+        <w:t xml:space="preserve">File &gt; </w:t>
+      </w:r>
+      <w:r>
+        <w:rPr>
+          <w:rFonts w:ascii="Courier New" w:hAnsi="Courier New" w:cs="Courier New"/>
+          <w:highlight w:val="lightGray"/>
+        </w:rPr>
+        <w:t>Save</w:t>
+      </w:r>
+      <w:r>
+        <w:rPr>
+          <w:rFonts w:ascii="Courier New" w:hAnsi="Courier New" w:cs="Courier New"/>
+        </w:rPr>
+        <w:t xml:space="preserve"> </w:t>
+      </w:r>
+      <w:r>
+        <w:t xml:space="preserve">will let you </w:t>
+      </w:r>
+      <w:r>
+        <w:t xml:space="preserve">save your progress on a project. If the project has not yet been saved, it will prompt you to </w:t>
+      </w:r>
+      <w:r>
+        <w:rPr>
+          <w:rFonts w:ascii="Courier New" w:hAnsi="Courier New" w:cs="Courier New"/>
+        </w:rPr>
+        <w:t>Save As</w:t>
+      </w:r>
+      <w:r>
+        <w:t>.</w:t>
+      </w:r>
+    </w:p>
+    <w:p>
+      <w:r>
+        <w:rPr>
+          <w:noProof/>
+          <w:highlight w:val="lightGray"/>
+        </w:rPr>
+        <mc:AlternateContent>
+          <mc:Choice Requires="wps">
+            <w:drawing>
+              <wp:anchor distT="45720" distB="45720" distL="114300" distR="114300" simplePos="0" relativeHeight="251688960" behindDoc="0" locked="0" layoutInCell="1" allowOverlap="1" wp14:anchorId="52C94395" wp14:editId="6C081949">
+                <wp:simplePos x="0" y="0"/>
+                <wp:positionH relativeFrom="column">
+                  <wp:posOffset>0</wp:posOffset>
+                </wp:positionH>
+                <wp:positionV relativeFrom="paragraph">
+                  <wp:posOffset>967853</wp:posOffset>
+                </wp:positionV>
+                <wp:extent cx="5471160" cy="309880"/>
+                <wp:effectExtent l="19050" t="19050" r="15240" b="13970"/>
+                <wp:wrapTopAndBottom/>
+                <wp:docPr id="24" name="Text Box 2"/>
+                <wp:cNvGraphicFramePr>
+                  <a:graphicFrameLocks xmlns:a="http://schemas.openxmlformats.org/drawingml/2006/main"/>
+                </wp:cNvGraphicFramePr>
+                <a:graphic xmlns:a="http://schemas.openxmlformats.org/drawingml/2006/main">
+                  <a:graphicData uri="http://schemas.microsoft.com/office/word/2010/wordprocessingShape">
+                    <wps:wsp>
+                      <wps:cNvSpPr txBox="1">
+                        <a:spLocks noChangeArrowheads="1"/>
+                      </wps:cNvSpPr>
+                      <wps:spPr bwMode="auto">
+                        <a:xfrm>
+                          <a:off x="0" y="0"/>
+                          <a:ext cx="5471160" cy="309880"/>
+                        </a:xfrm>
+                        <a:prstGeom prst="rect">
+                          <a:avLst/>
+                        </a:prstGeom>
+                        <a:solidFill>
+                          <a:srgbClr val="FFFFFF"/>
+                        </a:solidFill>
+                        <a:ln w="28575">
+                          <a:solidFill>
+                            <a:srgbClr val="7030A0"/>
+                          </a:solidFill>
+                          <a:miter lim="800000"/>
+                          <a:headEnd/>
+                          <a:tailEnd/>
+                        </a:ln>
+                      </wps:spPr>
+                      <wps:txbx>
+                        <w:txbxContent>
+                          <w:p>
+                            <w:r>
+                              <w:t xml:space="preserve">(TBD): </w:t>
+                            </w:r>
+                            <w:r>
+                              <w:t>Create a secure file format for saving.</w:t>
+                            </w:r>
+                          </w:p>
+                        </w:txbxContent>
+                      </wps:txbx>
+                      <wps:bodyPr rot="0" vert="horz" wrap="square" lIns="91440" tIns="45720" rIns="91440" bIns="45720" anchor="t" anchorCtr="0">
+                        <a:noAutofit/>
+                      </wps:bodyPr>
+                    </wps:wsp>
+                  </a:graphicData>
+                </a:graphic>
+                <wp14:sizeRelH relativeFrom="margin">
+                  <wp14:pctWidth>0</wp14:pctWidth>
+                </wp14:sizeRelH>
+                <wp14:sizeRelV relativeFrom="margin">
+                  <wp14:pctHeight>0</wp14:pctHeight>
+                </wp14:sizeRelV>
+              </wp:anchor>
+            </w:drawing>
+          </mc:Choice>
+          <mc:Fallback>
+            <w:pict>
+              <v:shape w14:anchorId="52C94395" id="_x0000_s1057" type="#_x0000_t202" style="position:absolute;margin-left:0;margin-top:76.2pt;width:430.8pt;height:24.4pt;z-index:251688960;visibility:visible;mso-wrap-style:square;mso-width-percent:0;mso-height-percent:0;mso-wrap-distance-left:9pt;mso-wrap-distance-top:3.6pt;mso-wrap-distance-right:9pt;mso-wrap-distance-bottom:3.6pt;mso-position-horizontal:absolute;mso-position-horizontal-relative:text;mso-position-vertical:absolute;mso-position-vertical-relative:text;mso-width-percent:0;mso-height-percent:0;mso-width-relative:margin;mso-height-relative:margin;v-text-anchor:top" o:gfxdata="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" strokecolor="#7030a0" strokeweight="2.25pt">
+                <v:textbox>
+                  <w:txbxContent>
+                    <w:p>
+                      <w:r>
+                        <w:t xml:space="preserve">(TBD): </w:t>
+                      </w:r>
+                      <w:r>
+                        <w:t>Create a secure file format for saving.</w:t>
+                      </w:r>
+                    </w:p>
+                  </w:txbxContent>
+                </v:textbox>
+                <w10:wrap type="topAndBottom"/>
+              </v:shape>
+            </w:pict>
+          </mc:Fallback>
+        </mc:AlternateContent>
+      </w:r>
+      <w:r>
+        <w:rPr>
+          <w:noProof/>
+          <w:highlight w:val="lightGray"/>
+        </w:rPr>
+        <mc:AlternateContent>
+          <mc:Choice Requires="wps">
+            <w:drawing>
+              <wp:anchor distT="45720" distB="45720" distL="114300" distR="114300" simplePos="0" relativeHeight="251686912" behindDoc="0" locked="0" layoutInCell="1" allowOverlap="1" wp14:anchorId="1ADDA5B1" wp14:editId="517E1E26">
+                <wp:simplePos x="0" y="0"/>
+                <wp:positionH relativeFrom="column">
+                  <wp:posOffset>0</wp:posOffset>
+                </wp:positionH>
+                <wp:positionV relativeFrom="paragraph">
+                  <wp:posOffset>432435</wp:posOffset>
+                </wp:positionV>
+                <wp:extent cx="5471160" cy="469900"/>
+                <wp:effectExtent l="19050" t="19050" r="15240" b="25400"/>
+                <wp:wrapTopAndBottom/>
+                <wp:docPr id="23" name="Text Box 2"/>
+                <wp:cNvGraphicFramePr>
+                  <a:graphicFrameLocks xmlns:a="http://schemas.openxmlformats.org/drawingml/2006/main"/>
+                </wp:cNvGraphicFramePr>
+                <a:graphic xmlns:a="http://schemas.openxmlformats.org/drawingml/2006/main">
+                  <a:graphicData uri="http://schemas.microsoft.com/office/word/2010/wordprocessingShape">
+                    <wps:wsp>
+                      <wps:cNvSpPr txBox="1">
+                        <a:spLocks noChangeArrowheads="1"/>
+                      </wps:cNvSpPr>
+                      <wps:spPr bwMode="auto">
+                        <a:xfrm>
+                          <a:off x="0" y="0"/>
+                          <a:ext cx="5471160" cy="469900"/>
+                        </a:xfrm>
+                        <a:prstGeom prst="rect">
+                          <a:avLst/>
+                        </a:prstGeom>
+                        <a:solidFill>
+                          <a:srgbClr val="FFFFFF"/>
+                        </a:solidFill>
+                        <a:ln w="28575">
+                          <a:solidFill>
+                            <a:srgbClr val="FF0000"/>
+                          </a:solidFill>
+                          <a:miter lim="800000"/>
+                          <a:headEnd/>
+                          <a:tailEnd/>
+                        </a:ln>
+                      </wps:spPr>
+                      <wps:txbx>
+                        <w:txbxContent>
+                          <w:p>
+                            <w:r>
+                              <w:t>(</w:t>
+                            </w:r>
+                            <w:r>
+                              <w:t>WARNING</w:t>
+                            </w:r>
+                            <w:r>
+                              <w:t xml:space="preserve">): </w:t>
+                            </w:r>
+                            <w:r>
+                              <w:t xml:space="preserve">Currently the projects are saved as </w:t>
+                            </w:r>
+                            <w:r>
+                              <w:rPr>
+                                <w:rFonts w:ascii="Courier New" w:hAnsi="Courier New" w:cs="Courier New"/>
+                              </w:rPr>
+                              <w:t>*.</w:t>
+                            </w:r>
+                            <w:proofErr w:type="spellStart"/>
+                            <w:r>
+                              <w:rPr>
+                                <w:rFonts w:ascii="Courier New" w:hAnsi="Courier New" w:cs="Courier New"/>
+                              </w:rPr>
+                              <w:t>pkl</w:t>
+                            </w:r>
+                            <w:proofErr w:type="spellEnd"/>
+                            <w:r>
+                              <w:t xml:space="preserve"> files. There are not secure files. Open them only if you are of the sender.</w:t>
+                            </w:r>
+                          </w:p>
+                        </w:txbxContent>
+                      </wps:txbx>
+                      <wps:bodyPr rot="0" vert="horz" wrap="square" lIns="91440" tIns="45720" rIns="91440" bIns="45720" anchor="t" anchorCtr="0">
+                        <a:noAutofit/>
+                      </wps:bodyPr>
+                    </wps:wsp>
+                  </a:graphicData>
+                </a:graphic>
+                <wp14:sizeRelH relativeFrom="margin">
+                  <wp14:pctWidth>0</wp14:pctWidth>
+                </wp14:sizeRelH>
+                <wp14:sizeRelV relativeFrom="margin">
+                  <wp14:pctHeight>0</wp14:pctHeight>
+                </wp14:sizeRelV>
+              </wp:anchor>
+            </w:drawing>
+          </mc:Choice>
+          <mc:Fallback>
+            <w:pict>
+              <v:shape w14:anchorId="1ADDA5B1" id="_x0000_s1058" type="#_x0000_t202" style="position:absolute;margin-left:0;margin-top:34.05pt;width:430.8pt;height:37pt;z-index:251686912;visibility:visible;mso-wrap-style:square;mso-width-percent:0;mso-height-percent:0;mso-wrap-distance-left:9pt;mso-wrap-distance-top:3.6pt;mso-wrap-distance-right:9pt;mso-wrap-distance-bottom:3.6pt;mso-position-horizontal:absolute;mso-position-horizontal-relative:text;mso-position-vertical:absolute;mso-position-vertical-relative:text;mso-width-percent:0;mso-height-percent:0;mso-width-relative:margin;mso-height-relative:margin;v-text-anchor:top" o:gfxdata="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" strokecolor="red" strokeweight="2.25pt">
+                <v:textbox>
+                  <w:txbxContent>
+                    <w:p>
+                      <w:r>
+                        <w:t>(</w:t>
+                      </w:r>
+                      <w:r>
+                        <w:t>WARNING</w:t>
+                      </w:r>
+                      <w:r>
+                        <w:t xml:space="preserve">): </w:t>
+                      </w:r>
+                      <w:r>
+                        <w:t xml:space="preserve">Currently the projects are saved as </w:t>
+                      </w:r>
+                      <w:r>
+                        <w:rPr>
+                          <w:rFonts w:ascii="Courier New" w:hAnsi="Courier New" w:cs="Courier New"/>
+                        </w:rPr>
+                        <w:t>*.</w:t>
+                      </w:r>
+                      <w:proofErr w:type="spellStart"/>
+                      <w:r>
+                        <w:rPr>
+                          <w:rFonts w:ascii="Courier New" w:hAnsi="Courier New" w:cs="Courier New"/>
+                        </w:rPr>
+                        <w:t>pkl</w:t>
+                      </w:r>
+                      <w:proofErr w:type="spellEnd"/>
+                      <w:r>
+                        <w:t xml:space="preserve"> files. There are not secure files. Open them only if you are of the sender.</w:t>
+                      </w:r>
+                    </w:p>
+                  </w:txbxContent>
+                </v:textbox>
+                <w10:wrap type="topAndBottom"/>
+              </v:shape>
+            </w:pict>
+          </mc:Fallback>
+        </mc:AlternateContent>
+      </w:r>
+      <w:r>
+        <w:rPr>
+          <w:rFonts w:ascii="Courier New" w:hAnsi="Courier New" w:cs="Courier New"/>
+          <w:highlight w:val="lightGray"/>
+        </w:rPr>
+        <w:t>File &gt; Save As</w:t>
+      </w:r>
+      <w:r>
+        <w:t xml:space="preserve"> will allow you to save your project. It will prompt you to select a folder to save the project data to.</w:t>
+      </w:r>
+    </w:p>
+    <w:p>
+      <w:r>
+        <w:rPr>
+          <w:rFonts w:ascii="Courier New" w:hAnsi="Courier New" w:cs="Courier New"/>
+          <w:highlight w:val="lightGray"/>
+        </w:rPr>
+        <w:t xml:space="preserve">File &gt; </w:t>
+      </w:r>
+      <w:r>
+        <w:rPr>
+          <w:rFonts w:ascii="Courier New" w:hAnsi="Courier New" w:cs="Courier New"/>
+          <w:highlight w:val="lightGray"/>
+        </w:rPr>
+        <w:t>Close</w:t>
+      </w:r>
+      <w:r>
+        <w:t xml:space="preserve"> will </w:t>
+      </w:r>
+      <w:r>
+        <w:t>terminate the application.</w:t>
+      </w:r>
+    </w:p>
+    <w:p>
+      <w:pPr>
+        <w:spacing w:before="0" w:beforeAutospacing="0" w:after="160" w:afterAutospacing="0" w:line="259" w:lineRule="auto"/>
+      </w:pPr>
+      <w:r>
+        <w:lastRenderedPageBreak/>
+        <w:br w:type="page"/>
+      </w:r>
+    </w:p>
+    <w:p>
+      <w:pPr>
+        <w:pStyle w:val="Heading1"/>
+      </w:pPr>
+      <w:r>
+        <w:lastRenderedPageBreak/>
+        <w:t>Developer Guide</w:t>
       </w:r>
     </w:p>
     <w:p/>
@@ -978,25 +4570,6 @@
         <w:pStyle w:val="Heading2"/>
       </w:pPr>
       <w:r>
-        <w:t>Visualizing Results</w:t>
-      </w:r>
-    </w:p>
-    <w:p/>
-    <w:p>
-      <w:pPr>
-        <w:pStyle w:val="Heading1"/>
-      </w:pPr>
-      <w:r>
-        <w:t>Developer Guide</w:t>
-      </w:r>
-    </w:p>
-    <w:p/>
-    <w:p>
-      <w:pPr>
-        <w:pStyle w:val="Heading2"/>
-      </w:pPr>
-      <w:r>
-        <w:lastRenderedPageBreak/>
         <w:t>Program structure</w:t>
       </w:r>
     </w:p>
@@ -1259,9 +4832,98 @@
     </w:lvl>
   </w:abstractNum>
   <w:abstractNum w:abstractNumId="2" w15:restartNumberingAfterBreak="0">
+    <w:nsid w:val="275930F1"/>
+    <w:multiLevelType w:val="hybridMultilevel"/>
+    <w:tmpl w:val="D248CA96"/>
+    <w:lvl w:ilvl="0" w:tplc="0409000F">
+      <w:start w:val="1"/>
+      <w:numFmt w:val="decimal"/>
+      <w:lvlText w:val="%1."/>
+      <w:lvlJc w:val="left"/>
+      <w:pPr>
+        <w:ind w:left="720" w:hanging="360"/>
+      </w:pPr>
+      <w:rPr>
+        <w:rFonts w:hint="default"/>
+      </w:rPr>
+    </w:lvl>
+    <w:lvl w:ilvl="1" w:tplc="04090019" w:tentative="1">
+      <w:start w:val="1"/>
+      <w:numFmt w:val="lowerLetter"/>
+      <w:lvlText w:val="%2."/>
+      <w:lvlJc w:val="left"/>
+      <w:pPr>
+        <w:ind w:left="1440" w:hanging="360"/>
+      </w:pPr>
+    </w:lvl>
+    <w:lvl w:ilvl="2" w:tplc="0409001B" w:tentative="1">
+      <w:start w:val="1"/>
+      <w:numFmt w:val="lowerRoman"/>
+      <w:lvlText w:val="%3."/>
+      <w:lvlJc w:val="right"/>
+      <w:pPr>
+        <w:ind w:left="2160" w:hanging="180"/>
+      </w:pPr>
+    </w:lvl>
+    <w:lvl w:ilvl="3" w:tplc="0409000F" w:tentative="1">
+      <w:start w:val="1"/>
+      <w:numFmt w:val="decimal"/>
+      <w:lvlText w:val="%4."/>
+      <w:lvlJc w:val="left"/>
+      <w:pPr>
+        <w:ind w:left="2880" w:hanging="360"/>
+      </w:pPr>
+    </w:lvl>
+    <w:lvl w:ilvl="4" w:tplc="04090019" w:tentative="1">
+      <w:start w:val="1"/>
+      <w:numFmt w:val="lowerLetter"/>
+      <w:lvlText w:val="%5."/>
+      <w:lvlJc w:val="left"/>
+      <w:pPr>
+        <w:ind w:left="3600" w:hanging="360"/>
+      </w:pPr>
+    </w:lvl>
+    <w:lvl w:ilvl="5" w:tplc="0409001B" w:tentative="1">
+      <w:start w:val="1"/>
+      <w:numFmt w:val="lowerRoman"/>
+      <w:lvlText w:val="%6."/>
+      <w:lvlJc w:val="right"/>
+      <w:pPr>
+        <w:ind w:left="4320" w:hanging="180"/>
+      </w:pPr>
+    </w:lvl>
+    <w:lvl w:ilvl="6" w:tplc="0409000F" w:tentative="1">
+      <w:start w:val="1"/>
+      <w:numFmt w:val="decimal"/>
+      <w:lvlText w:val="%7."/>
+      <w:lvlJc w:val="left"/>
+      <w:pPr>
+        <w:ind w:left="5040" w:hanging="360"/>
+      </w:pPr>
+    </w:lvl>
+    <w:lvl w:ilvl="7" w:tplc="04090019" w:tentative="1">
+      <w:start w:val="1"/>
+      <w:numFmt w:val="lowerLetter"/>
+      <w:lvlText w:val="%8."/>
+      <w:lvlJc w:val="left"/>
+      <w:pPr>
+        <w:ind w:left="5760" w:hanging="360"/>
+      </w:pPr>
+    </w:lvl>
+    <w:lvl w:ilvl="8" w:tplc="0409001B" w:tentative="1">
+      <w:start w:val="1"/>
+      <w:numFmt w:val="lowerRoman"/>
+      <w:lvlText w:val="%9."/>
+      <w:lvlJc w:val="right"/>
+      <w:pPr>
+        <w:ind w:left="6480" w:hanging="180"/>
+      </w:pPr>
+    </w:lvl>
+  </w:abstractNum>
+  <w:abstractNum w:abstractNumId="3" w15:restartNumberingAfterBreak="0">
     <w:nsid w:val="2B18003B"/>
     <w:multiLevelType w:val="hybridMultilevel"/>
-    <w:tmpl w:val="E03AA26C"/>
+    <w:tmpl w:val="8DEAC002"/>
     <w:lvl w:ilvl="0" w:tplc="04090001">
       <w:start w:val="1"/>
       <w:numFmt w:val="bullet"/>
@@ -1371,7 +5033,7 @@
       </w:rPr>
     </w:lvl>
   </w:abstractNum>
-  <w:abstractNum w:abstractNumId="3" w15:restartNumberingAfterBreak="0">
+  <w:abstractNum w:abstractNumId="4" w15:restartNumberingAfterBreak="0">
     <w:nsid w:val="30771089"/>
     <w:multiLevelType w:val="hybridMultilevel"/>
     <w:tmpl w:val="D0F6EECE"/>
@@ -1483,7 +5145,7 @@
       </w:rPr>
     </w:lvl>
   </w:abstractNum>
-  <w:abstractNum w:abstractNumId="4" w15:restartNumberingAfterBreak="0">
+  <w:abstractNum w:abstractNumId="5" w15:restartNumberingAfterBreak="0">
     <w:nsid w:val="53786538"/>
     <w:multiLevelType w:val="hybridMultilevel"/>
     <w:tmpl w:val="BE3485C0"/>
@@ -1572,7 +5234,7 @@
       </w:pPr>
     </w:lvl>
   </w:abstractNum>
-  <w:abstractNum w:abstractNumId="5" w15:restartNumberingAfterBreak="0">
+  <w:abstractNum w:abstractNumId="6" w15:restartNumberingAfterBreak="0">
     <w:nsid w:val="58F60C0F"/>
     <w:multiLevelType w:val="multilevel"/>
     <w:tmpl w:val="DCF2B9A8"/>
@@ -1673,7 +5335,7 @@
       </w:pPr>
     </w:lvl>
   </w:abstractNum>
-  <w:abstractNum w:abstractNumId="6" w15:restartNumberingAfterBreak="0">
+  <w:abstractNum w:abstractNumId="7" w15:restartNumberingAfterBreak="0">
     <w:nsid w:val="6CEE31D4"/>
     <w:multiLevelType w:val="hybridMultilevel"/>
     <w:tmpl w:val="C3E0E362"/>
@@ -1790,22 +5452,25 @@
     <w:abstractNumId w:val="1"/>
   </w:num>
   <w:num w:numId="2">
-    <w:abstractNumId w:val="5"/>
+    <w:abstractNumId w:val="6"/>
   </w:num>
   <w:num w:numId="3">
-    <w:abstractNumId w:val="2"/>
+    <w:abstractNumId w:val="3"/>
   </w:num>
   <w:num w:numId="4">
     <w:abstractNumId w:val="0"/>
   </w:num>
   <w:num w:numId="5">
-    <w:abstractNumId w:val="3"/>
+    <w:abstractNumId w:val="4"/>
   </w:num>
   <w:num w:numId="6">
-    <w:abstractNumId w:val="4"/>
+    <w:abstractNumId w:val="5"/>
   </w:num>
   <w:num w:numId="7">
-    <w:abstractNumId w:val="6"/>
+    <w:abstractNumId w:val="7"/>
+  </w:num>
+  <w:num w:numId="8">
+    <w:abstractNumId w:val="2"/>
   </w:num>
 </w:numbering>
 </file>
@@ -2248,12 +5913,12 @@
     <w:uiPriority w:val="9"/>
     <w:unhideWhenUsed/>
     <w:qFormat/>
-    <w:rsid w:val="0094646F"/>
+    <w:rsid w:val="00BB5B62"/>
     <w:pPr>
       <w:numPr>
         <w:ilvl w:val="1"/>
       </w:numPr>
-      <w:spacing w:before="40"/>
+      <w:spacing w:before="120" w:beforeAutospacing="0" w:after="100"/>
       <w:outlineLvl w:val="1"/>
     </w:pPr>
     <w:rPr>
@@ -2521,7 +6186,7 @@
     <w:basedOn w:val="DefaultParagraphFont"/>
     <w:link w:val="Heading2"/>
     <w:uiPriority w:val="9"/>
-    <w:rsid w:val="0094646F"/>
+    <w:rsid w:val="00BB5B62"/>
     <w:rPr>
       <w:rFonts w:ascii="Arial" w:eastAsiaTheme="majorEastAsia" w:hAnsi="Arial" w:cs="Arial"/>
       <w:color w:val="000000" w:themeColor="text1"/>
@@ -2667,6 +6332,37 @@
       <w:rFonts w:ascii="Times New Roman" w:eastAsia="Times New Roman" w:hAnsi="Times New Roman" w:cs="Times New Roman"/>
       <w:sz w:val="24"/>
       <w:szCs w:val="24"/>
+    </w:rPr>
+  </w:style>
+  <w:style w:type="paragraph" w:styleId="Caption">
+    <w:name w:val="caption"/>
+    <w:basedOn w:val="Normal"/>
+    <w:next w:val="Normal"/>
+    <w:uiPriority w:val="35"/>
+    <w:unhideWhenUsed/>
+    <w:qFormat/>
+    <w:rsid w:val="00610B0B"/>
+    <w:pPr>
+      <w:spacing w:before="0" w:after="200"/>
+    </w:pPr>
+    <w:rPr>
+      <w:i/>
+      <w:iCs/>
+      <w:color w:val="44546A" w:themeColor="text2"/>
+      <w:sz w:val="18"/>
+      <w:szCs w:val="18"/>
+    </w:rPr>
+  </w:style>
+  <w:style w:type="character" w:styleId="FollowedHyperlink">
+    <w:name w:val="FollowedHyperlink"/>
+    <w:basedOn w:val="DefaultParagraphFont"/>
+    <w:uiPriority w:val="99"/>
+    <w:semiHidden/>
+    <w:unhideWhenUsed/>
+    <w:rsid w:val="00C76BA0"/>
+    <w:rPr>
+      <w:color w:val="954F72" w:themeColor="followedHyperlink"/>
+      <w:u w:val="single"/>
     </w:rPr>
   </w:style>
 </w:styles>

</xml_diff>